<commit_message>
Requirements for preliminary report written within the report draft (soley for ease of seeing them in one place rather than shifting to Keats every time, also for highlighting what this report needs as a reminder for drafting)
</commit_message>
<xml_diff>
--- a/MSc Preliminary Project Report.docx
+++ b/MSc Preliminary Project Report.docx
@@ -11,13 +11,757 @@
       </w:r>
     </w:p>
     <w:p>
+      <w:r>
+        <w:t>By Unais Qureshi – K25108803</w:t>
+      </w:r>
+    </w:p>
+    <w:sdt>
+      <w:sdtPr>
+        <w:id w:val="-48309398"/>
+        <w:docPartObj>
+          <w:docPartGallery w:val="Table of Contents"/>
+          <w:docPartUnique/>
+        </w:docPartObj>
+      </w:sdtPr>
+      <w:sdtEndPr>
+        <w:rPr>
+          <w:rFonts w:asciiTheme="minorHAnsi" w:eastAsiaTheme="minorHAnsi" w:hAnsiTheme="minorHAnsi" w:cstheme="minorBidi"/>
+          <w:b/>
+          <w:bCs/>
+          <w:color w:val="auto"/>
+          <w:kern w:val="2"/>
+          <w:sz w:val="22"/>
+          <w:szCs w:val="22"/>
+          <w:lang w:eastAsia="en-US"/>
+          <w14:ligatures w14:val="standardContextual"/>
+        </w:rPr>
+      </w:sdtEndPr>
+      <w:sdtContent>
+        <w:p>
+          <w:pPr>
+            <w:pStyle w:val="TOCHeading"/>
+          </w:pPr>
+          <w:r>
+            <w:t>Contents</w:t>
+          </w:r>
+        </w:p>
+        <w:p>
+          <w:pPr>
+            <w:pStyle w:val="TOC1"/>
+            <w:tabs>
+              <w:tab w:val="right" w:leader="dot" w:pos="9016"/>
+            </w:tabs>
+            <w:rPr>
+              <w:rFonts w:eastAsiaTheme="minorEastAsia"/>
+              <w:noProof/>
+              <w:sz w:val="24"/>
+              <w:szCs w:val="24"/>
+              <w:lang w:eastAsia="en-GB"/>
+            </w:rPr>
+          </w:pPr>
+          <w:r>
+            <w:fldChar w:fldCharType="begin"/>
+          </w:r>
+          <w:r>
+            <w:instrText xml:space="preserve"> TOC \o "1-3" \h \z \u </w:instrText>
+          </w:r>
+          <w:r>
+            <w:fldChar w:fldCharType="separate"/>
+          </w:r>
+          <w:hyperlink w:anchor="_Toc227001768" w:history="1">
+            <w:r>
+              <w:rPr>
+                <w:rStyle w:val="Hyperlink"/>
+                <w:noProof/>
+              </w:rPr>
+              <w:t>Introduction</w:t>
+            </w:r>
+            <w:r>
+              <w:rPr>
+                <w:noProof/>
+                <w:webHidden/>
+              </w:rPr>
+              <w:tab/>
+            </w:r>
+            <w:r>
+              <w:rPr>
+                <w:noProof/>
+                <w:webHidden/>
+              </w:rPr>
+              <w:fldChar w:fldCharType="begin"/>
+            </w:r>
+            <w:r>
+              <w:rPr>
+                <w:noProof/>
+                <w:webHidden/>
+              </w:rPr>
+              <w:instrText xml:space="preserve"> PAGEREF _Toc227001768 \h </w:instrText>
+            </w:r>
+            <w:r>
+              <w:rPr>
+                <w:noProof/>
+                <w:webHidden/>
+              </w:rPr>
+            </w:r>
+            <w:r>
+              <w:rPr>
+                <w:noProof/>
+                <w:webHidden/>
+              </w:rPr>
+              <w:fldChar w:fldCharType="separate"/>
+            </w:r>
+            <w:r>
+              <w:rPr>
+                <w:noProof/>
+                <w:webHidden/>
+              </w:rPr>
+              <w:t>1</w:t>
+            </w:r>
+            <w:r>
+              <w:rPr>
+                <w:noProof/>
+                <w:webHidden/>
+              </w:rPr>
+              <w:fldChar w:fldCharType="end"/>
+            </w:r>
+          </w:hyperlink>
+        </w:p>
+        <w:p>
+          <w:pPr>
+            <w:pStyle w:val="TOC1"/>
+            <w:tabs>
+              <w:tab w:val="right" w:leader="dot" w:pos="9016"/>
+            </w:tabs>
+            <w:rPr>
+              <w:rFonts w:eastAsiaTheme="minorEastAsia"/>
+              <w:noProof/>
+              <w:sz w:val="24"/>
+              <w:szCs w:val="24"/>
+              <w:lang w:eastAsia="en-GB"/>
+            </w:rPr>
+          </w:pPr>
+          <w:hyperlink w:anchor="_Toc227001769" w:history="1">
+            <w:r>
+              <w:rPr>
+                <w:rStyle w:val="Hyperlink"/>
+                <w:noProof/>
+              </w:rPr>
+              <w:t>Background Material</w:t>
+            </w:r>
+            <w:r>
+              <w:rPr>
+                <w:noProof/>
+                <w:webHidden/>
+              </w:rPr>
+              <w:tab/>
+            </w:r>
+            <w:r>
+              <w:rPr>
+                <w:noProof/>
+                <w:webHidden/>
+              </w:rPr>
+              <w:fldChar w:fldCharType="begin"/>
+            </w:r>
+            <w:r>
+              <w:rPr>
+                <w:noProof/>
+                <w:webHidden/>
+              </w:rPr>
+              <w:instrText xml:space="preserve"> PAGEREF _Toc227001769 \h </w:instrText>
+            </w:r>
+            <w:r>
+              <w:rPr>
+                <w:noProof/>
+                <w:webHidden/>
+              </w:rPr>
+            </w:r>
+            <w:r>
+              <w:rPr>
+                <w:noProof/>
+                <w:webHidden/>
+              </w:rPr>
+              <w:fldChar w:fldCharType="separate"/>
+            </w:r>
+            <w:r>
+              <w:rPr>
+                <w:noProof/>
+                <w:webHidden/>
+              </w:rPr>
+              <w:t>1</w:t>
+            </w:r>
+            <w:r>
+              <w:rPr>
+                <w:noProof/>
+                <w:webHidden/>
+              </w:rPr>
+              <w:fldChar w:fldCharType="end"/>
+            </w:r>
+          </w:hyperlink>
+        </w:p>
+        <w:p>
+          <w:pPr>
+            <w:pStyle w:val="TOC1"/>
+            <w:tabs>
+              <w:tab w:val="right" w:leader="dot" w:pos="9016"/>
+            </w:tabs>
+            <w:rPr>
+              <w:rFonts w:eastAsiaTheme="minorEastAsia"/>
+              <w:noProof/>
+              <w:sz w:val="24"/>
+              <w:szCs w:val="24"/>
+              <w:lang w:eastAsia="en-GB"/>
+            </w:rPr>
+          </w:pPr>
+          <w:hyperlink w:anchor="_Toc227001770" w:history="1">
+            <w:r>
+              <w:rPr>
+                <w:rStyle w:val="Hyperlink"/>
+                <w:noProof/>
+              </w:rPr>
+              <w:t>Project Schedule</w:t>
+            </w:r>
+            <w:r>
+              <w:rPr>
+                <w:noProof/>
+                <w:webHidden/>
+              </w:rPr>
+              <w:tab/>
+            </w:r>
+            <w:r>
+              <w:rPr>
+                <w:noProof/>
+                <w:webHidden/>
+              </w:rPr>
+              <w:fldChar w:fldCharType="begin"/>
+            </w:r>
+            <w:r>
+              <w:rPr>
+                <w:noProof/>
+                <w:webHidden/>
+              </w:rPr>
+              <w:instrText xml:space="preserve"> PAGEREF _Toc227001770 \h </w:instrText>
+            </w:r>
+            <w:r>
+              <w:rPr>
+                <w:noProof/>
+                <w:webHidden/>
+              </w:rPr>
+            </w:r>
+            <w:r>
+              <w:rPr>
+                <w:noProof/>
+                <w:webHidden/>
+              </w:rPr>
+              <w:fldChar w:fldCharType="separate"/>
+            </w:r>
+            <w:r>
+              <w:rPr>
+                <w:noProof/>
+                <w:webHidden/>
+              </w:rPr>
+              <w:t>1</w:t>
+            </w:r>
+            <w:r>
+              <w:rPr>
+                <w:noProof/>
+                <w:webHidden/>
+              </w:rPr>
+              <w:fldChar w:fldCharType="end"/>
+            </w:r>
+          </w:hyperlink>
+        </w:p>
+        <w:p>
+          <w:r>
+            <w:rPr>
+              <w:b/>
+              <w:bCs/>
+            </w:rPr>
+            <w:fldChar w:fldCharType="end"/>
+          </w:r>
+        </w:p>
+      </w:sdtContent>
+    </w:sdt>
+    <w:p/>
+    <w:p>
       <w:pPr>
         <w:pStyle w:val="Heading1"/>
       </w:pPr>
-      <w:r>
-        <w:t>Heading 1</w:t>
-      </w:r>
+      <w:bookmarkStart w:id="0" w:name="_Toc227001768"/>
+      <w:r>
+        <w:t>Introduction</w:t>
+      </w:r>
+      <w:bookmarkEnd w:id="0"/>
     </w:p>
+    <w:p>
+      <w:pPr>
+        <w:rPr>
+          <w:i/>
+          <w:iCs/>
+        </w:rPr>
+      </w:pPr>
+      <w:r>
+        <w:rPr>
+          <w:noProof/>
+        </w:rPr>
+        <w:drawing>
+          <wp:anchor distT="0" distB="0" distL="114300" distR="114300" simplePos="0" relativeHeight="251658240" behindDoc="0" locked="0" layoutInCell="1" allowOverlap="1" wp14:anchorId="12355ADA" wp14:editId="0CBA3C0F">
+            <wp:simplePos x="0" y="0"/>
+            <wp:positionH relativeFrom="page">
+              <wp:posOffset>3419707</wp:posOffset>
+            </wp:positionH>
+            <wp:positionV relativeFrom="paragraph">
+              <wp:posOffset>749748</wp:posOffset>
+            </wp:positionV>
+            <wp:extent cx="2699312" cy="840059"/>
+            <wp:effectExtent l="0" t="0" r="6350" b="0"/>
+            <wp:wrapNone/>
+            <wp:docPr id="1255259783" name="Picture 1"/>
+            <wp:cNvGraphicFramePr>
+              <a:graphicFrameLocks xmlns:a="http://schemas.openxmlformats.org/drawingml/2006/main" noChangeAspect="1"/>
+            </wp:cNvGraphicFramePr>
+            <a:graphic xmlns:a="http://schemas.openxmlformats.org/drawingml/2006/main">
+              <a:graphicData uri="http://schemas.openxmlformats.org/drawingml/2006/picture">
+                <pic:pic xmlns:pic="http://schemas.openxmlformats.org/drawingml/2006/picture">
+                  <pic:nvPicPr>
+                    <pic:cNvPr id="1255259783" name=""/>
+                    <pic:cNvPicPr/>
+                  </pic:nvPicPr>
+                  <pic:blipFill>
+                    <a:blip r:embed="rId5" cstate="print">
+                      <a:extLst>
+                        <a:ext uri="{28A0092B-C50C-407E-A947-70E740481C1C}">
+                          <a14:useLocalDpi xmlns:a14="http://schemas.microsoft.com/office/drawing/2010/main" val="0"/>
+                        </a:ext>
+                      </a:extLst>
+                    </a:blip>
+                    <a:stretch>
+                      <a:fillRect/>
+                    </a:stretch>
+                  </pic:blipFill>
+                  <pic:spPr>
+                    <a:xfrm>
+                      <a:off x="0" y="0"/>
+                      <a:ext cx="2710142" cy="843429"/>
+                    </a:xfrm>
+                    <a:prstGeom prst="rect">
+                      <a:avLst/>
+                    </a:prstGeom>
+                  </pic:spPr>
+                </pic:pic>
+              </a:graphicData>
+            </a:graphic>
+            <wp14:sizeRelH relativeFrom="margin">
+              <wp14:pctWidth>0</wp14:pctWidth>
+            </wp14:sizeRelH>
+            <wp14:sizeRelV relativeFrom="margin">
+              <wp14:pctHeight>0</wp14:pctHeight>
+            </wp14:sizeRelV>
+          </wp:anchor>
+        </w:drawing>
+      </w:r>
+      <w:r>
+        <w:rPr>
+          <w:i/>
+          <w:iCs/>
+        </w:rPr>
+        <w:t xml:space="preserve">which states clearly the </w:t>
+      </w:r>
+      <w:r>
+        <w:rPr>
+          <w:b/>
+          <w:bCs/>
+          <w:i/>
+          <w:iCs/>
+        </w:rPr>
+        <w:t>aims</w:t>
+      </w:r>
+      <w:r>
+        <w:rPr>
+          <w:i/>
+          <w:iCs/>
+        </w:rPr>
+        <w:t>, </w:t>
+      </w:r>
+      <w:r>
+        <w:rPr>
+          <w:b/>
+          <w:bCs/>
+          <w:i/>
+          <w:iCs/>
+        </w:rPr>
+        <w:t>objectives</w:t>
+      </w:r>
+      <w:r>
+        <w:rPr>
+          <w:i/>
+          <w:iCs/>
+        </w:rPr>
+        <w:t xml:space="preserve">, the domain and data set(s) to be investigated (if any date set is involved), </w:t>
+      </w:r>
+      <w:r>
+        <w:rPr>
+          <w:b/>
+          <w:bCs/>
+          <w:i/>
+          <w:iCs/>
+        </w:rPr>
+        <w:t>background</w:t>
+      </w:r>
+      <w:r>
+        <w:rPr>
+          <w:i/>
+          <w:iCs/>
+        </w:rPr>
+        <w:t xml:space="preserve">, </w:t>
+      </w:r>
+      <w:r>
+        <w:rPr>
+          <w:b/>
+          <w:bCs/>
+          <w:i/>
+          <w:iCs/>
+        </w:rPr>
+        <w:t>motivations</w:t>
+      </w:r>
+      <w:r>
+        <w:rPr>
+          <w:i/>
+          <w:iCs/>
+        </w:rPr>
+        <w:t>, </w:t>
+      </w:r>
+      <w:r>
+        <w:rPr>
+          <w:b/>
+          <w:bCs/>
+          <w:i/>
+          <w:iCs/>
+        </w:rPr>
+        <w:t>technical specifications</w:t>
+      </w:r>
+      <w:r>
+        <w:rPr>
+          <w:i/>
+          <w:iCs/>
+        </w:rPr>
+        <w:t xml:space="preserve">, </w:t>
+      </w:r>
+      <w:r>
+        <w:rPr>
+          <w:b/>
+          <w:bCs/>
+          <w:i/>
+          <w:iCs/>
+        </w:rPr>
+        <w:t>methodologies</w:t>
+      </w:r>
+      <w:r>
+        <w:rPr>
+          <w:i/>
+          <w:iCs/>
+        </w:rPr>
+        <w:t xml:space="preserve"> of the project.  In this section, you need to demonstrate that you know what your project is, what </w:t>
+      </w:r>
+      <w:r>
+        <w:rPr>
+          <w:b/>
+          <w:bCs/>
+          <w:i/>
+          <w:iCs/>
+        </w:rPr>
+        <w:t>problem you are going to handle</w:t>
+      </w:r>
+      <w:r>
+        <w:rPr>
+          <w:i/>
+          <w:iCs/>
+        </w:rPr>
+        <w:t>, what you are going to achieve.</w:t>
+      </w:r>
+      <w:r>
+        <w:rPr>
+          <w:noProof/>
+        </w:rPr>
+        <w:t xml:space="preserve"> </w:t>
+      </w:r>
+    </w:p>
+    <w:p/>
+    <w:p>
+      <w:pPr>
+        <w:pStyle w:val="Heading1"/>
+      </w:pPr>
+      <w:bookmarkStart w:id="1" w:name="_Toc227001769"/>
+      <w:r>
+        <w:rPr>
+          <w:noProof/>
+        </w:rPr>
+        <mc:AlternateContent>
+          <mc:Choice Requires="wpi">
+            <w:drawing>
+              <wp:anchor distT="0" distB="0" distL="114300" distR="114300" simplePos="0" relativeHeight="251659264" behindDoc="0" locked="0" layoutInCell="1" allowOverlap="1" wp14:anchorId="3C123CA4" wp14:editId="2F9BF2B1">
+                <wp:simplePos x="0" y="0"/>
+                <wp:positionH relativeFrom="column">
+                  <wp:posOffset>1902605</wp:posOffset>
+                </wp:positionH>
+                <wp:positionV relativeFrom="paragraph">
+                  <wp:posOffset>135081</wp:posOffset>
+                </wp:positionV>
+                <wp:extent cx="552960" cy="413640"/>
+                <wp:effectExtent l="57150" t="38100" r="57150" b="43815"/>
+                <wp:wrapNone/>
+                <wp:docPr id="466025574" name="Ink 2"/>
+                <wp:cNvGraphicFramePr/>
+                <a:graphic xmlns:a="http://schemas.openxmlformats.org/drawingml/2006/main">
+                  <a:graphicData uri="http://schemas.microsoft.com/office/word/2010/wordprocessingInk">
+                    <w14:contentPart bwMode="auto" r:id="rId6">
+                      <w14:nvContentPartPr>
+                        <w14:cNvContentPartPr/>
+                      </w14:nvContentPartPr>
+                      <w14:xfrm>
+                        <a:off x="0" y="0"/>
+                        <a:ext cx="552960" cy="413640"/>
+                      </w14:xfrm>
+                    </w14:contentPart>
+                  </a:graphicData>
+                </a:graphic>
+              </wp:anchor>
+            </w:drawing>
+          </mc:Choice>
+          <mc:Fallback>
+            <w:pict>
+              <v:shapetype w14:anchorId="32AD8F26" id="_x0000_t75" coordsize="21600,21600" o:spt="75" o:preferrelative="t" path="m@4@5l@4@11@9@11@9@5xe" filled="f" stroked="f">
+                <v:stroke joinstyle="miter"/>
+                <v:formulas>
+                  <v:f eqn="if lineDrawn pixelLineWidth 0"/>
+                  <v:f eqn="sum @0 1 0"/>
+                  <v:f eqn="sum 0 0 @1"/>
+                  <v:f eqn="prod @2 1 2"/>
+                  <v:f eqn="prod @3 21600 pixelWidth"/>
+                  <v:f eqn="prod @3 21600 pixelHeight"/>
+                  <v:f eqn="sum @0 0 1"/>
+                  <v:f eqn="prod @6 1 2"/>
+                  <v:f eqn="prod @7 21600 pixelWidth"/>
+                  <v:f eqn="sum @8 21600 0"/>
+                  <v:f eqn="prod @7 21600 pixelHeight"/>
+                  <v:f eqn="sum @10 21600 0"/>
+                </v:formulas>
+                <v:path o:extrusionok="f" gradientshapeok="t" o:connecttype="rect"/>
+                <o:lock v:ext="edit" aspectratio="t"/>
+              </v:shapetype>
+              <v:shape id="Ink 2" o:spid="_x0000_s1026" type="#_x0000_t75" style="position:absolute;margin-left:149.1pt;margin-top:9.95pt;width:45pt;height:33.95pt;z-index:251659264;visibility:visible;mso-wrap-style:square;mso-wrap-distance-left:9pt;mso-wrap-distance-top:0;mso-wrap-distance-right:9pt;mso-wrap-distance-bottom:0;mso-position-horizontal:absolute;mso-position-horizontal-relative:text;mso-position-vertical:absolute;mso-position-vertical-relative:text" o:gfxdata="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">
+                <v:imagedata r:id="rId7" o:title=""/>
+              </v:shape>
+            </w:pict>
+          </mc:Fallback>
+        </mc:AlternateContent>
+      </w:r>
+      <w:r>
+        <w:t>Background Material</w:t>
+      </w:r>
+      <w:bookmarkEnd w:id="1"/>
+    </w:p>
+    <w:p>
+      <w:pPr>
+        <w:rPr>
+          <w:i/>
+          <w:iCs/>
+        </w:rPr>
+      </w:pPr>
+      <w:r>
+        <w:rPr>
+          <w:i/>
+          <w:iCs/>
+        </w:rPr>
+        <w:t xml:space="preserve">which states the </w:t>
+      </w:r>
+      <w:r>
+        <w:rPr>
+          <w:b/>
+          <w:bCs/>
+          <w:i/>
+          <w:iCs/>
+        </w:rPr>
+        <w:t>state-of-the-art</w:t>
+      </w:r>
+      <w:r>
+        <w:rPr>
+          <w:i/>
+          <w:iCs/>
+        </w:rPr>
+        <w:t xml:space="preserve"> of the topic.  This includes general background on your topic area, a critical review of relevant </w:t>
+      </w:r>
+      <w:r>
+        <w:rPr>
+          <w:b/>
+          <w:bCs/>
+          <w:i/>
+          <w:iCs/>
+        </w:rPr>
+        <w:t>research literature</w:t>
+      </w:r>
+      <w:r>
+        <w:rPr>
+          <w:i/>
+          <w:iCs/>
+        </w:rPr>
+        <w:t xml:space="preserve">, a description of </w:t>
+      </w:r>
+      <w:r>
+        <w:rPr>
+          <w:b/>
+          <w:bCs/>
+          <w:i/>
+          <w:iCs/>
+        </w:rPr>
+        <w:t>previous work done in related areas</w:t>
+      </w:r>
+      <w:r>
+        <w:rPr>
+          <w:i/>
+          <w:iCs/>
+        </w:rPr>
+        <w:t xml:space="preserve">, and an outline of </w:t>
+      </w:r>
+      <w:r>
+        <w:rPr>
+          <w:b/>
+          <w:bCs/>
+          <w:i/>
+          <w:iCs/>
+        </w:rPr>
+        <w:t>existing methods/approaches proposed by others handling similar problems</w:t>
+      </w:r>
+      <w:r>
+        <w:rPr>
+          <w:i/>
+          <w:iCs/>
+        </w:rPr>
+        <w:t xml:space="preserve">. </w:t>
+      </w:r>
+      <w:r>
+        <w:rPr>
+          <w:b/>
+          <w:bCs/>
+          <w:i/>
+          <w:iCs/>
+        </w:rPr>
+        <w:t>Constructive criticism on the existing methods/approaches</w:t>
+      </w:r>
+      <w:r>
+        <w:rPr>
+          <w:i/>
+          <w:iCs/>
+        </w:rPr>
+        <w:t xml:space="preserve"> should be given.  In this section, you have to demonstrate a good understanding of the topic. See the Resources section on this KEATS page for helpful links for finding appropriate literature (e.g., scholarly/academic search engines) and citing references properly.</w:t>
+      </w:r>
+    </w:p>
+    <w:p/>
+    <w:p>
+      <w:pPr>
+        <w:pStyle w:val="Heading1"/>
+      </w:pPr>
+      <w:bookmarkStart w:id="2" w:name="_Toc227001770"/>
+      <w:r>
+        <w:t>Project Schedule</w:t>
+      </w:r>
+      <w:bookmarkEnd w:id="2"/>
+    </w:p>
+    <w:p>
+      <w:pPr>
+        <w:rPr>
+          <w:i/>
+          <w:iCs/>
+        </w:rPr>
+      </w:pPr>
+      <w:r>
+        <w:rPr>
+          <w:i/>
+          <w:iCs/>
+        </w:rPr>
+        <w:t xml:space="preserve">This section must provide a </w:t>
+      </w:r>
+      <w:r>
+        <w:rPr>
+          <w:b/>
+          <w:bCs/>
+          <w:i/>
+          <w:iCs/>
+        </w:rPr>
+        <w:t>detailed schedule</w:t>
+      </w:r>
+      <w:r>
+        <w:rPr>
+          <w:i/>
+          <w:iCs/>
+        </w:rPr>
+        <w:t xml:space="preserve"> of the project, depending on the project nature, including data acquisition, </w:t>
+      </w:r>
+      <w:r>
+        <w:rPr>
+          <w:b/>
+          <w:bCs/>
+          <w:i/>
+          <w:iCs/>
+        </w:rPr>
+        <w:t>implementation, analysis and evaluation</w:t>
+      </w:r>
+      <w:r>
+        <w:rPr>
+          <w:i/>
+          <w:iCs/>
+        </w:rPr>
+        <w:t xml:space="preserve">, </w:t>
+      </w:r>
+      <w:r>
+        <w:rPr>
+          <w:b/>
+          <w:bCs/>
+          <w:i/>
+          <w:iCs/>
+        </w:rPr>
+        <w:t>theory development</w:t>
+      </w:r>
+      <w:r>
+        <w:rPr>
+          <w:i/>
+          <w:iCs/>
+        </w:rPr>
+        <w:t xml:space="preserve">, </w:t>
+      </w:r>
+      <w:r>
+        <w:rPr>
+          <w:b/>
+          <w:bCs/>
+          <w:i/>
+          <w:iCs/>
+        </w:rPr>
+        <w:t>hardware design, curation and software development</w:t>
+      </w:r>
+      <w:r>
+        <w:rPr>
+          <w:i/>
+          <w:iCs/>
+        </w:rPr>
+        <w:t xml:space="preserve">. This might include a </w:t>
+      </w:r>
+      <w:r>
+        <w:rPr>
+          <w:b/>
+          <w:bCs/>
+          <w:i/>
+          <w:iCs/>
+        </w:rPr>
+        <w:t>Gantt chart</w:t>
+      </w:r>
+      <w:r>
+        <w:rPr>
+          <w:i/>
+          <w:iCs/>
+        </w:rPr>
+        <w:t xml:space="preserve"> or other visual representation -- something which CLEARLY illustrates the work plan covering the life of the project. You may discuss with your supervisor to come up with a feasible project plan.</w:t>
+      </w:r>
+    </w:p>
+    <w:p/>
     <w:sectPr>
       <w:pgSz w:w="11906" w:h="16838"/>
       <w:pgMar w:top="1440" w:right="1440" w:bottom="1440" w:left="1440" w:header="708" w:footer="708" w:gutter="0"/>
@@ -631,7 +1375,6 @@
   <w:style w:type="character" w:default="1" w:styleId="DefaultParagraphFont">
     <w:name w:val="Default Paragraph Font"/>
     <w:uiPriority w:val="1"/>
-    <w:semiHidden/>
     <w:unhideWhenUsed/>
   </w:style>
   <w:style w:type="table" w:default="1" w:styleId="TableNormal">
@@ -945,7 +1688,81 @@
       <w:spacing w:val="5"/>
     </w:rPr>
   </w:style>
+  <w:style w:type="paragraph" w:styleId="TOCHeading">
+    <w:name w:val="TOC Heading"/>
+    <w:basedOn w:val="Heading1"/>
+    <w:next w:val="Normal"/>
+    <w:uiPriority w:val="39"/>
+    <w:unhideWhenUsed/>
+    <w:qFormat/>
+    <w:rsid w:val="00326780"/>
+    <w:pPr>
+      <w:spacing w:before="240" w:after="0"/>
+      <w:outlineLvl w:val="9"/>
+    </w:pPr>
+    <w:rPr>
+      <w:kern w:val="0"/>
+      <w:sz w:val="32"/>
+      <w:szCs w:val="32"/>
+      <w:lang w:eastAsia="en-GB"/>
+      <w14:ligatures w14:val="none"/>
+    </w:rPr>
+  </w:style>
+  <w:style w:type="paragraph" w:styleId="TOC1">
+    <w:name w:val="toc 1"/>
+    <w:basedOn w:val="Normal"/>
+    <w:next w:val="Normal"/>
+    <w:autoRedefine/>
+    <w:uiPriority w:val="39"/>
+    <w:unhideWhenUsed/>
+    <w:rsid w:val="00326780"/>
+    <w:pPr>
+      <w:spacing w:after="100"/>
+    </w:pPr>
+  </w:style>
+  <w:style w:type="character" w:styleId="Hyperlink">
+    <w:name w:val="Hyperlink"/>
+    <w:basedOn w:val="DefaultParagraphFont"/>
+    <w:uiPriority w:val="99"/>
+    <w:unhideWhenUsed/>
+    <w:rsid w:val="00326780"/>
+    <w:rPr>
+      <w:color w:val="467886" w:themeColor="hyperlink"/>
+      <w:u w:val="single"/>
+    </w:rPr>
+  </w:style>
 </w:styles>
+</file>
+
+<file path=word/ink/ink1.xml><?xml version="1.0" encoding="utf-8"?>
+<inkml:ink xmlns:inkml="http://www.w3.org/2003/InkML">
+  <inkml:definitions>
+    <inkml:context xml:id="ctx0">
+      <inkml:inkSource xml:id="inkSrc0">
+        <inkml:traceFormat>
+          <inkml:channel name="X" type="integer" min="-2.14748E9" max="2.14748E9" units="cm"/>
+          <inkml:channel name="Y" type="integer" min="-2.14748E9" max="2.14748E9" units="cm"/>
+          <inkml:channel name="F" type="integer" max="32767" units="dev"/>
+          <inkml:channel name="OA" type="integer" max="360" units="deg"/>
+          <inkml:channel name="OE" type="integer" max="90" units="deg"/>
+        </inkml:traceFormat>
+        <inkml:channelProperties>
+          <inkml:channelProperty channel="X" name="resolution" value="1000" units="1/cm"/>
+          <inkml:channelProperty channel="Y" name="resolution" value="1000" units="1/cm"/>
+          <inkml:channelProperty channel="F" name="resolution" value="0" units="1/dev"/>
+          <inkml:channelProperty channel="OA" name="resolution" value="1000" units="1/deg"/>
+          <inkml:channelProperty channel="OE" name="resolution" value="1000" units="1/deg"/>
+        </inkml:channelProperties>
+      </inkml:inkSource>
+      <inkml:timestamp xml:id="ts0" timeString="2026-04-14T03:58:40.030"/>
+    </inkml:context>
+    <inkml:brush xml:id="br0">
+      <inkml:brushProperty name="width" value="0.05" units="cm"/>
+      <inkml:brushProperty name="height" value="0.05" units="cm"/>
+    </inkml:brush>
+  </inkml:definitions>
+  <inkml:trace contextRef="#ctx0" brushRef="#br0">1534 0 3000 0 0,'1'7'26'0'0,"-1"-6"-46"0"0,0 0 0 0 0,0 0 0 0 0,0 0 1 0 0,0 0-1 0 0,0 0 0 0 0,0-1 0 0 0,0 1 1 0 0,0 0-1 0 0,-1 0 0 0 0,1 0 0 0 0,0 0 1 0 0,0 0-1 0 0,-1-1 0 0 0,1 1 0 0 0,0 0 1 0 0,-1 0-1 0 0,1 0 0 0 0,-1-1 0 0 0,1 1 1 0 0,-1 0-1 0 0,0-1 0 0 0,1 1 0 0 0,-1-1 1 0 0,0 1-1 0 0,1 0 0 0 0,-1-1 0 0 0,0 1 1 0 0,1-1-1 0 0,-1 0 0 0 0,-1 1 0 0 0,-7 4 905 0 0,0 0 0 0 0,0-1-1 0 0,0-1 1 0 0,-1 0 0 0 0,-15 4 0 0 0,15-5-395 0 0,0 1 0 0 0,1 0 1 0 0,-1 0-1 0 0,1 1 0 0 0,-18 9 1 0 0,-1 7 766 0 0,1 1 0 0 0,-49 47 1 0 0,50-39-285 0 0,-37 52 0 0 0,20-10-59 0 0,-36 50 127 0 0,40-66-520 0 0,21-29-278 0 0,0-1 1 0 0,-27 27 0 0 0,0-1-46 0 0,34-36-118 0 0,-2-1-1 0 0,1-1 1 0 0,-24 20 0 0 0,19-21 76 0 0,-1-1 1 0 0,0 0-1 0 0,0-2 1 0 0,-1 0-1 0 0,-38 12 1 0 0,-10 2-113 0 0,43-13-15 0 0,-1-2-1 0 0,-41 9 1 0 0,-112 19-5 0 0,162-32-24 0 0,0 1 0 0 0,0 0 0 0 0,-26 12 0 0 0,38-15 2 0 0,0 0 3 0 0,1-1-2 0 0,0 1 2 0 0,-1 0-2 0 0,1 0 2 0 0,-5 4-61 0 0,0 0 1 0 0,0 1-1 0 0,1 0 0 0 0,0 0 1 0 0,-6 9-1 0 0,6-7 1 0 0,-56 78-236 0 0,62-87 286 0 0,-1 2 3 0 0,0 0 2 0 0,0-2 0 0 0,1 2 0 0 0,-1 0 0 0 0,0-1 0 0 0,0 1 0 0 0,1 0 0 0 0,0-1 2 0 0,0 0 67 0 0,-1-5-52 0 0,1 0 0 0 0,-1 0 0 0 0,1 0 0 0 0,-1-1 0 0 0,1 1 0 0 0,0 0 0 0 0,1 0 0 0 0,-1-1 0 0 0,1 1 0 0 0,0-6 0 0 0,-2-6 11 0 0,-20-112 4 0 0,17 100-39 0 0,4-11-14 0 0,1 39 43 0 0,0 0-12 0 0,20 70 17 0 0,17 51 47 0 0,-33-117-73 0 0,-2 1 3 0 0,-1 27 7 0 0,-1-30-10 0 0,0 0-1 0 0,0-1 0 0 0,0 1 0 0 0,0 0 0 0 0,27-12-14 0 0,-9 2 14 0 0,0 1 1 0 0,1 0 0 0 0,0 2 0 0 0,39-7-1 0 0,30-9 3 0 0,-88 21-3 0 0,0 0 0 0 0,0 0 0 0 0,0 0 0 0 0,0 0 0 0 0,0 0 0 0 0,0 0 0 0 0,0 0 0 0 0,0 0 0 0 0,0-1 0 0 0,0 1 0 0 0,0 0 0 0 0,0 0 0 0 0,0 0 0 0 0,0 0 0 0 0,0 0 0 0 0,0 0 0 0 0,0 0 0 0 0,0 0 0 0 0,0-1 0 0 0,0 1 0 0 0,0 0 0 0 0,0 0 0 0 0,0 0 0 0 0,0 0 0 0 0,0 0 0 0 0,1 0 0 0 0,-1 0 0 0 0,0 0 0 0 0,0 0 0 0 0,0 0 0 0 0,0-1 0 0 0,0 1 0 0 0,0 0 0 0 0,0 0 0 0 0,0 0 0 0 0,0 0 0 0 0,0 0 0 0 0,0 0 0 0 0,1 0 0 0 0,-1 0 0 0 0,0 0 0 0 0,0 0 0 0 0,0 0 0 0 0,0 0 0 0 0,0 0 0 0 0,0 0 0 0 0,0 0 0 0 0,0 0 0 0 0,1 0 0 0 0,-1 0 0 0 0,0 0 0 0 0,0 0 0 0 0,0 0 0 0 0,0 0 0 0 0,0 0 0 0 0,0 0 0 0 0,5 0 0 0 0,31 0 0 0 0,-32 0 2 0 0,0 0 3 0 0,0 0-4 0 0,0 0-1 0 0,-1 0 0 0 0,-1 0 0 0 0,6 0-24 0 0,-7 0 16 0 0</inkml:trace>
+</inkml:ink>
 </file>
 
 <file path=word/theme/theme1.xml><?xml version="1.0" encoding="utf-8"?>
@@ -1241,4 +2058,16 @@
     </a:ext>
   </a:extLst>
 </a:theme>
+</file>
+
+<file path=customXml/item1.xml><?xml version="1.0" encoding="utf-8"?>
+<b:Sources xmlns:b="http://schemas.openxmlformats.org/officeDocument/2006/bibliography" xmlns="http://schemas.openxmlformats.org/officeDocument/2006/bibliography" SelectedStyle="\APASixthEditionOfficeOnline.xsl" StyleName="APA" Version="6"/>
+</file>
+
+<file path=customXml/itemProps1.xml><?xml version="1.0" encoding="utf-8"?>
+<ds:datastoreItem xmlns:ds="http://schemas.openxmlformats.org/officeDocument/2006/customXml" ds:itemID="{B99D7A84-5434-4763-93A4-3741DE55283C}">
+  <ds:schemaRefs>
+    <ds:schemaRef ds:uri="http://schemas.openxmlformats.org/officeDocument/2006/bibliography"/>
+  </ds:schemaRefs>
+</ds:datastoreItem>
 </file>
</xml_diff>

<commit_message>
Content from progress slides transferred to preliminary report
</commit_message>
<xml_diff>
--- a/MSc Preliminary Project Report.docx
+++ b/MSc Preliminary Project Report.docx
@@ -17,6 +17,15 @@
     </w:p>
     <w:sdt>
       <w:sdtPr>
+        <w:rPr>
+          <w:rFonts w:asciiTheme="minorHAnsi" w:eastAsiaTheme="minorHAnsi" w:hAnsiTheme="minorHAnsi" w:cstheme="minorBidi"/>
+          <w:color w:val="auto"/>
+          <w:kern w:val="2"/>
+          <w:sz w:val="22"/>
+          <w:szCs w:val="22"/>
+          <w:lang w:eastAsia="en-US"/>
+          <w14:ligatures w14:val="standardContextual"/>
+        </w:rPr>
         <w:id w:val="-48309398"/>
         <w:docPartObj>
           <w:docPartGallery w:val="Table of Contents"/>
@@ -25,15 +34,8 @@
       </w:sdtPr>
       <w:sdtEndPr>
         <w:rPr>
-          <w:rFonts w:asciiTheme="minorHAnsi" w:eastAsiaTheme="minorHAnsi" w:hAnsiTheme="minorHAnsi" w:cstheme="minorBidi"/>
           <w:b/>
           <w:bCs/>
-          <w:color w:val="auto"/>
-          <w:kern w:val="2"/>
-          <w:sz w:val="22"/>
-          <w:szCs w:val="22"/>
-          <w:lang w:eastAsia="en-US"/>
-          <w14:ligatures w14:val="standardContextual"/>
         </w:rPr>
       </w:sdtEndPr>
       <w:sdtContent>
@@ -301,20 +303,377 @@
       </w:pPr>
       <w:r>
         <w:rPr>
+          <w:i/>
+          <w:iCs/>
+        </w:rPr>
+        <w:t xml:space="preserve">which states clearly the </w:t>
+      </w:r>
+      <w:r>
+        <w:rPr>
+          <w:b/>
+          <w:bCs/>
+          <w:i/>
+          <w:iCs/>
+        </w:rPr>
+        <w:t>aims</w:t>
+      </w:r>
+      <w:r>
+        <w:rPr>
+          <w:i/>
+          <w:iCs/>
+        </w:rPr>
+        <w:t>, </w:t>
+      </w:r>
+      <w:r>
+        <w:rPr>
+          <w:b/>
+          <w:bCs/>
+          <w:i/>
+          <w:iCs/>
+        </w:rPr>
+        <w:t>objectives</w:t>
+      </w:r>
+      <w:r>
+        <w:rPr>
+          <w:i/>
+          <w:iCs/>
+        </w:rPr>
+        <w:t xml:space="preserve">, the domain and data set(s) to be investigated (if any date set is involved), </w:t>
+      </w:r>
+      <w:r>
+        <w:rPr>
+          <w:b/>
+          <w:bCs/>
+          <w:i/>
+          <w:iCs/>
+        </w:rPr>
+        <w:t>background</w:t>
+      </w:r>
+      <w:r>
+        <w:rPr>
+          <w:i/>
+          <w:iCs/>
+        </w:rPr>
+        <w:t xml:space="preserve">, </w:t>
+      </w:r>
+      <w:r>
+        <w:rPr>
+          <w:b/>
+          <w:bCs/>
+          <w:i/>
+          <w:iCs/>
+        </w:rPr>
+        <w:t>motivations</w:t>
+      </w:r>
+      <w:r>
+        <w:rPr>
+          <w:i/>
+          <w:iCs/>
+        </w:rPr>
+        <w:t>, </w:t>
+      </w:r>
+      <w:r>
+        <w:rPr>
+          <w:b/>
+          <w:bCs/>
+          <w:i/>
+          <w:iCs/>
+        </w:rPr>
+        <w:t>technical specifications</w:t>
+      </w:r>
+      <w:r>
+        <w:rPr>
+          <w:i/>
+          <w:iCs/>
+        </w:rPr>
+        <w:t xml:space="preserve">, </w:t>
+      </w:r>
+      <w:r>
+        <w:rPr>
+          <w:b/>
+          <w:bCs/>
+          <w:i/>
+          <w:iCs/>
+        </w:rPr>
+        <w:t>methodologies</w:t>
+      </w:r>
+      <w:r>
+        <w:rPr>
+          <w:i/>
+          <w:iCs/>
+        </w:rPr>
+        <w:t xml:space="preserve"> of the project.  In this section, you need to demonstrate that you know what your project is, what </w:t>
+      </w:r>
+      <w:r>
+        <w:rPr>
+          <w:b/>
+          <w:bCs/>
+          <w:i/>
+          <w:iCs/>
+        </w:rPr>
+        <w:t>problem you are going to handle</w:t>
+      </w:r>
+      <w:r>
+        <w:rPr>
+          <w:i/>
+          <w:iCs/>
+        </w:rPr>
+        <w:t>, what you are going to achieve.</w:t>
+      </w:r>
+      <w:r>
+        <w:rPr>
           <w:noProof/>
         </w:rPr>
+        <w:t xml:space="preserve"> </w:t>
+      </w:r>
+    </w:p>
+    <w:p>
+      <w:pPr>
+        <w:pStyle w:val="Heading2"/>
+      </w:pPr>
+      <w:r>
+        <w:t>Problem Description, Background and Motivations</w:t>
+      </w:r>
+    </w:p>
+    <w:p>
+      <w:r>
+        <w:t>Problem: Given the rise of autonomous vehicles on the road, does the property of security (authenticated sensor data) at one layer compose to guarantee the property of safety (accurate obstacle detection) at a different layer of system architecture? How do architectural constructs, such as Redundancy, Hierarchical Decomposition, and Shared Resources, govern whether this cross-layer composition holds?</w:t>
+      </w:r>
+    </w:p>
+    <w:p>
+      <w:r>
+        <w:t>Autonomous vehicles are marketed as the future of transportation and as a luxury, but how can they truly be successful and reliable when most of the public are too hesitant to trust them with complete control over driving?</w:t>
+      </w:r>
+    </w:p>
+    <w:p>
+      <w:r>
+        <w:t>Given existing cases about malfunctioning autonomous vehicles, such as some Waymo self-driving vehicles failing to sense oncoming pedestrians [1], it’s understandable that the public wouldn’t want to be completely left at the hands of an autonomous vehicle</w:t>
+      </w:r>
+    </w:p>
+    <w:p>
+      <w:r>
+        <w:t>It raises questions about the designs of these existing systems and how factors such as redundancy, shared resources, and hierarchical decomposition are considered in these existing designs</w:t>
+      </w:r>
+    </w:p>
+    <w:p/>
+    <w:p>
+      <w:r>
+        <w:t>Use Case: An example of a malicious source would be the potential risk that a malicious message could hijack a self-driving car and cause it to hit pedestrians (risking safety AND security). This can appear in the form of a physical attacker holding a clear sign that can misdirect the vehicle (similar to SQL Injection Attacks on Automatic Number Plate Recognition software [2])</w:t>
+      </w:r>
+    </w:p>
+    <w:p>
+      <w:r>
+        <w:t>Source: The Decoder Article: (https://the-decoder.com/a-printed-sign-can-hijack-a-self-driving-car-and-steer-it-toward-pedestrians-study-shows/)</w:t>
+      </w:r>
+    </w:p>
+    <w:p/>
+    <w:p>
+      <w:pPr>
+        <w:pStyle w:val="Heading2"/>
+      </w:pPr>
+      <w:r>
+        <w:t>Aims</w:t>
+      </w:r>
+    </w:p>
+    <w:p>
+      <w:r>
+        <w:t>Develop a robust system architecture that remains safe and secure-by-design, regardless of different architectural constructs that would be applied to ensure an efficient autonomous driving system</w:t>
+      </w:r>
+    </w:p>
+    <w:p>
+      <w:r>
+        <w:t>Ensure that architectural patterns that maintain safety and security properties are present and only benefit the overall system</w:t>
+      </w:r>
+    </w:p>
+    <w:p>
+      <w:r>
+        <w:t>Examine redundancy, shared resources, and hierarchical decomposition within the system and how the design choices used to solve this problem will affect these areas</w:t>
+      </w:r>
+    </w:p>
+    <w:p/>
+    <w:p>
+      <w:pPr>
+        <w:pStyle w:val="Heading2"/>
+      </w:pPr>
+      <w:r>
+        <w:t>Objectives</w:t>
+      </w:r>
+    </w:p>
+    <w:p>
+      <w:r>
+        <w:t>Identify architectural patterns to implement in the system</w:t>
+      </w:r>
+    </w:p>
+    <w:p>
+      <w:r>
+        <w:t>Design the system architecture using a chosen Unified Modelling Language (UML) tool</w:t>
+      </w:r>
+    </w:p>
+    <w:p>
+      <w:r>
+        <w:t>Perform Compositional Verification (where each component is verified and tested individually to ensure the whole system works correctly)</w:t>
+      </w:r>
+    </w:p>
+    <w:p>
+      <w:r>
+        <w:t>Report findings and progress throughout the project</w:t>
+      </w:r>
+    </w:p>
+    <w:p/>
+    <w:p>
+      <w:pPr>
+        <w:pStyle w:val="Heading2"/>
+      </w:pPr>
+      <w:r>
+        <w:t>Technical Specifications</w:t>
+      </w:r>
+    </w:p>
+    <w:p/>
+    <w:p>
+      <w:pPr>
+        <w:pStyle w:val="Heading2"/>
+      </w:pPr>
+      <w:r>
+        <w:t>Methodologies</w:t>
+      </w:r>
+    </w:p>
+    <w:p/>
+    <w:p/>
+    <w:p>
+      <w:pPr>
+        <w:pStyle w:val="Heading1"/>
+      </w:pPr>
+      <w:bookmarkStart w:id="1" w:name="_Toc227001769"/>
+      <w:r>
+        <w:t>Background Material</w:t>
+      </w:r>
+      <w:bookmarkEnd w:id="1"/>
+    </w:p>
+    <w:p>
+      <w:pPr>
+        <w:rPr>
+          <w:i/>
+          <w:iCs/>
+        </w:rPr>
+      </w:pPr>
+      <w:r>
+        <w:rPr>
+          <w:i/>
+          <w:iCs/>
+        </w:rPr>
+        <w:t xml:space="preserve">which states the </w:t>
+      </w:r>
+      <w:r>
+        <w:rPr>
+          <w:b/>
+          <w:bCs/>
+          <w:i/>
+          <w:iCs/>
+        </w:rPr>
+        <w:t>state-of-the-art</w:t>
+      </w:r>
+      <w:r>
+        <w:rPr>
+          <w:i/>
+          <w:iCs/>
+        </w:rPr>
+        <w:t xml:space="preserve"> of the topic.  This includes general background on your topic area, a critical review of relevant </w:t>
+      </w:r>
+      <w:r>
+        <w:rPr>
+          <w:b/>
+          <w:bCs/>
+          <w:i/>
+          <w:iCs/>
+        </w:rPr>
+        <w:t>research literature</w:t>
+      </w:r>
+      <w:r>
+        <w:rPr>
+          <w:i/>
+          <w:iCs/>
+        </w:rPr>
+        <w:t xml:space="preserve">, a description of </w:t>
+      </w:r>
+      <w:r>
+        <w:rPr>
+          <w:b/>
+          <w:bCs/>
+          <w:i/>
+          <w:iCs/>
+        </w:rPr>
+        <w:t>previous work done in related areas</w:t>
+      </w:r>
+      <w:r>
+        <w:rPr>
+          <w:i/>
+          <w:iCs/>
+        </w:rPr>
+        <w:t xml:space="preserve">, and an outline of </w:t>
+      </w:r>
+      <w:r>
+        <w:rPr>
+          <w:b/>
+          <w:bCs/>
+          <w:i/>
+          <w:iCs/>
+        </w:rPr>
+        <w:t>existing methods/approaches proposed by others handling similar problems</w:t>
+      </w:r>
+      <w:r>
+        <w:rPr>
+          <w:i/>
+          <w:iCs/>
+        </w:rPr>
+        <w:t xml:space="preserve">. </w:t>
+      </w:r>
+      <w:r>
+        <w:rPr>
+          <w:b/>
+          <w:bCs/>
+          <w:i/>
+          <w:iCs/>
+        </w:rPr>
+        <w:t>Constructive criticism on the existing methods/approaches</w:t>
+      </w:r>
+      <w:r>
+        <w:rPr>
+          <w:i/>
+          <w:iCs/>
+        </w:rPr>
+        <w:t xml:space="preserve"> should be given.  In this section, you have to demonstrate a </w:t>
+      </w:r>
+      <w:r>
+        <w:rPr>
+          <w:b/>
+          <w:bCs/>
+          <w:i/>
+          <w:iCs/>
+          <w:u w:val="single"/>
+        </w:rPr>
+        <w:t>good understanding</w:t>
+      </w:r>
+      <w:r>
+        <w:rPr>
+          <w:i/>
+          <w:iCs/>
+        </w:rPr>
+        <w:t xml:space="preserve"> of the topic. See the Resources section on this KEATS page for helpful links for finding appropriate literature (e.g., scholarly/academic search engines) and citing references properly.</w:t>
+      </w:r>
+      <w:r>
+        <w:rPr>
+          <w:noProof/>
+        </w:rPr>
+        <w:t xml:space="preserve"> </w:t>
+      </w:r>
+      <w:r>
+        <w:rPr>
+          <w:noProof/>
+        </w:rPr>
         <w:drawing>
-          <wp:anchor distT="0" distB="0" distL="114300" distR="114300" simplePos="0" relativeHeight="251658240" behindDoc="0" locked="0" layoutInCell="1" allowOverlap="1" wp14:anchorId="12355ADA" wp14:editId="0CBA3C0F">
-            <wp:simplePos x="0" y="0"/>
-            <wp:positionH relativeFrom="page">
-              <wp:posOffset>3419707</wp:posOffset>
-            </wp:positionH>
-            <wp:positionV relativeFrom="paragraph">
-              <wp:posOffset>749748</wp:posOffset>
-            </wp:positionV>
-            <wp:extent cx="2699312" cy="840059"/>
+          <wp:inline distT="0" distB="0" distL="0" distR="0" wp14:anchorId="532BBCCD" wp14:editId="29FA1794">
+            <wp:extent cx="2698750" cy="839470"/>
             <wp:effectExtent l="0" t="0" r="6350" b="0"/>
-            <wp:wrapNone/>
             <wp:docPr id="1255259783" name="Picture 1"/>
             <wp:cNvGraphicFramePr>
               <a:graphicFrameLocks xmlns:a="http://schemas.openxmlformats.org/drawingml/2006/main" noChangeAspect="1"/>
@@ -327,7 +686,7 @@
                     <pic:cNvPicPr/>
                   </pic:nvPicPr>
                   <pic:blipFill>
-                    <a:blip r:embed="rId5" cstate="print">
+                    <a:blip r:embed="rId6" cstate="print">
                       <a:extLst>
                         <a:ext uri="{28A0092B-C50C-407E-A947-70E740481C1C}">
                           <a14:useLocalDpi xmlns:a14="http://schemas.microsoft.com/office/drawing/2010/main" val="0"/>
@@ -341,7 +700,7 @@
                   <pic:spPr>
                     <a:xfrm>
                       <a:off x="0" y="0"/>
-                      <a:ext cx="2710142" cy="843429"/>
+                      <a:ext cx="2698750" cy="839470"/>
                     </a:xfrm>
                     <a:prstGeom prst="rect">
                       <a:avLst/>
@@ -350,312 +709,54 @@
                 </pic:pic>
               </a:graphicData>
             </a:graphic>
-            <wp14:sizeRelH relativeFrom="margin">
-              <wp14:pctWidth>0</wp14:pctWidth>
-            </wp14:sizeRelH>
-            <wp14:sizeRelV relativeFrom="margin">
-              <wp14:pctHeight>0</wp14:pctHeight>
-            </wp14:sizeRelV>
-          </wp:anchor>
+          </wp:inline>
         </w:drawing>
       </w:r>
-      <w:r>
-        <w:rPr>
-          <w:i/>
-          <w:iCs/>
-        </w:rPr>
-        <w:t xml:space="preserve">which states clearly the </w:t>
-      </w:r>
-      <w:r>
-        <w:rPr>
-          <w:b/>
-          <w:bCs/>
-          <w:i/>
-          <w:iCs/>
-        </w:rPr>
-        <w:t>aims</w:t>
-      </w:r>
-      <w:r>
-        <w:rPr>
-          <w:i/>
-          <w:iCs/>
-        </w:rPr>
-        <w:t>, </w:t>
-      </w:r>
-      <w:r>
-        <w:rPr>
-          <w:b/>
-          <w:bCs/>
-          <w:i/>
-          <w:iCs/>
-        </w:rPr>
-        <w:t>objectives</w:t>
-      </w:r>
-      <w:r>
-        <w:rPr>
-          <w:i/>
-          <w:iCs/>
-        </w:rPr>
-        <w:t xml:space="preserve">, the domain and data set(s) to be investigated (if any date set is involved), </w:t>
-      </w:r>
-      <w:r>
-        <w:rPr>
-          <w:b/>
-          <w:bCs/>
-          <w:i/>
-          <w:iCs/>
-        </w:rPr>
-        <w:t>background</w:t>
-      </w:r>
-      <w:r>
-        <w:rPr>
-          <w:i/>
-          <w:iCs/>
-        </w:rPr>
-        <w:t xml:space="preserve">, </w:t>
-      </w:r>
-      <w:r>
-        <w:rPr>
-          <w:b/>
-          <w:bCs/>
-          <w:i/>
-          <w:iCs/>
-        </w:rPr>
-        <w:t>motivations</w:t>
-      </w:r>
-      <w:r>
-        <w:rPr>
-          <w:i/>
-          <w:iCs/>
-        </w:rPr>
-        <w:t>, </w:t>
-      </w:r>
-      <w:r>
-        <w:rPr>
-          <w:b/>
-          <w:bCs/>
-          <w:i/>
-          <w:iCs/>
-        </w:rPr>
-        <w:t>technical specifications</w:t>
-      </w:r>
-      <w:r>
-        <w:rPr>
-          <w:i/>
-          <w:iCs/>
-        </w:rPr>
-        <w:t xml:space="preserve">, </w:t>
-      </w:r>
-      <w:r>
-        <w:rPr>
-          <w:b/>
-          <w:bCs/>
-          <w:i/>
-          <w:iCs/>
-        </w:rPr>
-        <w:t>methodologies</w:t>
-      </w:r>
-      <w:r>
-        <w:rPr>
-          <w:i/>
-          <w:iCs/>
-        </w:rPr>
-        <w:t xml:space="preserve"> of the project.  In this section, you need to demonstrate that you know what your project is, what </w:t>
-      </w:r>
-      <w:r>
-        <w:rPr>
-          <w:b/>
-          <w:bCs/>
-          <w:i/>
-          <w:iCs/>
-        </w:rPr>
-        <w:t>problem you are going to handle</w:t>
-      </w:r>
-      <w:r>
-        <w:rPr>
-          <w:i/>
-          <w:iCs/>
-        </w:rPr>
-        <w:t>, what you are going to achieve.</w:t>
-      </w:r>
-      <w:r>
-        <w:rPr>
-          <w:noProof/>
-        </w:rPr>
-        <w:t xml:space="preserve"> </w:t>
+    </w:p>
+    <w:p>
+      <w:pPr>
+        <w:pStyle w:val="Heading2"/>
+      </w:pPr>
+      <w:r>
+        <w:lastRenderedPageBreak/>
+        <w:t>Topic Background</w:t>
       </w:r>
     </w:p>
     <w:p/>
     <w:p>
       <w:pPr>
-        <w:pStyle w:val="Heading1"/>
-      </w:pPr>
-      <w:bookmarkStart w:id="1" w:name="_Toc227001769"/>
-      <w:r>
-        <w:rPr>
-          <w:noProof/>
-        </w:rPr>
-        <mc:AlternateContent>
-          <mc:Choice Requires="wpi">
-            <w:drawing>
-              <wp:anchor distT="0" distB="0" distL="114300" distR="114300" simplePos="0" relativeHeight="251659264" behindDoc="0" locked="0" layoutInCell="1" allowOverlap="1" wp14:anchorId="3C123CA4" wp14:editId="2F9BF2B1">
-                <wp:simplePos x="0" y="0"/>
-                <wp:positionH relativeFrom="column">
-                  <wp:posOffset>1902605</wp:posOffset>
-                </wp:positionH>
-                <wp:positionV relativeFrom="paragraph">
-                  <wp:posOffset>135081</wp:posOffset>
-                </wp:positionV>
-                <wp:extent cx="552960" cy="413640"/>
-                <wp:effectExtent l="57150" t="38100" r="57150" b="43815"/>
-                <wp:wrapNone/>
-                <wp:docPr id="466025574" name="Ink 2"/>
-                <wp:cNvGraphicFramePr/>
-                <a:graphic xmlns:a="http://schemas.openxmlformats.org/drawingml/2006/main">
-                  <a:graphicData uri="http://schemas.microsoft.com/office/word/2010/wordprocessingInk">
-                    <w14:contentPart bwMode="auto" r:id="rId6">
-                      <w14:nvContentPartPr>
-                        <w14:cNvContentPartPr/>
-                      </w14:nvContentPartPr>
-                      <w14:xfrm>
-                        <a:off x="0" y="0"/>
-                        <a:ext cx="552960" cy="413640"/>
-                      </w14:xfrm>
-                    </w14:contentPart>
-                  </a:graphicData>
-                </a:graphic>
-              </wp:anchor>
-            </w:drawing>
-          </mc:Choice>
-          <mc:Fallback>
-            <w:pict>
-              <v:shapetype w14:anchorId="32AD8F26" id="_x0000_t75" coordsize="21600,21600" o:spt="75" o:preferrelative="t" path="m@4@5l@4@11@9@11@9@5xe" filled="f" stroked="f">
-                <v:stroke joinstyle="miter"/>
-                <v:formulas>
-                  <v:f eqn="if lineDrawn pixelLineWidth 0"/>
-                  <v:f eqn="sum @0 1 0"/>
-                  <v:f eqn="sum 0 0 @1"/>
-                  <v:f eqn="prod @2 1 2"/>
-                  <v:f eqn="prod @3 21600 pixelWidth"/>
-                  <v:f eqn="prod @3 21600 pixelHeight"/>
-                  <v:f eqn="sum @0 0 1"/>
-                  <v:f eqn="prod @6 1 2"/>
-                  <v:f eqn="prod @7 21600 pixelWidth"/>
-                  <v:f eqn="sum @8 21600 0"/>
-                  <v:f eqn="prod @7 21600 pixelHeight"/>
-                  <v:f eqn="sum @10 21600 0"/>
-                </v:formulas>
-                <v:path o:extrusionok="f" gradientshapeok="t" o:connecttype="rect"/>
-                <o:lock v:ext="edit" aspectratio="t"/>
-              </v:shapetype>
-              <v:shape id="Ink 2" o:spid="_x0000_s1026" type="#_x0000_t75" style="position:absolute;margin-left:149.1pt;margin-top:9.95pt;width:45pt;height:33.95pt;z-index:251659264;visibility:visible;mso-wrap-style:square;mso-wrap-distance-left:9pt;mso-wrap-distance-top:0;mso-wrap-distance-right:9pt;mso-wrap-distance-bottom:0;mso-position-horizontal:absolute;mso-position-horizontal-relative:text;mso-position-vertical:absolute;mso-position-vertical-relative:text" o:gfxdata="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">
-                <v:imagedata r:id="rId7" o:title=""/>
-              </v:shape>
-            </w:pict>
-          </mc:Fallback>
-        </mc:AlternateContent>
-      </w:r>
-      <w:r>
-        <w:t>Background Material</w:t>
-      </w:r>
-      <w:bookmarkEnd w:id="1"/>
-    </w:p>
-    <w:p>
-      <w:pPr>
-        <w:rPr>
-          <w:i/>
-          <w:iCs/>
-        </w:rPr>
-      </w:pPr>
-      <w:r>
-        <w:rPr>
-          <w:i/>
-          <w:iCs/>
-        </w:rPr>
-        <w:t xml:space="preserve">which states the </w:t>
-      </w:r>
-      <w:r>
-        <w:rPr>
-          <w:b/>
-          <w:bCs/>
-          <w:i/>
-          <w:iCs/>
-        </w:rPr>
-        <w:t>state-of-the-art</w:t>
-      </w:r>
-      <w:r>
-        <w:rPr>
-          <w:i/>
-          <w:iCs/>
-        </w:rPr>
-        <w:t xml:space="preserve"> of the topic.  This includes general background on your topic area, a critical review of relevant </w:t>
-      </w:r>
-      <w:r>
-        <w:rPr>
-          <w:b/>
-          <w:bCs/>
-          <w:i/>
-          <w:iCs/>
-        </w:rPr>
-        <w:t>research literature</w:t>
-      </w:r>
-      <w:r>
-        <w:rPr>
-          <w:i/>
-          <w:iCs/>
-        </w:rPr>
-        <w:t xml:space="preserve">, a description of </w:t>
-      </w:r>
-      <w:r>
-        <w:rPr>
-          <w:b/>
-          <w:bCs/>
-          <w:i/>
-          <w:iCs/>
-        </w:rPr>
-        <w:t>previous work done in related areas</w:t>
-      </w:r>
-      <w:r>
-        <w:rPr>
-          <w:i/>
-          <w:iCs/>
-        </w:rPr>
-        <w:t xml:space="preserve">, and an outline of </w:t>
-      </w:r>
-      <w:r>
-        <w:rPr>
-          <w:b/>
-          <w:bCs/>
-          <w:i/>
-          <w:iCs/>
-        </w:rPr>
-        <w:t>existing methods/approaches proposed by others handling similar problems</w:t>
-      </w:r>
-      <w:r>
-        <w:rPr>
-          <w:i/>
-          <w:iCs/>
-        </w:rPr>
-        <w:t xml:space="preserve">. </w:t>
-      </w:r>
-      <w:r>
-        <w:rPr>
-          <w:b/>
-          <w:bCs/>
-          <w:i/>
-          <w:iCs/>
-        </w:rPr>
-        <w:t>Constructive criticism on the existing methods/approaches</w:t>
-      </w:r>
-      <w:r>
-        <w:rPr>
-          <w:i/>
-          <w:iCs/>
-        </w:rPr>
-        <w:t xml:space="preserve"> should be given.  In this section, you have to demonstrate a good understanding of the topic. See the Resources section on this KEATS page for helpful links for finding appropriate literature (e.g., scholarly/academic search engines) and citing references properly.</w:t>
+        <w:pStyle w:val="Heading2"/>
+      </w:pPr>
+      <w:r>
+        <w:t>Literature Review</w:t>
       </w:r>
     </w:p>
     <w:p/>
+    <w:p>
+      <w:pPr>
+        <w:pStyle w:val="Heading2"/>
+      </w:pPr>
+      <w:r>
+        <w:t>Previous Work</w:t>
+      </w:r>
+    </w:p>
+    <w:p/>
+    <w:p>
+      <w:pPr>
+        <w:pStyle w:val="Heading2"/>
+      </w:pPr>
+      <w:r>
+        <w:t>Existing Approaches by Others</w:t>
+      </w:r>
+    </w:p>
+    <w:p>
+      <w:r>
+        <w:t>Site literature of people doing the same project</w:t>
+      </w:r>
+      <w:r>
+        <w:t xml:space="preserve"> and give constructive criticism</w:t>
+      </w:r>
+    </w:p>
     <w:p>
       <w:pPr>
         <w:pStyle w:val="Heading1"/>
@@ -770,6 +871,154 @@
     </w:sectPr>
   </w:body>
 </w:document>
+</file>
+
+<file path=word/numbering.xml><?xml version="1.0" encoding="utf-8"?>
+<w:numbering xmlns:wpc="http://schemas.microsoft.com/office/word/2010/wordprocessingCanvas" xmlns:cx="http://schemas.microsoft.com/office/drawing/2014/chartex" xmlns:cx1="http://schemas.microsoft.com/office/drawing/2015/9/8/chartex" xmlns:cx2="http://schemas.microsoft.com/office/drawing/2015/10/21/chartex" xmlns:cx3="http://schemas.microsoft.com/office/drawing/2016/5/9/chartex" xmlns:cx4="http://schemas.microsoft.com/office/drawing/2016/5/10/chartex" xmlns:cx5="http://schemas.microsoft.com/office/drawing/2016/5/11/chartex" xmlns:cx6="http://schemas.microsoft.com/office/drawing/2016/5/12/chartex" xmlns:cx7="http://schemas.microsoft.com/office/drawing/2016/5/13/chartex" xmlns:cx8="http://schemas.microsoft.com/office/drawing/2016/5/14/chartex" xmlns:mc="http://schemas.openxmlformats.org/markup-compatibility/2006" xmlns:aink="http://schemas.microsoft.com/office/drawing/2016/ink" xmlns:am3d="http://schemas.microsoft.com/office/drawing/2017/model3d" xmlns:o="urn:schemas-microsoft-com:office:office" xmlns:oel="http://schemas.microsoft.com/office/2019/extlst" xmlns:r="http://schemas.openxmlformats.org/officeDocument/2006/relationships" xmlns:m="http://schemas.openxmlformats.org/officeDocument/2006/math" xmlns:v="urn:schemas-microsoft-com:vml" xmlns:wp14="http://schemas.microsoft.com/office/word/2010/wordprocessingDrawing" xmlns:wp="http://schemas.openxmlformats.org/drawingml/2006/wordprocessingDrawing" xmlns:w10="urn:schemas-microsoft-com:office:word" xmlns:w="http://schemas.openxmlformats.org/wordprocessingml/2006/main" xmlns:w14="http://schemas.microsoft.com/office/word/2010/wordml" xmlns:w15="http://schemas.microsoft.com/office/word/2012/wordml" xmlns:w16cex="http://schemas.microsoft.com/office/word/2018/wordml/cex" xmlns:w16cid="http://schemas.microsoft.com/office/word/2016/wordml/cid" xmlns:w16="http://schemas.microsoft.com/office/word/2018/wordml" xmlns:w16du="http://schemas.microsoft.com/office/word/2023/wordml/word16du" xmlns:w16sdtdh="http://schemas.microsoft.com/office/word/2020/wordml/sdtdatahash" xmlns:w16sdtfl="http://schemas.microsoft.com/office/word/2024/wordml/sdtformatlock" xmlns:w16se="http://schemas.microsoft.com/office/word/2015/wordml/symex" xmlns:wpg="http://schemas.microsoft.com/office/word/2010/wordprocessingGroup" xmlns:wpi="http://schemas.microsoft.com/office/word/2010/wordprocessingInk" xmlns:wne="http://schemas.microsoft.com/office/word/2006/wordml" xmlns:wps="http://schemas.microsoft.com/office/word/2010/wordprocessingShape" mc:Ignorable="w14 w15 w16se w16cid w16 w16cex w16sdtdh w16sdtfl w16du wp14">
+  <w:abstractNum w:abstractNumId="0" w15:restartNumberingAfterBreak="0">
+    <w:nsid w:val="18605545"/>
+    <w:multiLevelType w:val="hybridMultilevel"/>
+    <w:tmpl w:val="E3CA5968"/>
+    <w:lvl w:ilvl="0" w:tplc="8506D4B2">
+      <w:start w:val="1"/>
+      <w:numFmt w:val="bullet"/>
+      <w:lvlText w:val="•"/>
+      <w:lvlJc w:val="left"/>
+      <w:pPr>
+        <w:tabs>
+          <w:tab w:val="num" w:pos="720"/>
+        </w:tabs>
+        <w:ind w:left="720" w:hanging="360"/>
+      </w:pPr>
+      <w:rPr>
+        <w:rFonts w:ascii="Arial" w:hAnsi="Arial" w:hint="default"/>
+      </w:rPr>
+    </w:lvl>
+    <w:lvl w:ilvl="1" w:tplc="4502D666" w:tentative="1">
+      <w:start w:val="1"/>
+      <w:numFmt w:val="bullet"/>
+      <w:lvlText w:val="•"/>
+      <w:lvlJc w:val="left"/>
+      <w:pPr>
+        <w:tabs>
+          <w:tab w:val="num" w:pos="1440"/>
+        </w:tabs>
+        <w:ind w:left="1440" w:hanging="360"/>
+      </w:pPr>
+      <w:rPr>
+        <w:rFonts w:ascii="Arial" w:hAnsi="Arial" w:hint="default"/>
+      </w:rPr>
+    </w:lvl>
+    <w:lvl w:ilvl="2" w:tplc="84CAB614" w:tentative="1">
+      <w:start w:val="1"/>
+      <w:numFmt w:val="bullet"/>
+      <w:lvlText w:val="•"/>
+      <w:lvlJc w:val="left"/>
+      <w:pPr>
+        <w:tabs>
+          <w:tab w:val="num" w:pos="2160"/>
+        </w:tabs>
+        <w:ind w:left="2160" w:hanging="360"/>
+      </w:pPr>
+      <w:rPr>
+        <w:rFonts w:ascii="Arial" w:hAnsi="Arial" w:hint="default"/>
+      </w:rPr>
+    </w:lvl>
+    <w:lvl w:ilvl="3" w:tplc="CFF21D88" w:tentative="1">
+      <w:start w:val="1"/>
+      <w:numFmt w:val="bullet"/>
+      <w:lvlText w:val="•"/>
+      <w:lvlJc w:val="left"/>
+      <w:pPr>
+        <w:tabs>
+          <w:tab w:val="num" w:pos="2880"/>
+        </w:tabs>
+        <w:ind w:left="2880" w:hanging="360"/>
+      </w:pPr>
+      <w:rPr>
+        <w:rFonts w:ascii="Arial" w:hAnsi="Arial" w:hint="default"/>
+      </w:rPr>
+    </w:lvl>
+    <w:lvl w:ilvl="4" w:tplc="58ECDD16" w:tentative="1">
+      <w:start w:val="1"/>
+      <w:numFmt w:val="bullet"/>
+      <w:lvlText w:val="•"/>
+      <w:lvlJc w:val="left"/>
+      <w:pPr>
+        <w:tabs>
+          <w:tab w:val="num" w:pos="3600"/>
+        </w:tabs>
+        <w:ind w:left="3600" w:hanging="360"/>
+      </w:pPr>
+      <w:rPr>
+        <w:rFonts w:ascii="Arial" w:hAnsi="Arial" w:hint="default"/>
+      </w:rPr>
+    </w:lvl>
+    <w:lvl w:ilvl="5" w:tplc="3E000330" w:tentative="1">
+      <w:start w:val="1"/>
+      <w:numFmt w:val="bullet"/>
+      <w:lvlText w:val="•"/>
+      <w:lvlJc w:val="left"/>
+      <w:pPr>
+        <w:tabs>
+          <w:tab w:val="num" w:pos="4320"/>
+        </w:tabs>
+        <w:ind w:left="4320" w:hanging="360"/>
+      </w:pPr>
+      <w:rPr>
+        <w:rFonts w:ascii="Arial" w:hAnsi="Arial" w:hint="default"/>
+      </w:rPr>
+    </w:lvl>
+    <w:lvl w:ilvl="6" w:tplc="C762885E" w:tentative="1">
+      <w:start w:val="1"/>
+      <w:numFmt w:val="bullet"/>
+      <w:lvlText w:val="•"/>
+      <w:lvlJc w:val="left"/>
+      <w:pPr>
+        <w:tabs>
+          <w:tab w:val="num" w:pos="5040"/>
+        </w:tabs>
+        <w:ind w:left="5040" w:hanging="360"/>
+      </w:pPr>
+      <w:rPr>
+        <w:rFonts w:ascii="Arial" w:hAnsi="Arial" w:hint="default"/>
+      </w:rPr>
+    </w:lvl>
+    <w:lvl w:ilvl="7" w:tplc="0786E096" w:tentative="1">
+      <w:start w:val="1"/>
+      <w:numFmt w:val="bullet"/>
+      <w:lvlText w:val="•"/>
+      <w:lvlJc w:val="left"/>
+      <w:pPr>
+        <w:tabs>
+          <w:tab w:val="num" w:pos="5760"/>
+        </w:tabs>
+        <w:ind w:left="5760" w:hanging="360"/>
+      </w:pPr>
+      <w:rPr>
+        <w:rFonts w:ascii="Arial" w:hAnsi="Arial" w:hint="default"/>
+      </w:rPr>
+    </w:lvl>
+    <w:lvl w:ilvl="8" w:tplc="6F629CBC" w:tentative="1">
+      <w:start w:val="1"/>
+      <w:numFmt w:val="bullet"/>
+      <w:lvlText w:val="•"/>
+      <w:lvlJc w:val="left"/>
+      <w:pPr>
+        <w:tabs>
+          <w:tab w:val="num" w:pos="6480"/>
+        </w:tabs>
+        <w:ind w:left="6480" w:hanging="360"/>
+      </w:pPr>
+      <w:rPr>
+        <w:rFonts w:ascii="Arial" w:hAnsi="Arial" w:hint="default"/>
+      </w:rPr>
+    </w:lvl>
+  </w:abstractNum>
+  <w:num w:numId="1" w16cid:durableId="675307509">
+    <w:abstractNumId w:val="0"/>
+  </w:num>
+</w:numbering>
 </file>
 
 <file path=word/styles.xml><?xml version="1.0" encoding="utf-8"?>
@@ -1200,7 +1449,6 @@
     <w:next w:val="Normal"/>
     <w:link w:val="Heading2Char"/>
     <w:uiPriority w:val="9"/>
-    <w:semiHidden/>
     <w:unhideWhenUsed/>
     <w:qFormat/>
     <w:rsid w:val="0024663B"/>
@@ -1416,7 +1664,6 @@
     <w:basedOn w:val="DefaultParagraphFont"/>
     <w:link w:val="Heading2"/>
     <w:uiPriority w:val="9"/>
-    <w:semiHidden/>
     <w:rsid w:val="0024663B"/>
     <w:rPr>
       <w:rFonts w:asciiTheme="majorHAnsi" w:eastAsiaTheme="majorEastAsia" w:hAnsiTheme="majorHAnsi" w:cstheme="majorBidi"/>
@@ -1732,37 +1979,6 @@
     </w:rPr>
   </w:style>
 </w:styles>
-</file>
-
-<file path=word/ink/ink1.xml><?xml version="1.0" encoding="utf-8"?>
-<inkml:ink xmlns:inkml="http://www.w3.org/2003/InkML">
-  <inkml:definitions>
-    <inkml:context xml:id="ctx0">
-      <inkml:inkSource xml:id="inkSrc0">
-        <inkml:traceFormat>
-          <inkml:channel name="X" type="integer" min="-2.14748E9" max="2.14748E9" units="cm"/>
-          <inkml:channel name="Y" type="integer" min="-2.14748E9" max="2.14748E9" units="cm"/>
-          <inkml:channel name="F" type="integer" max="32767" units="dev"/>
-          <inkml:channel name="OA" type="integer" max="360" units="deg"/>
-          <inkml:channel name="OE" type="integer" max="90" units="deg"/>
-        </inkml:traceFormat>
-        <inkml:channelProperties>
-          <inkml:channelProperty channel="X" name="resolution" value="1000" units="1/cm"/>
-          <inkml:channelProperty channel="Y" name="resolution" value="1000" units="1/cm"/>
-          <inkml:channelProperty channel="F" name="resolution" value="0" units="1/dev"/>
-          <inkml:channelProperty channel="OA" name="resolution" value="1000" units="1/deg"/>
-          <inkml:channelProperty channel="OE" name="resolution" value="1000" units="1/deg"/>
-        </inkml:channelProperties>
-      </inkml:inkSource>
-      <inkml:timestamp xml:id="ts0" timeString="2026-04-14T03:58:40.030"/>
-    </inkml:context>
-    <inkml:brush xml:id="br0">
-      <inkml:brushProperty name="width" value="0.05" units="cm"/>
-      <inkml:brushProperty name="height" value="0.05" units="cm"/>
-    </inkml:brush>
-  </inkml:definitions>
-  <inkml:trace contextRef="#ctx0" brushRef="#br0">1534 0 3000 0 0,'1'7'26'0'0,"-1"-6"-46"0"0,0 0 0 0 0,0 0 0 0 0,0 0 1 0 0,0 0-1 0 0,0 0 0 0 0,0-1 0 0 0,0 1 1 0 0,0 0-1 0 0,-1 0 0 0 0,1 0 0 0 0,0 0 1 0 0,0 0-1 0 0,-1-1 0 0 0,1 1 0 0 0,0 0 1 0 0,-1 0-1 0 0,1 0 0 0 0,-1-1 0 0 0,1 1 1 0 0,-1 0-1 0 0,0-1 0 0 0,1 1 0 0 0,-1-1 1 0 0,0 1-1 0 0,1 0 0 0 0,-1-1 0 0 0,0 1 1 0 0,1-1-1 0 0,-1 0 0 0 0,-1 1 0 0 0,-7 4 905 0 0,0 0 0 0 0,0-1-1 0 0,0-1 1 0 0,-1 0 0 0 0,-15 4 0 0 0,15-5-395 0 0,0 1 0 0 0,1 0 1 0 0,-1 0-1 0 0,1 1 0 0 0,-18 9 1 0 0,-1 7 766 0 0,1 1 0 0 0,-49 47 1 0 0,50-39-285 0 0,-37 52 0 0 0,20-10-59 0 0,-36 50 127 0 0,40-66-520 0 0,21-29-278 0 0,0-1 1 0 0,-27 27 0 0 0,0-1-46 0 0,34-36-118 0 0,-2-1-1 0 0,1-1 1 0 0,-24 20 0 0 0,19-21 76 0 0,-1-1 1 0 0,0 0-1 0 0,0-2 1 0 0,-1 0-1 0 0,-38 12 1 0 0,-10 2-113 0 0,43-13-15 0 0,-1-2-1 0 0,-41 9 1 0 0,-112 19-5 0 0,162-32-24 0 0,0 1 0 0 0,0 0 0 0 0,-26 12 0 0 0,38-15 2 0 0,0 0 3 0 0,1-1-2 0 0,0 1 2 0 0,-1 0-2 0 0,1 0 2 0 0,-5 4-61 0 0,0 0 1 0 0,0 1-1 0 0,1 0 0 0 0,0 0 1 0 0,-6 9-1 0 0,6-7 1 0 0,-56 78-236 0 0,62-87 286 0 0,-1 2 3 0 0,0 0 2 0 0,0-2 0 0 0,1 2 0 0 0,-1 0 0 0 0,0-1 0 0 0,0 1 0 0 0,1 0 0 0 0,0-1 2 0 0,0 0 67 0 0,-1-5-52 0 0,1 0 0 0 0,-1 0 0 0 0,1 0 0 0 0,-1-1 0 0 0,1 1 0 0 0,0 0 0 0 0,1 0 0 0 0,-1-1 0 0 0,1 1 0 0 0,0-6 0 0 0,-2-6 11 0 0,-20-112 4 0 0,17 100-39 0 0,4-11-14 0 0,1 39 43 0 0,0 0-12 0 0,20 70 17 0 0,17 51 47 0 0,-33-117-73 0 0,-2 1 3 0 0,-1 27 7 0 0,-1-30-10 0 0,0 0-1 0 0,0-1 0 0 0,0 1 0 0 0,0 0 0 0 0,27-12-14 0 0,-9 2 14 0 0,0 1 1 0 0,1 0 0 0 0,0 2 0 0 0,39-7-1 0 0,30-9 3 0 0,-88 21-3 0 0,0 0 0 0 0,0 0 0 0 0,0 0 0 0 0,0 0 0 0 0,0 0 0 0 0,0 0 0 0 0,0 0 0 0 0,0 0 0 0 0,0-1 0 0 0,0 1 0 0 0,0 0 0 0 0,0 0 0 0 0,0 0 0 0 0,0 0 0 0 0,0 0 0 0 0,0 0 0 0 0,0 0 0 0 0,0 0 0 0 0,0-1 0 0 0,0 1 0 0 0,0 0 0 0 0,0 0 0 0 0,0 0 0 0 0,0 0 0 0 0,0 0 0 0 0,1 0 0 0 0,-1 0 0 0 0,0 0 0 0 0,0 0 0 0 0,0 0 0 0 0,0-1 0 0 0,0 1 0 0 0,0 0 0 0 0,0 0 0 0 0,0 0 0 0 0,0 0 0 0 0,0 0 0 0 0,0 0 0 0 0,1 0 0 0 0,-1 0 0 0 0,0 0 0 0 0,0 0 0 0 0,0 0 0 0 0,0 0 0 0 0,0 0 0 0 0,0 0 0 0 0,0 0 0 0 0,0 0 0 0 0,1 0 0 0 0,-1 0 0 0 0,0 0 0 0 0,0 0 0 0 0,0 0 0 0 0,0 0 0 0 0,0 0 0 0 0,0 0 0 0 0,5 0 0 0 0,31 0 0 0 0,-32 0 2 0 0,0 0 3 0 0,0 0-4 0 0,0 0-1 0 0,-1 0 0 0 0,-1 0 0 0 0,6 0-24 0 0,-7 0 16 0 0</inkml:trace>
-</inkml:ink>
 </file>
 
 <file path=word/theme/theme1.xml><?xml version="1.0" encoding="utf-8"?>

</xml_diff>

<commit_message>
Project schedule section completed with minor changes to problem definition and sources
</commit_message>
<xml_diff>
--- a/MSc Preliminary Project Report.docx
+++ b/MSc Preliminary Project Report.docx
@@ -70,7 +70,7 @@
           <w:r>
             <w:fldChar w:fldCharType="separate"/>
           </w:r>
-          <w:hyperlink w:anchor="_Toc227001768" w:history="1">
+          <w:hyperlink w:anchor="_Toc227463667" w:history="1">
             <w:r>
               <w:rPr>
                 <w:rStyle w:val="Hyperlink"/>
@@ -97,7 +97,7 @@
                 <w:noProof/>
                 <w:webHidden/>
               </w:rPr>
-              <w:instrText xml:space="preserve"> PAGEREF _Toc227001768 \h </w:instrText>
+              <w:instrText xml:space="preserve"> PAGEREF _Toc227463667 \h </w:instrText>
             </w:r>
             <w:r>
               <w:rPr>
@@ -118,6 +118,346 @@
                 <w:webHidden/>
               </w:rPr>
               <w:t>1</w:t>
+            </w:r>
+            <w:r>
+              <w:rPr>
+                <w:noProof/>
+                <w:webHidden/>
+              </w:rPr>
+              <w:fldChar w:fldCharType="end"/>
+            </w:r>
+          </w:hyperlink>
+        </w:p>
+        <w:p>
+          <w:pPr>
+            <w:pStyle w:val="TOC2"/>
+            <w:tabs>
+              <w:tab w:val="right" w:leader="dot" w:pos="9016"/>
+            </w:tabs>
+            <w:rPr>
+              <w:noProof/>
+            </w:rPr>
+          </w:pPr>
+          <w:hyperlink w:anchor="_Toc227463668" w:history="1">
+            <w:r>
+              <w:rPr>
+                <w:rStyle w:val="Hyperlink"/>
+                <w:noProof/>
+              </w:rPr>
+              <w:t>Problem Description, Background and Motivations</w:t>
+            </w:r>
+            <w:r>
+              <w:rPr>
+                <w:noProof/>
+                <w:webHidden/>
+              </w:rPr>
+              <w:tab/>
+            </w:r>
+            <w:r>
+              <w:rPr>
+                <w:noProof/>
+                <w:webHidden/>
+              </w:rPr>
+              <w:fldChar w:fldCharType="begin"/>
+            </w:r>
+            <w:r>
+              <w:rPr>
+                <w:noProof/>
+                <w:webHidden/>
+              </w:rPr>
+              <w:instrText xml:space="preserve"> PAGEREF _Toc227463668 \h </w:instrText>
+            </w:r>
+            <w:r>
+              <w:rPr>
+                <w:noProof/>
+                <w:webHidden/>
+              </w:rPr>
+            </w:r>
+            <w:r>
+              <w:rPr>
+                <w:noProof/>
+                <w:webHidden/>
+              </w:rPr>
+              <w:fldChar w:fldCharType="separate"/>
+            </w:r>
+            <w:r>
+              <w:rPr>
+                <w:noProof/>
+                <w:webHidden/>
+              </w:rPr>
+              <w:t>1</w:t>
+            </w:r>
+            <w:r>
+              <w:rPr>
+                <w:noProof/>
+                <w:webHidden/>
+              </w:rPr>
+              <w:fldChar w:fldCharType="end"/>
+            </w:r>
+          </w:hyperlink>
+        </w:p>
+        <w:p>
+          <w:pPr>
+            <w:pStyle w:val="TOC2"/>
+            <w:tabs>
+              <w:tab w:val="right" w:leader="dot" w:pos="9016"/>
+            </w:tabs>
+            <w:rPr>
+              <w:noProof/>
+            </w:rPr>
+          </w:pPr>
+          <w:hyperlink w:anchor="_Toc227463669" w:history="1">
+            <w:r>
+              <w:rPr>
+                <w:rStyle w:val="Hyperlink"/>
+                <w:noProof/>
+              </w:rPr>
+              <w:t>Aims</w:t>
+            </w:r>
+            <w:r>
+              <w:rPr>
+                <w:noProof/>
+                <w:webHidden/>
+              </w:rPr>
+              <w:tab/>
+            </w:r>
+            <w:r>
+              <w:rPr>
+                <w:noProof/>
+                <w:webHidden/>
+              </w:rPr>
+              <w:fldChar w:fldCharType="begin"/>
+            </w:r>
+            <w:r>
+              <w:rPr>
+                <w:noProof/>
+                <w:webHidden/>
+              </w:rPr>
+              <w:instrText xml:space="preserve"> PAGEREF _Toc227463669 \h </w:instrText>
+            </w:r>
+            <w:r>
+              <w:rPr>
+                <w:noProof/>
+                <w:webHidden/>
+              </w:rPr>
+            </w:r>
+            <w:r>
+              <w:rPr>
+                <w:noProof/>
+                <w:webHidden/>
+              </w:rPr>
+              <w:fldChar w:fldCharType="separate"/>
+            </w:r>
+            <w:r>
+              <w:rPr>
+                <w:noProof/>
+                <w:webHidden/>
+              </w:rPr>
+              <w:t>2</w:t>
+            </w:r>
+            <w:r>
+              <w:rPr>
+                <w:noProof/>
+                <w:webHidden/>
+              </w:rPr>
+              <w:fldChar w:fldCharType="end"/>
+            </w:r>
+          </w:hyperlink>
+        </w:p>
+        <w:p>
+          <w:pPr>
+            <w:pStyle w:val="TOC2"/>
+            <w:tabs>
+              <w:tab w:val="right" w:leader="dot" w:pos="9016"/>
+            </w:tabs>
+            <w:rPr>
+              <w:noProof/>
+            </w:rPr>
+          </w:pPr>
+          <w:hyperlink w:anchor="_Toc227463670" w:history="1">
+            <w:r>
+              <w:rPr>
+                <w:rStyle w:val="Hyperlink"/>
+                <w:noProof/>
+              </w:rPr>
+              <w:t>Objectives</w:t>
+            </w:r>
+            <w:r>
+              <w:rPr>
+                <w:noProof/>
+                <w:webHidden/>
+              </w:rPr>
+              <w:tab/>
+            </w:r>
+            <w:r>
+              <w:rPr>
+                <w:noProof/>
+                <w:webHidden/>
+              </w:rPr>
+              <w:fldChar w:fldCharType="begin"/>
+            </w:r>
+            <w:r>
+              <w:rPr>
+                <w:noProof/>
+                <w:webHidden/>
+              </w:rPr>
+              <w:instrText xml:space="preserve"> PAGEREF _Toc227463670 \h </w:instrText>
+            </w:r>
+            <w:r>
+              <w:rPr>
+                <w:noProof/>
+                <w:webHidden/>
+              </w:rPr>
+            </w:r>
+            <w:r>
+              <w:rPr>
+                <w:noProof/>
+                <w:webHidden/>
+              </w:rPr>
+              <w:fldChar w:fldCharType="separate"/>
+            </w:r>
+            <w:r>
+              <w:rPr>
+                <w:noProof/>
+                <w:webHidden/>
+              </w:rPr>
+              <w:t>2</w:t>
+            </w:r>
+            <w:r>
+              <w:rPr>
+                <w:noProof/>
+                <w:webHidden/>
+              </w:rPr>
+              <w:fldChar w:fldCharType="end"/>
+            </w:r>
+          </w:hyperlink>
+        </w:p>
+        <w:p>
+          <w:pPr>
+            <w:pStyle w:val="TOC2"/>
+            <w:tabs>
+              <w:tab w:val="right" w:leader="dot" w:pos="9016"/>
+            </w:tabs>
+            <w:rPr>
+              <w:noProof/>
+            </w:rPr>
+          </w:pPr>
+          <w:hyperlink w:anchor="_Toc227463671" w:history="1">
+            <w:r>
+              <w:rPr>
+                <w:rStyle w:val="Hyperlink"/>
+                <w:noProof/>
+              </w:rPr>
+              <w:t>Technical Specifications</w:t>
+            </w:r>
+            <w:r>
+              <w:rPr>
+                <w:noProof/>
+                <w:webHidden/>
+              </w:rPr>
+              <w:tab/>
+            </w:r>
+            <w:r>
+              <w:rPr>
+                <w:noProof/>
+                <w:webHidden/>
+              </w:rPr>
+              <w:fldChar w:fldCharType="begin"/>
+            </w:r>
+            <w:r>
+              <w:rPr>
+                <w:noProof/>
+                <w:webHidden/>
+              </w:rPr>
+              <w:instrText xml:space="preserve"> PAGEREF _Toc227463671 \h </w:instrText>
+            </w:r>
+            <w:r>
+              <w:rPr>
+                <w:noProof/>
+                <w:webHidden/>
+              </w:rPr>
+            </w:r>
+            <w:r>
+              <w:rPr>
+                <w:noProof/>
+                <w:webHidden/>
+              </w:rPr>
+              <w:fldChar w:fldCharType="separate"/>
+            </w:r>
+            <w:r>
+              <w:rPr>
+                <w:noProof/>
+                <w:webHidden/>
+              </w:rPr>
+              <w:t>2</w:t>
+            </w:r>
+            <w:r>
+              <w:rPr>
+                <w:noProof/>
+                <w:webHidden/>
+              </w:rPr>
+              <w:fldChar w:fldCharType="end"/>
+            </w:r>
+          </w:hyperlink>
+        </w:p>
+        <w:p>
+          <w:pPr>
+            <w:pStyle w:val="TOC2"/>
+            <w:tabs>
+              <w:tab w:val="right" w:leader="dot" w:pos="9016"/>
+            </w:tabs>
+            <w:rPr>
+              <w:noProof/>
+            </w:rPr>
+          </w:pPr>
+          <w:hyperlink w:anchor="_Toc227463672" w:history="1">
+            <w:r>
+              <w:rPr>
+                <w:rStyle w:val="Hyperlink"/>
+                <w:noProof/>
+              </w:rPr>
+              <w:t>Methodologies</w:t>
+            </w:r>
+            <w:r>
+              <w:rPr>
+                <w:noProof/>
+                <w:webHidden/>
+              </w:rPr>
+              <w:tab/>
+            </w:r>
+            <w:r>
+              <w:rPr>
+                <w:noProof/>
+                <w:webHidden/>
+              </w:rPr>
+              <w:fldChar w:fldCharType="begin"/>
+            </w:r>
+            <w:r>
+              <w:rPr>
+                <w:noProof/>
+                <w:webHidden/>
+              </w:rPr>
+              <w:instrText xml:space="preserve"> PAGEREF _Toc227463672 \h </w:instrText>
+            </w:r>
+            <w:r>
+              <w:rPr>
+                <w:noProof/>
+                <w:webHidden/>
+              </w:rPr>
+            </w:r>
+            <w:r>
+              <w:rPr>
+                <w:noProof/>
+                <w:webHidden/>
+              </w:rPr>
+              <w:fldChar w:fldCharType="separate"/>
+            </w:r>
+            <w:r>
+              <w:rPr>
+                <w:noProof/>
+                <w:webHidden/>
+              </w:rPr>
+              <w:t>2</w:t>
             </w:r>
             <w:r>
               <w:rPr>
@@ -142,7 +482,7 @@
               <w:lang w:eastAsia="en-GB"/>
             </w:rPr>
           </w:pPr>
-          <w:hyperlink w:anchor="_Toc227001769" w:history="1">
+          <w:hyperlink w:anchor="_Toc227463673" w:history="1">
             <w:r>
               <w:rPr>
                 <w:rStyle w:val="Hyperlink"/>
@@ -169,7 +509,7 @@
                 <w:noProof/>
                 <w:webHidden/>
               </w:rPr>
-              <w:instrText xml:space="preserve"> PAGEREF _Toc227001769 \h </w:instrText>
+              <w:instrText xml:space="preserve"> PAGEREF _Toc227463673 \h </w:instrText>
             </w:r>
             <w:r>
               <w:rPr>
@@ -189,7 +529,279 @@
                 <w:noProof/>
                 <w:webHidden/>
               </w:rPr>
-              <w:t>1</w:t>
+              <w:t>2</w:t>
+            </w:r>
+            <w:r>
+              <w:rPr>
+                <w:noProof/>
+                <w:webHidden/>
+              </w:rPr>
+              <w:fldChar w:fldCharType="end"/>
+            </w:r>
+          </w:hyperlink>
+        </w:p>
+        <w:p>
+          <w:pPr>
+            <w:pStyle w:val="TOC2"/>
+            <w:tabs>
+              <w:tab w:val="right" w:leader="dot" w:pos="9016"/>
+            </w:tabs>
+            <w:rPr>
+              <w:noProof/>
+            </w:rPr>
+          </w:pPr>
+          <w:hyperlink w:anchor="_Toc227463674" w:history="1">
+            <w:r>
+              <w:rPr>
+                <w:rStyle w:val="Hyperlink"/>
+                <w:noProof/>
+              </w:rPr>
+              <w:t>Topic Background</w:t>
+            </w:r>
+            <w:r>
+              <w:rPr>
+                <w:noProof/>
+                <w:webHidden/>
+              </w:rPr>
+              <w:tab/>
+            </w:r>
+            <w:r>
+              <w:rPr>
+                <w:noProof/>
+                <w:webHidden/>
+              </w:rPr>
+              <w:fldChar w:fldCharType="begin"/>
+            </w:r>
+            <w:r>
+              <w:rPr>
+                <w:noProof/>
+                <w:webHidden/>
+              </w:rPr>
+              <w:instrText xml:space="preserve"> PAGEREF _Toc227463674 \h </w:instrText>
+            </w:r>
+            <w:r>
+              <w:rPr>
+                <w:noProof/>
+                <w:webHidden/>
+              </w:rPr>
+            </w:r>
+            <w:r>
+              <w:rPr>
+                <w:noProof/>
+                <w:webHidden/>
+              </w:rPr>
+              <w:fldChar w:fldCharType="separate"/>
+            </w:r>
+            <w:r>
+              <w:rPr>
+                <w:noProof/>
+                <w:webHidden/>
+              </w:rPr>
+              <w:t>3</w:t>
+            </w:r>
+            <w:r>
+              <w:rPr>
+                <w:noProof/>
+                <w:webHidden/>
+              </w:rPr>
+              <w:fldChar w:fldCharType="end"/>
+            </w:r>
+          </w:hyperlink>
+        </w:p>
+        <w:p>
+          <w:pPr>
+            <w:pStyle w:val="TOC2"/>
+            <w:tabs>
+              <w:tab w:val="right" w:leader="dot" w:pos="9016"/>
+            </w:tabs>
+            <w:rPr>
+              <w:noProof/>
+            </w:rPr>
+          </w:pPr>
+          <w:hyperlink w:anchor="_Toc227463675" w:history="1">
+            <w:r>
+              <w:rPr>
+                <w:rStyle w:val="Hyperlink"/>
+                <w:noProof/>
+              </w:rPr>
+              <w:t>Literature Review</w:t>
+            </w:r>
+            <w:r>
+              <w:rPr>
+                <w:noProof/>
+                <w:webHidden/>
+              </w:rPr>
+              <w:tab/>
+            </w:r>
+            <w:r>
+              <w:rPr>
+                <w:noProof/>
+                <w:webHidden/>
+              </w:rPr>
+              <w:fldChar w:fldCharType="begin"/>
+            </w:r>
+            <w:r>
+              <w:rPr>
+                <w:noProof/>
+                <w:webHidden/>
+              </w:rPr>
+              <w:instrText xml:space="preserve"> PAGEREF _Toc227463675 \h </w:instrText>
+            </w:r>
+            <w:r>
+              <w:rPr>
+                <w:noProof/>
+                <w:webHidden/>
+              </w:rPr>
+            </w:r>
+            <w:r>
+              <w:rPr>
+                <w:noProof/>
+                <w:webHidden/>
+              </w:rPr>
+              <w:fldChar w:fldCharType="separate"/>
+            </w:r>
+            <w:r>
+              <w:rPr>
+                <w:noProof/>
+                <w:webHidden/>
+              </w:rPr>
+              <w:t>3</w:t>
+            </w:r>
+            <w:r>
+              <w:rPr>
+                <w:noProof/>
+                <w:webHidden/>
+              </w:rPr>
+              <w:fldChar w:fldCharType="end"/>
+            </w:r>
+          </w:hyperlink>
+        </w:p>
+        <w:p>
+          <w:pPr>
+            <w:pStyle w:val="TOC2"/>
+            <w:tabs>
+              <w:tab w:val="right" w:leader="dot" w:pos="9016"/>
+            </w:tabs>
+            <w:rPr>
+              <w:noProof/>
+            </w:rPr>
+          </w:pPr>
+          <w:hyperlink w:anchor="_Toc227463676" w:history="1">
+            <w:r>
+              <w:rPr>
+                <w:rStyle w:val="Hyperlink"/>
+                <w:noProof/>
+              </w:rPr>
+              <w:t>Previous Work</w:t>
+            </w:r>
+            <w:r>
+              <w:rPr>
+                <w:noProof/>
+                <w:webHidden/>
+              </w:rPr>
+              <w:tab/>
+            </w:r>
+            <w:r>
+              <w:rPr>
+                <w:noProof/>
+                <w:webHidden/>
+              </w:rPr>
+              <w:fldChar w:fldCharType="begin"/>
+            </w:r>
+            <w:r>
+              <w:rPr>
+                <w:noProof/>
+                <w:webHidden/>
+              </w:rPr>
+              <w:instrText xml:space="preserve"> PAGEREF _Toc227463676 \h </w:instrText>
+            </w:r>
+            <w:r>
+              <w:rPr>
+                <w:noProof/>
+                <w:webHidden/>
+              </w:rPr>
+            </w:r>
+            <w:r>
+              <w:rPr>
+                <w:noProof/>
+                <w:webHidden/>
+              </w:rPr>
+              <w:fldChar w:fldCharType="separate"/>
+            </w:r>
+            <w:r>
+              <w:rPr>
+                <w:noProof/>
+                <w:webHidden/>
+              </w:rPr>
+              <w:t>3</w:t>
+            </w:r>
+            <w:r>
+              <w:rPr>
+                <w:noProof/>
+                <w:webHidden/>
+              </w:rPr>
+              <w:fldChar w:fldCharType="end"/>
+            </w:r>
+          </w:hyperlink>
+        </w:p>
+        <w:p>
+          <w:pPr>
+            <w:pStyle w:val="TOC2"/>
+            <w:tabs>
+              <w:tab w:val="right" w:leader="dot" w:pos="9016"/>
+            </w:tabs>
+            <w:rPr>
+              <w:noProof/>
+            </w:rPr>
+          </w:pPr>
+          <w:hyperlink w:anchor="_Toc227463677" w:history="1">
+            <w:r>
+              <w:rPr>
+                <w:rStyle w:val="Hyperlink"/>
+                <w:noProof/>
+              </w:rPr>
+              <w:t>Existing Approaches by Others</w:t>
+            </w:r>
+            <w:r>
+              <w:rPr>
+                <w:noProof/>
+                <w:webHidden/>
+              </w:rPr>
+              <w:tab/>
+            </w:r>
+            <w:r>
+              <w:rPr>
+                <w:noProof/>
+                <w:webHidden/>
+              </w:rPr>
+              <w:fldChar w:fldCharType="begin"/>
+            </w:r>
+            <w:r>
+              <w:rPr>
+                <w:noProof/>
+                <w:webHidden/>
+              </w:rPr>
+              <w:instrText xml:space="preserve"> PAGEREF _Toc227463677 \h </w:instrText>
+            </w:r>
+            <w:r>
+              <w:rPr>
+                <w:noProof/>
+                <w:webHidden/>
+              </w:rPr>
+            </w:r>
+            <w:r>
+              <w:rPr>
+                <w:noProof/>
+                <w:webHidden/>
+              </w:rPr>
+              <w:fldChar w:fldCharType="separate"/>
+            </w:r>
+            <w:r>
+              <w:rPr>
+                <w:noProof/>
+                <w:webHidden/>
+              </w:rPr>
+              <w:t>3</w:t>
             </w:r>
             <w:r>
               <w:rPr>
@@ -214,7 +826,7 @@
               <w:lang w:eastAsia="en-GB"/>
             </w:rPr>
           </w:pPr>
-          <w:hyperlink w:anchor="_Toc227001770" w:history="1">
+          <w:hyperlink w:anchor="_Toc227463678" w:history="1">
             <w:r>
               <w:rPr>
                 <w:rStyle w:val="Hyperlink"/>
@@ -241,7 +853,7 @@
                 <w:noProof/>
                 <w:webHidden/>
               </w:rPr>
-              <w:instrText xml:space="preserve"> PAGEREF _Toc227001770 \h </w:instrText>
+              <w:instrText xml:space="preserve"> PAGEREF _Toc227463678 \h </w:instrText>
             </w:r>
             <w:r>
               <w:rPr>
@@ -261,7 +873,79 @@
                 <w:noProof/>
                 <w:webHidden/>
               </w:rPr>
-              <w:t>1</w:t>
+              <w:t>3</w:t>
+            </w:r>
+            <w:r>
+              <w:rPr>
+                <w:noProof/>
+                <w:webHidden/>
+              </w:rPr>
+              <w:fldChar w:fldCharType="end"/>
+            </w:r>
+          </w:hyperlink>
+        </w:p>
+        <w:p>
+          <w:pPr>
+            <w:pStyle w:val="TOC1"/>
+            <w:tabs>
+              <w:tab w:val="right" w:leader="dot" w:pos="9016"/>
+            </w:tabs>
+            <w:rPr>
+              <w:rFonts w:eastAsiaTheme="minorEastAsia"/>
+              <w:noProof/>
+              <w:sz w:val="24"/>
+              <w:szCs w:val="24"/>
+              <w:lang w:eastAsia="en-GB"/>
+            </w:rPr>
+          </w:pPr>
+          <w:hyperlink w:anchor="_Toc227463679" w:history="1">
+            <w:r>
+              <w:rPr>
+                <w:rStyle w:val="Hyperlink"/>
+                <w:noProof/>
+              </w:rPr>
+              <w:t>References</w:t>
+            </w:r>
+            <w:r>
+              <w:rPr>
+                <w:noProof/>
+                <w:webHidden/>
+              </w:rPr>
+              <w:tab/>
+            </w:r>
+            <w:r>
+              <w:rPr>
+                <w:noProof/>
+                <w:webHidden/>
+              </w:rPr>
+              <w:fldChar w:fldCharType="begin"/>
+            </w:r>
+            <w:r>
+              <w:rPr>
+                <w:noProof/>
+                <w:webHidden/>
+              </w:rPr>
+              <w:instrText xml:space="preserve"> PAGEREF _Toc227463679 \h </w:instrText>
+            </w:r>
+            <w:r>
+              <w:rPr>
+                <w:noProof/>
+                <w:webHidden/>
+              </w:rPr>
+            </w:r>
+            <w:r>
+              <w:rPr>
+                <w:noProof/>
+                <w:webHidden/>
+              </w:rPr>
+              <w:fldChar w:fldCharType="separate"/>
+            </w:r>
+            <w:r>
+              <w:rPr>
+                <w:noProof/>
+                <w:webHidden/>
+              </w:rPr>
+              <w:t>4</w:t>
             </w:r>
             <w:r>
               <w:rPr>
@@ -288,156 +972,46 @@
       <w:pPr>
         <w:pStyle w:val="Heading1"/>
       </w:pPr>
-      <w:bookmarkStart w:id="0" w:name="_Toc227001768"/>
+      <w:bookmarkStart w:id="0" w:name="_Toc227463667"/>
       <w:r>
         <w:t>Introduction</w:t>
       </w:r>
+      <w:bookmarkStart w:id="1" w:name="_Toc227463668"/>
       <w:bookmarkEnd w:id="0"/>
     </w:p>
     <w:p>
       <w:pPr>
-        <w:rPr>
-          <w:i/>
-          <w:iCs/>
-        </w:rPr>
-      </w:pPr>
-      <w:r>
-        <w:rPr>
-          <w:i/>
-          <w:iCs/>
-        </w:rPr>
-        <w:t xml:space="preserve">which states clearly the </w:t>
-      </w:r>
-      <w:r>
-        <w:rPr>
-          <w:b/>
-          <w:bCs/>
-          <w:i/>
-          <w:iCs/>
-        </w:rPr>
-        <w:t>aims</w:t>
-      </w:r>
-      <w:r>
-        <w:rPr>
-          <w:i/>
-          <w:iCs/>
-        </w:rPr>
-        <w:t>, </w:t>
-      </w:r>
-      <w:r>
-        <w:rPr>
-          <w:b/>
-          <w:bCs/>
-          <w:i/>
-          <w:iCs/>
-        </w:rPr>
-        <w:t>objectives</w:t>
-      </w:r>
-      <w:r>
-        <w:rPr>
-          <w:i/>
-          <w:iCs/>
-        </w:rPr>
-        <w:t xml:space="preserve">, the domain and data set(s) to be investigated (if any date set is involved), </w:t>
-      </w:r>
-      <w:r>
-        <w:rPr>
-          <w:b/>
-          <w:bCs/>
-          <w:i/>
-          <w:iCs/>
-        </w:rPr>
-        <w:t>background</w:t>
-      </w:r>
-      <w:r>
-        <w:rPr>
-          <w:i/>
-          <w:iCs/>
-        </w:rPr>
-        <w:t xml:space="preserve">, </w:t>
-      </w:r>
-      <w:r>
-        <w:rPr>
-          <w:b/>
-          <w:bCs/>
-          <w:i/>
-          <w:iCs/>
-        </w:rPr>
-        <w:t>motivations</w:t>
-      </w:r>
-      <w:r>
-        <w:rPr>
-          <w:i/>
-          <w:iCs/>
-        </w:rPr>
-        <w:t>, </w:t>
-      </w:r>
-      <w:r>
-        <w:rPr>
-          <w:b/>
-          <w:bCs/>
-          <w:i/>
-          <w:iCs/>
-        </w:rPr>
-        <w:t>technical specifications</w:t>
-      </w:r>
-      <w:r>
-        <w:rPr>
-          <w:i/>
-          <w:iCs/>
-        </w:rPr>
-        <w:t xml:space="preserve">, </w:t>
-      </w:r>
-      <w:r>
-        <w:rPr>
-          <w:b/>
-          <w:bCs/>
-          <w:i/>
-          <w:iCs/>
-        </w:rPr>
-        <w:t>methodologies</w:t>
-      </w:r>
-      <w:r>
-        <w:rPr>
-          <w:i/>
-          <w:iCs/>
-        </w:rPr>
-        <w:t xml:space="preserve"> of the project.  In this section, you need to demonstrate that you know what your project is, what </w:t>
-      </w:r>
-      <w:r>
-        <w:rPr>
-          <w:b/>
-          <w:bCs/>
-          <w:i/>
-          <w:iCs/>
-        </w:rPr>
-        <w:t>problem you are going to handle</w:t>
-      </w:r>
-      <w:r>
-        <w:rPr>
-          <w:i/>
-          <w:iCs/>
-        </w:rPr>
-        <w:t>, what you are going to achieve.</w:t>
-      </w:r>
-      <w:r>
-        <w:rPr>
-          <w:noProof/>
-        </w:rPr>
-        <w:t xml:space="preserve"> </w:t>
-      </w:r>
-    </w:p>
-    <w:p>
-      <w:pPr>
         <w:pStyle w:val="Heading2"/>
       </w:pPr>
       <w:r>
         <w:t>Problem Description, Background and Motivations</w:t>
       </w:r>
-    </w:p>
-    <w:p>
-      <w:r>
-        <w:t>Problem: Given the rise of autonomous vehicles on the road, does the property of security (authenticated sensor data) at one layer compose to guarantee the property of safety (accurate obstacle detection) at a different layer of system architecture? How do architectural constructs, such as Redundancy, Hierarchical Decomposition, and Shared Resources, govern whether this cross-layer composition holds?</w:t>
+      <w:bookmarkEnd w:id="1"/>
+    </w:p>
+    <w:p>
+      <w:r>
+        <w:t>The number of autonomous vehicles has greatly risen in recent years</w:t>
+      </w:r>
+      <w:r>
+        <w:t>,</w:t>
+      </w:r>
+      <w:r>
+        <w:t xml:space="preserve"> but</w:t>
+      </w:r>
+      <w:r>
+        <w:t xml:space="preserve"> does the property of security (authenticated sensor data) at one layer compose to guarantee the property of safety (accurate obstacle detection) at a different layer of </w:t>
+      </w:r>
+      <w:r>
+        <w:t xml:space="preserve">vehicle </w:t>
+      </w:r>
+      <w:r>
+        <w:t xml:space="preserve">system architecture? How do architectural constructs, such as Redundancy, Hierarchical Decomposition, and Shared Resources, </w:t>
+      </w:r>
+      <w:r>
+        <w:t xml:space="preserve">of which these systems may be based upon </w:t>
+      </w:r>
+      <w:r>
+        <w:t>govern whether this cross-layer composition holds?</w:t>
       </w:r>
     </w:p>
     <w:p>
@@ -454,16 +1028,32 @@
       <w:r>
         <w:t>It raises questions about the designs of these existing systems and how factors such as redundancy, shared resources, and hierarchical decomposition are considered in these existing designs</w:t>
       </w:r>
+      <w:r>
+        <w:t>.</w:t>
+      </w:r>
     </w:p>
     <w:p/>
     <w:p>
       <w:r>
-        <w:t>Use Case: An example of a malicious source would be the potential risk that a malicious message could hijack a self-driving car and cause it to hit pedestrians (risking safety AND security). This can appear in the form of a physical attacker holding a clear sign that can misdirect the vehicle (similar to SQL Injection Attacks on Automatic Number Plate Recognition software [2])</w:t>
-      </w:r>
-    </w:p>
-    <w:p>
-      <w:r>
-        <w:t>Source: The Decoder Article: (https://the-decoder.com/a-printed-sign-can-hijack-a-self-driving-car-and-steer-it-toward-pedestrians-study-shows/)</w:t>
+        <w:t xml:space="preserve">If the cross-layer composition between safety and security can’t be guaranteed, then it could allow external malicious sources to exploit these systems. </w:t>
+      </w:r>
+      <w:r>
+        <w:t>An example of a malicious source would be the potential risk that a malicious message could hijack a self-driving car and cause it to hit pedestrians (risking safety AND security). This can appear in the form of a physical attacker holding a clear sign that can misdirect the vehicle</w:t>
+      </w:r>
+      <w:r>
+        <w:t xml:space="preserve"> [2]</w:t>
+      </w:r>
+      <w:r>
+        <w:t xml:space="preserve"> (similar to SQL Injection Attacks on Automatic Number Plate Recognition software [</w:t>
+      </w:r>
+      <w:r>
+        <w:t>3</w:t>
+      </w:r>
+      <w:r>
+        <w:t>])</w:t>
+      </w:r>
+      <w:r>
+        <w:t>.</w:t>
       </w:r>
     </w:p>
     <w:p/>
@@ -471,23 +1061,52 @@
       <w:pPr>
         <w:pStyle w:val="Heading2"/>
       </w:pPr>
+      <w:bookmarkStart w:id="2" w:name="_Toc227463669"/>
       <w:r>
         <w:t>Aims</w:t>
       </w:r>
-    </w:p>
-    <w:p>
-      <w:r>
-        <w:t>Develop a robust system architecture that remains safe and secure-by-design, regardless of different architectural constructs that would be applied to ensure an efficient autonomous driving system</w:t>
-      </w:r>
-    </w:p>
-    <w:p>
-      <w:r>
-        <w:t>Ensure that architectural patterns that maintain safety and security properties are present and only benefit the overall system</w:t>
-      </w:r>
-    </w:p>
-    <w:p>
-      <w:r>
-        <w:t>Examine redundancy, shared resources, and hierarchical decomposition within the system and how the design choices used to solve this problem will affect these areas</w:t>
+      <w:bookmarkEnd w:id="2"/>
+    </w:p>
+    <w:p>
+      <w:r>
+        <w:t>The first aim of this project is to d</w:t>
+      </w:r>
+      <w:r>
+        <w:t>evelop a robust system architecture that remains safe and secure-by-design, regardless of different architectural constructs that would be applied to ensure an efficient autonomous driving system</w:t>
+      </w:r>
+    </w:p>
+    <w:p>
+      <w:r>
+        <w:t>The</w:t>
+      </w:r>
+      <w:r>
+        <w:t xml:space="preserve"> second</w:t>
+      </w:r>
+      <w:r>
+        <w:t xml:space="preserve"> aim of this project is to </w:t>
+      </w:r>
+      <w:r>
+        <w:t>e</w:t>
+      </w:r>
+      <w:r>
+        <w:t>nsure that architectural patterns that maintain safety and security properties are present and only benefit the overall system</w:t>
+      </w:r>
+    </w:p>
+    <w:p>
+      <w:r>
+        <w:t>The</w:t>
+      </w:r>
+      <w:r>
+        <w:t xml:space="preserve"> third</w:t>
+      </w:r>
+      <w:r>
+        <w:t xml:space="preserve"> aim of this project is to </w:t>
+      </w:r>
+      <w:r>
+        <w:t>e</w:t>
+      </w:r>
+      <w:r>
+        <w:t>xamine redundancy, shared resources, and hierarchical decomposition within the system and how the design choices used to solve this problem will affect these areas</w:t>
       </w:r>
     </w:p>
     <w:p/>
@@ -495,9 +1114,11 @@
       <w:pPr>
         <w:pStyle w:val="Heading2"/>
       </w:pPr>
+      <w:bookmarkStart w:id="3" w:name="_Toc227463670"/>
       <w:r>
         <w:t>Objectives</w:t>
       </w:r>
+      <w:bookmarkEnd w:id="3"/>
     </w:p>
     <w:p>
       <w:r>
@@ -506,7 +1127,13 @@
     </w:p>
     <w:p>
       <w:r>
-        <w:t>Design the system architecture using a chosen Unified Modelling Language (UML) tool</w:t>
+        <w:t>Design the</w:t>
+      </w:r>
+      <w:r>
+        <w:t xml:space="preserve"> base</w:t>
+      </w:r>
+      <w:r>
+        <w:t xml:space="preserve"> system architecture using a chosen Unified Modelling Language (UML) tool</w:t>
       </w:r>
     </w:p>
     <w:p>
@@ -524,18 +1151,22 @@
       <w:pPr>
         <w:pStyle w:val="Heading2"/>
       </w:pPr>
+      <w:bookmarkStart w:id="4" w:name="_Toc227463671"/>
       <w:r>
         <w:t>Technical Specifications</w:t>
       </w:r>
+      <w:bookmarkEnd w:id="4"/>
     </w:p>
     <w:p/>
     <w:p>
       <w:pPr>
         <w:pStyle w:val="Heading2"/>
       </w:pPr>
+      <w:bookmarkStart w:id="5" w:name="_Toc227463672"/>
       <w:r>
         <w:t>Methodologies</w:t>
       </w:r>
+      <w:bookmarkEnd w:id="5"/>
     </w:p>
     <w:p/>
     <w:p/>
@@ -543,11 +1174,11 @@
       <w:pPr>
         <w:pStyle w:val="Heading1"/>
       </w:pPr>
-      <w:bookmarkStart w:id="1" w:name="_Toc227001769"/>
+      <w:bookmarkStart w:id="6" w:name="_Toc227463673"/>
       <w:r>
         <w:t>Background Material</w:t>
       </w:r>
-      <w:bookmarkEnd w:id="1"/>
+      <w:bookmarkEnd w:id="6"/>
     </w:p>
     <w:p>
       <w:pPr>
@@ -641,7 +1272,15 @@
           <w:i/>
           <w:iCs/>
         </w:rPr>
-        <w:t xml:space="preserve"> should be given.  In this section, you have to demonstrate a </w:t>
+        <w:t xml:space="preserve"> should be </w:t>
+      </w:r>
+      <w:r>
+        <w:rPr>
+          <w:i/>
+          <w:iCs/>
+        </w:rPr>
+        <w:lastRenderedPageBreak/>
+        <w:t xml:space="preserve">given.  In this section, you have to demonstrate a </w:t>
       </w:r>
       <w:r>
         <w:rPr>
@@ -671,7 +1310,7 @@
           <w:noProof/>
         </w:rPr>
         <w:drawing>
-          <wp:inline distT="0" distB="0" distL="0" distR="0" wp14:anchorId="532BBCCD" wp14:editId="29FA1794">
+          <wp:inline distT="0" distB="0" distL="0" distR="0" wp14:anchorId="532BBCCD" wp14:editId="74A81A1D">
             <wp:extent cx="2698750" cy="839470"/>
             <wp:effectExtent l="0" t="0" r="6350" b="0"/>
             <wp:docPr id="1255259783" name="Picture 1"/>
@@ -717,152 +1356,929 @@
       <w:pPr>
         <w:pStyle w:val="Heading2"/>
       </w:pPr>
+      <w:bookmarkStart w:id="7" w:name="_Toc227463674"/>
+      <w:r>
+        <w:t>Topic Background</w:t>
+      </w:r>
+      <w:bookmarkEnd w:id="7"/>
+    </w:p>
+    <w:p/>
+    <w:p>
+      <w:pPr>
+        <w:pStyle w:val="Heading2"/>
+      </w:pPr>
+      <w:bookmarkStart w:id="8" w:name="_Toc227463675"/>
+      <w:r>
+        <w:t>Literature Review</w:t>
+      </w:r>
+      <w:bookmarkEnd w:id="8"/>
+    </w:p>
+    <w:p/>
+    <w:p>
+      <w:pPr>
+        <w:pStyle w:val="Heading2"/>
+      </w:pPr>
+      <w:bookmarkStart w:id="9" w:name="_Toc227463676"/>
+      <w:r>
+        <w:t>Previous Work</w:t>
+      </w:r>
+      <w:bookmarkEnd w:id="9"/>
+    </w:p>
+    <w:p/>
+    <w:p>
+      <w:pPr>
+        <w:pStyle w:val="Heading2"/>
+      </w:pPr>
+      <w:bookmarkStart w:id="10" w:name="_Toc227463677"/>
+      <w:r>
+        <w:t>Existing Approaches by Others</w:t>
+      </w:r>
+      <w:bookmarkEnd w:id="10"/>
+    </w:p>
+    <w:p>
+      <w:r>
+        <w:t>Site literature of people doing the same project</w:t>
+      </w:r>
+      <w:r>
+        <w:t xml:space="preserve"> and give constructive criticism</w:t>
+      </w:r>
+    </w:p>
+    <w:p>
+      <w:pPr>
+        <w:pStyle w:val="Heading1"/>
+      </w:pPr>
+      <w:bookmarkStart w:id="11" w:name="_Toc227463678"/>
+      <w:r>
+        <w:t>Project Schedule</w:t>
+      </w:r>
+      <w:bookmarkEnd w:id="11"/>
+    </w:p>
+    <w:tbl>
+      <w:tblPr>
+        <w:tblStyle w:val="TableGrid"/>
+        <w:tblW w:w="9198" w:type="dxa"/>
+        <w:tblLook w:val="04A0" w:firstRow="1" w:lastRow="0" w:firstColumn="1" w:lastColumn="0" w:noHBand="0" w:noVBand="1"/>
+      </w:tblPr>
+      <w:tblGrid>
+        <w:gridCol w:w="1314"/>
+        <w:gridCol w:w="1314"/>
+        <w:gridCol w:w="1314"/>
+        <w:gridCol w:w="1314"/>
+        <w:gridCol w:w="1314"/>
+        <w:gridCol w:w="1314"/>
+        <w:gridCol w:w="1314"/>
+      </w:tblGrid>
+      <w:tr>
+        <w:trPr>
+          <w:trHeight w:val="555"/>
+        </w:trPr>
+        <w:tc>
+          <w:tcPr>
+            <w:tcW w:w="1314" w:type="dxa"/>
+          </w:tcPr>
+          <w:p/>
+        </w:tc>
+        <w:tc>
+          <w:tcPr>
+            <w:tcW w:w="1314" w:type="dxa"/>
+          </w:tcPr>
+          <w:p>
+            <w:r>
+              <w:t>March</w:t>
+            </w:r>
+          </w:p>
+        </w:tc>
+        <w:tc>
+          <w:tcPr>
+            <w:tcW w:w="1314" w:type="dxa"/>
+          </w:tcPr>
+          <w:p>
+            <w:r>
+              <w:t>April</w:t>
+            </w:r>
+          </w:p>
+        </w:tc>
+        <w:tc>
+          <w:tcPr>
+            <w:tcW w:w="1314" w:type="dxa"/>
+          </w:tcPr>
+          <w:p>
+            <w:r>
+              <w:t>May</w:t>
+            </w:r>
+          </w:p>
+        </w:tc>
+        <w:tc>
+          <w:tcPr>
+            <w:tcW w:w="1314" w:type="dxa"/>
+          </w:tcPr>
+          <w:p>
+            <w:r>
+              <w:t>June</w:t>
+            </w:r>
+          </w:p>
+        </w:tc>
+        <w:tc>
+          <w:tcPr>
+            <w:tcW w:w="1314" w:type="dxa"/>
+          </w:tcPr>
+          <w:p>
+            <w:r>
+              <w:t>July</w:t>
+            </w:r>
+          </w:p>
+        </w:tc>
+        <w:tc>
+          <w:tcPr>
+            <w:tcW w:w="1314" w:type="dxa"/>
+          </w:tcPr>
+          <w:p>
+            <w:r>
+              <w:t>August</w:t>
+            </w:r>
+          </w:p>
+        </w:tc>
+      </w:tr>
+      <w:tr>
+        <w:trPr>
+          <w:trHeight w:val="583"/>
+        </w:trPr>
+        <w:tc>
+          <w:tcPr>
+            <w:tcW w:w="1314" w:type="dxa"/>
+          </w:tcPr>
+          <w:p>
+            <w:r>
+              <w:t>Sprint 1</w:t>
+            </w:r>
+          </w:p>
+        </w:tc>
+        <w:tc>
+          <w:tcPr>
+            <w:tcW w:w="1314" w:type="dxa"/>
+            <w:shd w:val="clear" w:color="auto" w:fill="FFFF00"/>
+          </w:tcPr>
+          <w:p>
+            <w:r>
+              <w:t>5</w:t>
+            </w:r>
+            <w:r>
+              <w:rPr>
+                <w:vertAlign w:val="superscript"/>
+              </w:rPr>
+              <w:t>th</w:t>
+            </w:r>
+            <w:r>
+              <w:t xml:space="preserve"> March</w:t>
+            </w:r>
+          </w:p>
+        </w:tc>
+        <w:tc>
+          <w:tcPr>
+            <w:tcW w:w="1314" w:type="dxa"/>
+            <w:shd w:val="clear" w:color="auto" w:fill="FFFF00"/>
+          </w:tcPr>
+          <w:p>
+            <w:r>
+              <w:t>2</w:t>
+            </w:r>
+            <w:r>
+              <w:rPr>
+                <w:vertAlign w:val="superscript"/>
+              </w:rPr>
+              <w:t>nd</w:t>
+            </w:r>
+            <w:r>
+              <w:t xml:space="preserve"> April</w:t>
+            </w:r>
+          </w:p>
+        </w:tc>
+        <w:tc>
+          <w:tcPr>
+            <w:tcW w:w="1314" w:type="dxa"/>
+          </w:tcPr>
+          <w:p/>
+        </w:tc>
+        <w:tc>
+          <w:tcPr>
+            <w:tcW w:w="1314" w:type="dxa"/>
+          </w:tcPr>
+          <w:p/>
+        </w:tc>
+        <w:tc>
+          <w:tcPr>
+            <w:tcW w:w="1314" w:type="dxa"/>
+          </w:tcPr>
+          <w:p/>
+        </w:tc>
+        <w:tc>
+          <w:tcPr>
+            <w:tcW w:w="1314" w:type="dxa"/>
+          </w:tcPr>
+          <w:p/>
+        </w:tc>
+      </w:tr>
+      <w:tr>
+        <w:trPr>
+          <w:trHeight w:val="555"/>
+        </w:trPr>
+        <w:tc>
+          <w:tcPr>
+            <w:tcW w:w="1314" w:type="dxa"/>
+          </w:tcPr>
+          <w:p>
+            <w:r>
+              <w:t>Sprint 2</w:t>
+            </w:r>
+          </w:p>
+        </w:tc>
+        <w:tc>
+          <w:tcPr>
+            <w:tcW w:w="1314" w:type="dxa"/>
+          </w:tcPr>
+          <w:p/>
+        </w:tc>
+        <w:tc>
+          <w:tcPr>
+            <w:tcW w:w="1314" w:type="dxa"/>
+            <w:shd w:val="clear" w:color="auto" w:fill="92D050"/>
+          </w:tcPr>
+          <w:p>
+            <w:r>
+              <w:t>3</w:t>
+            </w:r>
+            <w:r>
+              <w:rPr>
+                <w:vertAlign w:val="superscript"/>
+              </w:rPr>
+              <w:t>rd</w:t>
+            </w:r>
+            <w:r>
+              <w:t xml:space="preserve"> April</w:t>
+            </w:r>
+          </w:p>
+          <w:p>
+            <w:r>
+              <w:t>30</w:t>
+            </w:r>
+            <w:r>
+              <w:rPr>
+                <w:vertAlign w:val="superscript"/>
+              </w:rPr>
+              <w:t>th</w:t>
+            </w:r>
+            <w:r>
+              <w:t xml:space="preserve"> April</w:t>
+            </w:r>
+          </w:p>
+        </w:tc>
+        <w:tc>
+          <w:tcPr>
+            <w:tcW w:w="1314" w:type="dxa"/>
+          </w:tcPr>
+          <w:p/>
+        </w:tc>
+        <w:tc>
+          <w:tcPr>
+            <w:tcW w:w="1314" w:type="dxa"/>
+          </w:tcPr>
+          <w:p/>
+        </w:tc>
+        <w:tc>
+          <w:tcPr>
+            <w:tcW w:w="1314" w:type="dxa"/>
+          </w:tcPr>
+          <w:p/>
+        </w:tc>
+        <w:tc>
+          <w:tcPr>
+            <w:tcW w:w="1314" w:type="dxa"/>
+          </w:tcPr>
+          <w:p/>
+        </w:tc>
+      </w:tr>
+      <w:tr>
+        <w:trPr>
+          <w:trHeight w:val="555"/>
+        </w:trPr>
+        <w:tc>
+          <w:tcPr>
+            <w:tcW w:w="1314" w:type="dxa"/>
+          </w:tcPr>
+          <w:p>
+            <w:r>
+              <w:t>Sprint 3</w:t>
+            </w:r>
+          </w:p>
+        </w:tc>
+        <w:tc>
+          <w:tcPr>
+            <w:tcW w:w="1314" w:type="dxa"/>
+          </w:tcPr>
+          <w:p/>
+        </w:tc>
+        <w:tc>
+          <w:tcPr>
+            <w:tcW w:w="1314" w:type="dxa"/>
+          </w:tcPr>
+          <w:p/>
+        </w:tc>
+        <w:tc>
+          <w:tcPr>
+            <w:tcW w:w="1314" w:type="dxa"/>
+            <w:shd w:val="clear" w:color="auto" w:fill="00B0F0"/>
+          </w:tcPr>
+          <w:p>
+            <w:r>
+              <w:t>1</w:t>
+            </w:r>
+            <w:r>
+              <w:rPr>
+                <w:vertAlign w:val="superscript"/>
+              </w:rPr>
+              <w:t>st</w:t>
+            </w:r>
+            <w:r>
+              <w:t xml:space="preserve"> May</w:t>
+            </w:r>
+          </w:p>
+        </w:tc>
+        <w:tc>
+          <w:tcPr>
+            <w:tcW w:w="1314" w:type="dxa"/>
+            <w:shd w:val="clear" w:color="auto" w:fill="00B0F0"/>
+          </w:tcPr>
+          <w:p/>
+        </w:tc>
+        <w:tc>
+          <w:tcPr>
+            <w:tcW w:w="1314" w:type="dxa"/>
+            <w:shd w:val="clear" w:color="auto" w:fill="00B0F0"/>
+          </w:tcPr>
+          <w:p>
+            <w:r>
+              <w:t>2</w:t>
+            </w:r>
+            <w:r>
+              <w:rPr>
+                <w:vertAlign w:val="superscript"/>
+              </w:rPr>
+              <w:t>nd</w:t>
+            </w:r>
+            <w:r>
+              <w:t xml:space="preserve"> July</w:t>
+            </w:r>
+          </w:p>
+        </w:tc>
+        <w:tc>
+          <w:tcPr>
+            <w:tcW w:w="1314" w:type="dxa"/>
+          </w:tcPr>
+          <w:p/>
+        </w:tc>
+      </w:tr>
+      <w:tr>
+        <w:trPr>
+          <w:trHeight w:val="555"/>
+        </w:trPr>
+        <w:tc>
+          <w:tcPr>
+            <w:tcW w:w="1314" w:type="dxa"/>
+          </w:tcPr>
+          <w:p>
+            <w:r>
+              <w:t>Sprint 4</w:t>
+            </w:r>
+          </w:p>
+        </w:tc>
+        <w:tc>
+          <w:tcPr>
+            <w:tcW w:w="1314" w:type="dxa"/>
+          </w:tcPr>
+          <w:p/>
+        </w:tc>
+        <w:tc>
+          <w:tcPr>
+            <w:tcW w:w="1314" w:type="dxa"/>
+          </w:tcPr>
+          <w:p/>
+        </w:tc>
+        <w:tc>
+          <w:tcPr>
+            <w:tcW w:w="1314" w:type="dxa"/>
+          </w:tcPr>
+          <w:p/>
+        </w:tc>
+        <w:tc>
+          <w:tcPr>
+            <w:tcW w:w="1314" w:type="dxa"/>
+          </w:tcPr>
+          <w:p/>
+        </w:tc>
+        <w:tc>
+          <w:tcPr>
+            <w:tcW w:w="1314" w:type="dxa"/>
+            <w:shd w:val="clear" w:color="auto" w:fill="0070C0"/>
+          </w:tcPr>
+          <w:p>
+            <w:r>
+              <w:rPr>
+                <w:color w:val="FFFFFF" w:themeColor="background1"/>
+              </w:rPr>
+              <w:t>3</w:t>
+            </w:r>
+            <w:r>
+              <w:rPr>
+                <w:color w:val="FFFFFF" w:themeColor="background1"/>
+                <w:vertAlign w:val="superscript"/>
+              </w:rPr>
+              <w:t>rd</w:t>
+            </w:r>
+            <w:r>
+              <w:rPr>
+                <w:color w:val="FFFFFF" w:themeColor="background1"/>
+              </w:rPr>
+              <w:t xml:space="preserve"> July</w:t>
+            </w:r>
+          </w:p>
+        </w:tc>
+        <w:tc>
+          <w:tcPr>
+            <w:tcW w:w="1314" w:type="dxa"/>
+            <w:shd w:val="clear" w:color="auto" w:fill="0070C0"/>
+          </w:tcPr>
+          <w:p>
+            <w:r>
+              <w:rPr>
+                <w:color w:val="FFFFFF" w:themeColor="background1"/>
+              </w:rPr>
+              <w:t>6</w:t>
+            </w:r>
+            <w:r>
+              <w:rPr>
+                <w:color w:val="FFFFFF" w:themeColor="background1"/>
+                <w:vertAlign w:val="superscript"/>
+              </w:rPr>
+              <w:t>th</w:t>
+            </w:r>
+            <w:r>
+              <w:rPr>
+                <w:color w:val="FFFFFF" w:themeColor="background1"/>
+              </w:rPr>
+              <w:t xml:space="preserve"> August</w:t>
+            </w:r>
+          </w:p>
+        </w:tc>
+      </w:tr>
+    </w:tbl>
+    <w:p/>
+    <w:p>
+      <w:pPr>
+        <w:pStyle w:val="Heading2"/>
+      </w:pPr>
+      <w:r>
+        <w:t>Sprint 1</w:t>
+      </w:r>
+      <w:r>
+        <w:t xml:space="preserve"> (5</w:t>
+      </w:r>
+      <w:r>
+        <w:rPr>
+          <w:vertAlign w:val="superscript"/>
+        </w:rPr>
+        <w:t>th</w:t>
+      </w:r>
+      <w:r>
+        <w:t xml:space="preserve"> March – 2</w:t>
+      </w:r>
+      <w:r>
+        <w:rPr>
+          <w:vertAlign w:val="superscript"/>
+        </w:rPr>
+        <w:t>nd</w:t>
+      </w:r>
+      <w:r>
+        <w:t xml:space="preserve"> April)</w:t>
+      </w:r>
+    </w:p>
+    <w:p>
+      <w:pPr>
+        <w:pStyle w:val="ListParagraph"/>
+        <w:numPr>
+          <w:ilvl w:val="0"/>
+          <w:numId w:val="4"/>
+        </w:numPr>
+      </w:pPr>
+      <w:r>
+        <w:t>Set up GitHub repository with Preliminary Report document created</w:t>
+      </w:r>
+    </w:p>
+    <w:p>
+      <w:pPr>
+        <w:pStyle w:val="ListParagraph"/>
+        <w:numPr>
+          <w:ilvl w:val="0"/>
+          <w:numId w:val="4"/>
+        </w:numPr>
+      </w:pPr>
+      <w:r>
+        <w:t>Fix minor details from 2</w:t>
+      </w:r>
+      <w:r>
+        <w:rPr>
+          <w:vertAlign w:val="superscript"/>
+        </w:rPr>
+        <w:t>nd</w:t>
+      </w:r>
+      <w:r>
+        <w:t xml:space="preserve"> meeting slides</w:t>
+      </w:r>
+    </w:p>
+    <w:p>
+      <w:pPr>
+        <w:pStyle w:val="ListParagraph"/>
+        <w:numPr>
+          <w:ilvl w:val="0"/>
+          <w:numId w:val="4"/>
+        </w:numPr>
+      </w:pPr>
+      <w:r>
+        <w:t>Prepare slides for 3</w:t>
+      </w:r>
+      <w:r>
+        <w:rPr>
+          <w:vertAlign w:val="superscript"/>
+        </w:rPr>
+        <w:t>rd</w:t>
+      </w:r>
+      <w:r>
+        <w:t xml:space="preserve"> meeting (and apply feedback after the meeting)</w:t>
+      </w:r>
+    </w:p>
+    <w:p>
+      <w:pPr>
+        <w:pStyle w:val="ListParagraph"/>
+        <w:numPr>
+          <w:ilvl w:val="0"/>
+          <w:numId w:val="4"/>
+        </w:numPr>
+      </w:pPr>
+      <w:r>
+        <w:t>Extend literature review</w:t>
+      </w:r>
+    </w:p>
+    <w:p>
+      <w:pPr>
+        <w:pStyle w:val="Heading2"/>
+      </w:pPr>
+      <w:r>
+        <w:t>Sprint 2</w:t>
+      </w:r>
+      <w:r>
+        <w:t xml:space="preserve"> (3</w:t>
+      </w:r>
+      <w:r>
+        <w:rPr>
+          <w:vertAlign w:val="superscript"/>
+        </w:rPr>
+        <w:t>rd</w:t>
+      </w:r>
+      <w:r>
+        <w:t xml:space="preserve"> April – 30</w:t>
+      </w:r>
+      <w:r>
+        <w:rPr>
+          <w:vertAlign w:val="superscript"/>
+        </w:rPr>
+        <w:t>th</w:t>
+      </w:r>
+      <w:r>
+        <w:t xml:space="preserve"> April)</w:t>
+      </w:r>
+    </w:p>
+    <w:p>
+      <w:pPr>
+        <w:pStyle w:val="ListParagraph"/>
+        <w:numPr>
+          <w:ilvl w:val="0"/>
+          <w:numId w:val="6"/>
+        </w:numPr>
+      </w:pPr>
+      <w:r>
+        <w:t>Start drafting Preliminary Report</w:t>
+      </w:r>
+    </w:p>
+    <w:p>
+      <w:pPr>
+        <w:pStyle w:val="ListParagraph"/>
+        <w:numPr>
+          <w:ilvl w:val="0"/>
+          <w:numId w:val="6"/>
+        </w:numPr>
+      </w:pPr>
+      <w:r>
+        <w:t>Begin designing the</w:t>
+      </w:r>
+      <w:r>
+        <w:t xml:space="preserve"> base</w:t>
+      </w:r>
+      <w:r>
+        <w:t xml:space="preserve"> system architecture</w:t>
+      </w:r>
+    </w:p>
+    <w:p>
+      <w:pPr>
+        <w:pStyle w:val="Heading2"/>
+      </w:pPr>
       <w:r>
         <w:lastRenderedPageBreak/>
-        <w:t>Topic Background</w:t>
-      </w:r>
-    </w:p>
-    <w:p/>
+        <w:t>Sprint 3</w:t>
+      </w:r>
+      <w:r>
+        <w:t xml:space="preserve"> </w:t>
+      </w:r>
+      <w:r>
+        <w:t>(1</w:t>
+      </w:r>
+      <w:r>
+        <w:rPr>
+          <w:vertAlign w:val="superscript"/>
+        </w:rPr>
+        <w:t>st</w:t>
+      </w:r>
+      <w:r>
+        <w:t xml:space="preserve"> May – 2</w:t>
+      </w:r>
+      <w:r>
+        <w:rPr>
+          <w:vertAlign w:val="superscript"/>
+        </w:rPr>
+        <w:t>nd</w:t>
+      </w:r>
+      <w:r>
+        <w:t xml:space="preserve"> July)</w:t>
+      </w:r>
+    </w:p>
+    <w:p>
+      <w:pPr>
+        <w:pStyle w:val="ListParagraph"/>
+        <w:numPr>
+          <w:ilvl w:val="0"/>
+          <w:numId w:val="7"/>
+        </w:numPr>
+      </w:pPr>
+      <w:r>
+        <w:t>Prepare slides for 4th meeting (and apply feedback after the meeting)</w:t>
+      </w:r>
+    </w:p>
+    <w:p>
+      <w:pPr>
+        <w:pStyle w:val="ListParagraph"/>
+        <w:numPr>
+          <w:ilvl w:val="0"/>
+          <w:numId w:val="7"/>
+        </w:numPr>
+      </w:pPr>
+      <w:r>
+        <w:t>Prepare for 1st individual meeting</w:t>
+      </w:r>
+    </w:p>
+    <w:p>
+      <w:pPr>
+        <w:pStyle w:val="ListParagraph"/>
+        <w:numPr>
+          <w:ilvl w:val="0"/>
+          <w:numId w:val="7"/>
+        </w:numPr>
+      </w:pPr>
+      <w:r>
+        <w:t>Finish designing the base system architecture</w:t>
+      </w:r>
+    </w:p>
+    <w:p>
+      <w:pPr>
+        <w:pStyle w:val="ListParagraph"/>
+        <w:numPr>
+          <w:ilvl w:val="0"/>
+          <w:numId w:val="7"/>
+        </w:numPr>
+      </w:pPr>
+      <w:r>
+        <w:t>Produce the variant designs for each of the architectural constructs (off of the base system architecture</w:t>
+      </w:r>
+    </w:p>
+    <w:p>
+      <w:pPr>
+        <w:pStyle w:val="ListParagraph"/>
+        <w:numPr>
+          <w:ilvl w:val="0"/>
+          <w:numId w:val="7"/>
+        </w:numPr>
+      </w:pPr>
+      <w:r>
+        <w:t>Conduct Compositional Verification on variant designs and report findings</w:t>
+      </w:r>
+    </w:p>
+    <w:p>
+      <w:pPr>
+        <w:pStyle w:val="ListParagraph"/>
+        <w:numPr>
+          <w:ilvl w:val="0"/>
+          <w:numId w:val="7"/>
+        </w:numPr>
+      </w:pPr>
+      <w:r>
+        <w:t>Being drafting Final Project Report</w:t>
+      </w:r>
+    </w:p>
     <w:p>
       <w:pPr>
         <w:pStyle w:val="Heading2"/>
       </w:pPr>
       <w:r>
-        <w:t>Literature Review</w:t>
-      </w:r>
-    </w:p>
-    <w:p/>
-    <w:p>
-      <w:pPr>
-        <w:pStyle w:val="Heading2"/>
-      </w:pPr>
-      <w:r>
-        <w:t>Previous Work</w:t>
-      </w:r>
-    </w:p>
-    <w:p/>
-    <w:p>
-      <w:pPr>
-        <w:pStyle w:val="Heading2"/>
-      </w:pPr>
-      <w:r>
-        <w:t>Existing Approaches by Others</w:t>
-      </w:r>
-    </w:p>
-    <w:p>
-      <w:r>
-        <w:t>Site literature of people doing the same project</w:t>
-      </w:r>
-      <w:r>
-        <w:t xml:space="preserve"> and give constructive criticism</w:t>
+        <w:t>Sprint 4</w:t>
+      </w:r>
+      <w:r>
+        <w:t xml:space="preserve"> (3</w:t>
+      </w:r>
+      <w:r>
+        <w:rPr>
+          <w:vertAlign w:val="superscript"/>
+        </w:rPr>
+        <w:t>rd</w:t>
+      </w:r>
+      <w:r>
+        <w:t xml:space="preserve"> July – 6</w:t>
+      </w:r>
+      <w:r>
+        <w:rPr>
+          <w:vertAlign w:val="superscript"/>
+        </w:rPr>
+        <w:t>th</w:t>
+      </w:r>
+      <w:r>
+        <w:t xml:space="preserve"> August)</w:t>
+      </w:r>
+    </w:p>
+    <w:p>
+      <w:pPr>
+        <w:pStyle w:val="ListParagraph"/>
+        <w:numPr>
+          <w:ilvl w:val="0"/>
+          <w:numId w:val="8"/>
+        </w:numPr>
+      </w:pPr>
+      <w:r>
+        <w:t>Prepare for 2nd individual meeting</w:t>
+      </w:r>
+    </w:p>
+    <w:p>
+      <w:pPr>
+        <w:pStyle w:val="ListParagraph"/>
+        <w:numPr>
+          <w:ilvl w:val="0"/>
+          <w:numId w:val="8"/>
+        </w:numPr>
+      </w:pPr>
+      <w:r>
+        <w:t>Complete and submit Final Project Report</w:t>
+      </w:r>
+    </w:p>
+    <w:p>
+      <w:pPr>
+        <w:pStyle w:val="ListParagraph"/>
+        <w:numPr>
+          <w:ilvl w:val="0"/>
+          <w:numId w:val="8"/>
+        </w:numPr>
+      </w:pPr>
+      <w:r>
+        <w:t>Complete and submit Video Presentation</w:t>
       </w:r>
     </w:p>
     <w:p>
       <w:pPr>
         <w:pStyle w:val="Heading1"/>
       </w:pPr>
-      <w:bookmarkStart w:id="2" w:name="_Toc227001770"/>
-      <w:r>
-        <w:t>Project Schedule</w:t>
-      </w:r>
-      <w:bookmarkEnd w:id="2"/>
-    </w:p>
-    <w:p>
-      <w:pPr>
+      <w:bookmarkStart w:id="12" w:name="_Toc227463679"/>
+      <w:r>
+        <w:t>References</w:t>
+      </w:r>
+      <w:bookmarkEnd w:id="12"/>
+    </w:p>
+    <w:p>
+      <w:pPr>
+        <w:pStyle w:val="ListParagraph"/>
+        <w:numPr>
+          <w:ilvl w:val="0"/>
+          <w:numId w:val="2"/>
+        </w:numPr>
+      </w:pPr>
+      <w:r>
+        <w:t>[1]: Reuters, “US opens probe after a Waymo self-driving car hit child near a school”, Al Jazeera, January 29</w:t>
+      </w:r>
+      <w:r>
         <w:rPr>
-          <w:i/>
-          <w:iCs/>
+          <w:vertAlign w:val="superscript"/>
         </w:rPr>
-      </w:pPr>
+        <w:t>th</w:t>
+      </w:r>
+      <w:r>
+        <w:t xml:space="preserve">, 2026. [Online]. Available at: </w:t>
+      </w:r>
+      <w:hyperlink r:id="rId7" w:history="1">
+        <w:r>
+          <w:rPr>
+            <w:rStyle w:val="Hyperlink"/>
+          </w:rPr>
+          <w:t>https://www.aljazeera.com/economy/2026/1/29/us-opens-probe-after-a-waymo-self-driving-car-hit-a-child-near-a-school</w:t>
+        </w:r>
+      </w:hyperlink>
+      <w:r>
+        <w:t xml:space="preserve"> </w:t>
+      </w:r>
+    </w:p>
+    <w:p>
+      <w:pPr>
+        <w:pStyle w:val="ListParagraph"/>
+        <w:numPr>
+          <w:ilvl w:val="0"/>
+          <w:numId w:val="2"/>
+        </w:numPr>
+      </w:pPr>
+      <w:r>
+        <w:t>[2]:</w:t>
+      </w:r>
+      <w:r>
+        <w:t xml:space="preserve"> L. Burbano, D. Ortiz, Q. Sun, S. Yang, H. Tu, C. Xie, Y. Cao, A.A. Cardenas, “CHAI: Command Hijacking against embodied AI”,</w:t>
+      </w:r>
+      <w:r>
+        <w:t xml:space="preserve"> arXiv, September 30</w:t>
+      </w:r>
       <w:r>
         <w:rPr>
-          <w:i/>
-          <w:iCs/>
+          <w:vertAlign w:val="superscript"/>
         </w:rPr>
-        <w:t xml:space="preserve">This section must provide a </w:t>
+        <w:t>th</w:t>
+      </w:r>
+      <w:r>
+        <w:t xml:space="preserve">, 2025. [Online], p. 3. Available at: </w:t>
+      </w:r>
+      <w:hyperlink r:id="rId8" w:history="1">
+        <w:r>
+          <w:rPr>
+            <w:rStyle w:val="Hyperlink"/>
+          </w:rPr>
+          <w:t>https://arxiv.org/pdf/2510.00181</w:t>
+        </w:r>
+      </w:hyperlink>
+    </w:p>
+    <w:p>
+      <w:pPr>
+        <w:pStyle w:val="ListParagraph"/>
+        <w:numPr>
+          <w:ilvl w:val="0"/>
+          <w:numId w:val="2"/>
+        </w:numPr>
+      </w:pPr>
+      <w:r>
+        <w:t>[</w:t>
+      </w:r>
+      <w:r>
+        <w:t>3</w:t>
+      </w:r>
+      <w:r>
+        <w:t xml:space="preserve">]: </w:t>
+      </w:r>
+      <w:proofErr w:type="spellStart"/>
+      <w:r>
+        <w:t>RoadieRich</w:t>
+      </w:r>
+      <w:proofErr w:type="spellEnd"/>
+      <w:r>
+        <w:t>, “Speed camera SQL Injection”, Reddit, July 29</w:t>
       </w:r>
       <w:r>
         <w:rPr>
-          <w:b/>
-          <w:bCs/>
-          <w:i/>
-          <w:iCs/>
+          <w:vertAlign w:val="superscript"/>
         </w:rPr>
-        <w:t>detailed schedule</w:t>
-      </w:r>
-      <w:r>
-        <w:rPr>
-          <w:i/>
-          <w:iCs/>
-        </w:rPr>
-        <w:t xml:space="preserve"> of the project, depending on the project nature, including data acquisition, </w:t>
-      </w:r>
-      <w:r>
-        <w:rPr>
-          <w:b/>
-          <w:bCs/>
-          <w:i/>
-          <w:iCs/>
-        </w:rPr>
-        <w:t>implementation, analysis and evaluation</w:t>
-      </w:r>
-      <w:r>
-        <w:rPr>
-          <w:i/>
-          <w:iCs/>
-        </w:rPr>
-        <w:t xml:space="preserve">, </w:t>
-      </w:r>
-      <w:r>
-        <w:rPr>
-          <w:b/>
-          <w:bCs/>
-          <w:i/>
-          <w:iCs/>
-        </w:rPr>
-        <w:t>theory development</w:t>
-      </w:r>
-      <w:r>
-        <w:rPr>
-          <w:i/>
-          <w:iCs/>
-        </w:rPr>
-        <w:t xml:space="preserve">, </w:t>
-      </w:r>
-      <w:r>
-        <w:rPr>
-          <w:b/>
-          <w:bCs/>
-          <w:i/>
-          <w:iCs/>
-        </w:rPr>
-        <w:t>hardware design, curation and software development</w:t>
-      </w:r>
-      <w:r>
-        <w:rPr>
-          <w:i/>
-          <w:iCs/>
-        </w:rPr>
-        <w:t xml:space="preserve">. This might include a </w:t>
-      </w:r>
-      <w:r>
-        <w:rPr>
-          <w:b/>
-          <w:bCs/>
-          <w:i/>
-          <w:iCs/>
-        </w:rPr>
-        <w:t>Gantt chart</w:t>
-      </w:r>
-      <w:r>
-        <w:rPr>
-          <w:i/>
-          <w:iCs/>
-        </w:rPr>
-        <w:t xml:space="preserve"> or other visual representation -- something which CLEARLY illustrates the work plan covering the life of the project. You may discuss with your supervisor to come up with a feasible project plan.</w:t>
-      </w:r>
-    </w:p>
-    <w:p/>
+        <w:t>th</w:t>
+      </w:r>
+      <w:r>
+        <w:t xml:space="preserve">, 2013. [Online]. Available at: </w:t>
+      </w:r>
+      <w:hyperlink r:id="rId9" w:history="1">
+        <w:r>
+          <w:rPr>
+            <w:rStyle w:val="Hyperlink"/>
+          </w:rPr>
+          <w:t>https://www.reddit.com/r/geek/comments/1j9tn3/speed_camera_sql_injection/</w:t>
+        </w:r>
+      </w:hyperlink>
+      <w:r>
+        <w:t xml:space="preserve"> </w:t>
+      </w:r>
+    </w:p>
     <w:sectPr>
       <w:pgSz w:w="11906" w:h="16838"/>
       <w:pgMar w:top="1440" w:right="1440" w:bottom="1440" w:left="1440" w:header="708" w:footer="708" w:gutter="0"/>
@@ -876,6 +2292,119 @@
 <file path=word/numbering.xml><?xml version="1.0" encoding="utf-8"?>
 <w:numbering xmlns:wpc="http://schemas.microsoft.com/office/word/2010/wordprocessingCanvas" xmlns:cx="http://schemas.microsoft.com/office/drawing/2014/chartex" xmlns:cx1="http://schemas.microsoft.com/office/drawing/2015/9/8/chartex" xmlns:cx2="http://schemas.microsoft.com/office/drawing/2015/10/21/chartex" xmlns:cx3="http://schemas.microsoft.com/office/drawing/2016/5/9/chartex" xmlns:cx4="http://schemas.microsoft.com/office/drawing/2016/5/10/chartex" xmlns:cx5="http://schemas.microsoft.com/office/drawing/2016/5/11/chartex" xmlns:cx6="http://schemas.microsoft.com/office/drawing/2016/5/12/chartex" xmlns:cx7="http://schemas.microsoft.com/office/drawing/2016/5/13/chartex" xmlns:cx8="http://schemas.microsoft.com/office/drawing/2016/5/14/chartex" xmlns:mc="http://schemas.openxmlformats.org/markup-compatibility/2006" xmlns:aink="http://schemas.microsoft.com/office/drawing/2016/ink" xmlns:am3d="http://schemas.microsoft.com/office/drawing/2017/model3d" xmlns:o="urn:schemas-microsoft-com:office:office" xmlns:oel="http://schemas.microsoft.com/office/2019/extlst" xmlns:r="http://schemas.openxmlformats.org/officeDocument/2006/relationships" xmlns:m="http://schemas.openxmlformats.org/officeDocument/2006/math" xmlns:v="urn:schemas-microsoft-com:vml" xmlns:wp14="http://schemas.microsoft.com/office/word/2010/wordprocessingDrawing" xmlns:wp="http://schemas.openxmlformats.org/drawingml/2006/wordprocessingDrawing" xmlns:w10="urn:schemas-microsoft-com:office:word" xmlns:w="http://schemas.openxmlformats.org/wordprocessingml/2006/main" xmlns:w14="http://schemas.microsoft.com/office/word/2010/wordml" xmlns:w15="http://schemas.microsoft.com/office/word/2012/wordml" xmlns:w16cex="http://schemas.microsoft.com/office/word/2018/wordml/cex" xmlns:w16cid="http://schemas.microsoft.com/office/word/2016/wordml/cid" xmlns:w16="http://schemas.microsoft.com/office/word/2018/wordml" xmlns:w16du="http://schemas.microsoft.com/office/word/2023/wordml/word16du" xmlns:w16sdtdh="http://schemas.microsoft.com/office/word/2020/wordml/sdtdatahash" xmlns:w16sdtfl="http://schemas.microsoft.com/office/word/2024/wordml/sdtformatlock" xmlns:w16se="http://schemas.microsoft.com/office/word/2015/wordml/symex" xmlns:wpg="http://schemas.microsoft.com/office/word/2010/wordprocessingGroup" xmlns:wpi="http://schemas.microsoft.com/office/word/2010/wordprocessingInk" xmlns:wne="http://schemas.microsoft.com/office/word/2006/wordml" xmlns:wps="http://schemas.microsoft.com/office/word/2010/wordprocessingShape" mc:Ignorable="w14 w15 w16se w16cid w16 w16cex w16sdtdh w16sdtfl w16du wp14">
   <w:abstractNum w:abstractNumId="0" w15:restartNumberingAfterBreak="0">
+    <w:nsid w:val="10FC3F3C"/>
+    <w:multiLevelType w:val="hybridMultilevel"/>
+    <w:tmpl w:val="60AC0B8E"/>
+    <w:lvl w:ilvl="0" w:tplc="08090001">
+      <w:start w:val="1"/>
+      <w:numFmt w:val="bullet"/>
+      <w:lvlText w:val=""/>
+      <w:lvlJc w:val="left"/>
+      <w:pPr>
+        <w:ind w:left="720" w:hanging="360"/>
+      </w:pPr>
+      <w:rPr>
+        <w:rFonts w:ascii="Symbol" w:hAnsi="Symbol" w:hint="default"/>
+      </w:rPr>
+    </w:lvl>
+    <w:lvl w:ilvl="1" w:tplc="08090003" w:tentative="1">
+      <w:start w:val="1"/>
+      <w:numFmt w:val="bullet"/>
+      <w:lvlText w:val="o"/>
+      <w:lvlJc w:val="left"/>
+      <w:pPr>
+        <w:ind w:left="1440" w:hanging="360"/>
+      </w:pPr>
+      <w:rPr>
+        <w:rFonts w:ascii="Courier New" w:hAnsi="Courier New" w:cs="Courier New" w:hint="default"/>
+      </w:rPr>
+    </w:lvl>
+    <w:lvl w:ilvl="2" w:tplc="08090005" w:tentative="1">
+      <w:start w:val="1"/>
+      <w:numFmt w:val="bullet"/>
+      <w:lvlText w:val=""/>
+      <w:lvlJc w:val="left"/>
+      <w:pPr>
+        <w:ind w:left="2160" w:hanging="360"/>
+      </w:pPr>
+      <w:rPr>
+        <w:rFonts w:ascii="Wingdings" w:hAnsi="Wingdings" w:hint="default"/>
+      </w:rPr>
+    </w:lvl>
+    <w:lvl w:ilvl="3" w:tplc="08090001" w:tentative="1">
+      <w:start w:val="1"/>
+      <w:numFmt w:val="bullet"/>
+      <w:lvlText w:val=""/>
+      <w:lvlJc w:val="left"/>
+      <w:pPr>
+        <w:ind w:left="2880" w:hanging="360"/>
+      </w:pPr>
+      <w:rPr>
+        <w:rFonts w:ascii="Symbol" w:hAnsi="Symbol" w:hint="default"/>
+      </w:rPr>
+    </w:lvl>
+    <w:lvl w:ilvl="4" w:tplc="08090003" w:tentative="1">
+      <w:start w:val="1"/>
+      <w:numFmt w:val="bullet"/>
+      <w:lvlText w:val="o"/>
+      <w:lvlJc w:val="left"/>
+      <w:pPr>
+        <w:ind w:left="3600" w:hanging="360"/>
+      </w:pPr>
+      <w:rPr>
+        <w:rFonts w:ascii="Courier New" w:hAnsi="Courier New" w:cs="Courier New" w:hint="default"/>
+      </w:rPr>
+    </w:lvl>
+    <w:lvl w:ilvl="5" w:tplc="08090005" w:tentative="1">
+      <w:start w:val="1"/>
+      <w:numFmt w:val="bullet"/>
+      <w:lvlText w:val=""/>
+      <w:lvlJc w:val="left"/>
+      <w:pPr>
+        <w:ind w:left="4320" w:hanging="360"/>
+      </w:pPr>
+      <w:rPr>
+        <w:rFonts w:ascii="Wingdings" w:hAnsi="Wingdings" w:hint="default"/>
+      </w:rPr>
+    </w:lvl>
+    <w:lvl w:ilvl="6" w:tplc="08090001" w:tentative="1">
+      <w:start w:val="1"/>
+      <w:numFmt w:val="bullet"/>
+      <w:lvlText w:val=""/>
+      <w:lvlJc w:val="left"/>
+      <w:pPr>
+        <w:ind w:left="5040" w:hanging="360"/>
+      </w:pPr>
+      <w:rPr>
+        <w:rFonts w:ascii="Symbol" w:hAnsi="Symbol" w:hint="default"/>
+      </w:rPr>
+    </w:lvl>
+    <w:lvl w:ilvl="7" w:tplc="08090003" w:tentative="1">
+      <w:start w:val="1"/>
+      <w:numFmt w:val="bullet"/>
+      <w:lvlText w:val="o"/>
+      <w:lvlJc w:val="left"/>
+      <w:pPr>
+        <w:ind w:left="5760" w:hanging="360"/>
+      </w:pPr>
+      <w:rPr>
+        <w:rFonts w:ascii="Courier New" w:hAnsi="Courier New" w:cs="Courier New" w:hint="default"/>
+      </w:rPr>
+    </w:lvl>
+    <w:lvl w:ilvl="8" w:tplc="08090005" w:tentative="1">
+      <w:start w:val="1"/>
+      <w:numFmt w:val="bullet"/>
+      <w:lvlText w:val=""/>
+      <w:lvlJc w:val="left"/>
+      <w:pPr>
+        <w:ind w:left="6480" w:hanging="360"/>
+      </w:pPr>
+      <w:rPr>
+        <w:rFonts w:ascii="Wingdings" w:hAnsi="Wingdings" w:hint="default"/>
+      </w:rPr>
+    </w:lvl>
+  </w:abstractNum>
+  <w:abstractNum w:abstractNumId="1" w15:restartNumberingAfterBreak="0">
     <w:nsid w:val="18605545"/>
     <w:multiLevelType w:val="hybridMultilevel"/>
     <w:tmpl w:val="E3CA5968"/>
@@ -1015,8 +2544,761 @@
       </w:rPr>
     </w:lvl>
   </w:abstractNum>
+  <w:abstractNum w:abstractNumId="2" w15:restartNumberingAfterBreak="0">
+    <w:nsid w:val="3E7961C2"/>
+    <w:multiLevelType w:val="hybridMultilevel"/>
+    <w:tmpl w:val="2548AC8C"/>
+    <w:lvl w:ilvl="0" w:tplc="2C2AC426">
+      <w:start w:val="1"/>
+      <w:numFmt w:val="bullet"/>
+      <w:lvlText w:val="•"/>
+      <w:lvlJc w:val="left"/>
+      <w:pPr>
+        <w:tabs>
+          <w:tab w:val="num" w:pos="720"/>
+        </w:tabs>
+        <w:ind w:left="720" w:hanging="360"/>
+      </w:pPr>
+      <w:rPr>
+        <w:rFonts w:ascii="Arial" w:hAnsi="Arial" w:hint="default"/>
+      </w:rPr>
+    </w:lvl>
+    <w:lvl w:ilvl="1" w:tplc="A15CBF0C" w:tentative="1">
+      <w:start w:val="1"/>
+      <w:numFmt w:val="bullet"/>
+      <w:lvlText w:val="•"/>
+      <w:lvlJc w:val="left"/>
+      <w:pPr>
+        <w:tabs>
+          <w:tab w:val="num" w:pos="1440"/>
+        </w:tabs>
+        <w:ind w:left="1440" w:hanging="360"/>
+      </w:pPr>
+      <w:rPr>
+        <w:rFonts w:ascii="Arial" w:hAnsi="Arial" w:hint="default"/>
+      </w:rPr>
+    </w:lvl>
+    <w:lvl w:ilvl="2" w:tplc="A204DB74" w:tentative="1">
+      <w:start w:val="1"/>
+      <w:numFmt w:val="bullet"/>
+      <w:lvlText w:val="•"/>
+      <w:lvlJc w:val="left"/>
+      <w:pPr>
+        <w:tabs>
+          <w:tab w:val="num" w:pos="2160"/>
+        </w:tabs>
+        <w:ind w:left="2160" w:hanging="360"/>
+      </w:pPr>
+      <w:rPr>
+        <w:rFonts w:ascii="Arial" w:hAnsi="Arial" w:hint="default"/>
+      </w:rPr>
+    </w:lvl>
+    <w:lvl w:ilvl="3" w:tplc="816EC112" w:tentative="1">
+      <w:start w:val="1"/>
+      <w:numFmt w:val="bullet"/>
+      <w:lvlText w:val="•"/>
+      <w:lvlJc w:val="left"/>
+      <w:pPr>
+        <w:tabs>
+          <w:tab w:val="num" w:pos="2880"/>
+        </w:tabs>
+        <w:ind w:left="2880" w:hanging="360"/>
+      </w:pPr>
+      <w:rPr>
+        <w:rFonts w:ascii="Arial" w:hAnsi="Arial" w:hint="default"/>
+      </w:rPr>
+    </w:lvl>
+    <w:lvl w:ilvl="4" w:tplc="6380A10E" w:tentative="1">
+      <w:start w:val="1"/>
+      <w:numFmt w:val="bullet"/>
+      <w:lvlText w:val="•"/>
+      <w:lvlJc w:val="left"/>
+      <w:pPr>
+        <w:tabs>
+          <w:tab w:val="num" w:pos="3600"/>
+        </w:tabs>
+        <w:ind w:left="3600" w:hanging="360"/>
+      </w:pPr>
+      <w:rPr>
+        <w:rFonts w:ascii="Arial" w:hAnsi="Arial" w:hint="default"/>
+      </w:rPr>
+    </w:lvl>
+    <w:lvl w:ilvl="5" w:tplc="1E18FB8A" w:tentative="1">
+      <w:start w:val="1"/>
+      <w:numFmt w:val="bullet"/>
+      <w:lvlText w:val="•"/>
+      <w:lvlJc w:val="left"/>
+      <w:pPr>
+        <w:tabs>
+          <w:tab w:val="num" w:pos="4320"/>
+        </w:tabs>
+        <w:ind w:left="4320" w:hanging="360"/>
+      </w:pPr>
+      <w:rPr>
+        <w:rFonts w:ascii="Arial" w:hAnsi="Arial" w:hint="default"/>
+      </w:rPr>
+    </w:lvl>
+    <w:lvl w:ilvl="6" w:tplc="8B10778E" w:tentative="1">
+      <w:start w:val="1"/>
+      <w:numFmt w:val="bullet"/>
+      <w:lvlText w:val="•"/>
+      <w:lvlJc w:val="left"/>
+      <w:pPr>
+        <w:tabs>
+          <w:tab w:val="num" w:pos="5040"/>
+        </w:tabs>
+        <w:ind w:left="5040" w:hanging="360"/>
+      </w:pPr>
+      <w:rPr>
+        <w:rFonts w:ascii="Arial" w:hAnsi="Arial" w:hint="default"/>
+      </w:rPr>
+    </w:lvl>
+    <w:lvl w:ilvl="7" w:tplc="F8FC9CCE" w:tentative="1">
+      <w:start w:val="1"/>
+      <w:numFmt w:val="bullet"/>
+      <w:lvlText w:val="•"/>
+      <w:lvlJc w:val="left"/>
+      <w:pPr>
+        <w:tabs>
+          <w:tab w:val="num" w:pos="5760"/>
+        </w:tabs>
+        <w:ind w:left="5760" w:hanging="360"/>
+      </w:pPr>
+      <w:rPr>
+        <w:rFonts w:ascii="Arial" w:hAnsi="Arial" w:hint="default"/>
+      </w:rPr>
+    </w:lvl>
+    <w:lvl w:ilvl="8" w:tplc="F40622E2" w:tentative="1">
+      <w:start w:val="1"/>
+      <w:numFmt w:val="bullet"/>
+      <w:lvlText w:val="•"/>
+      <w:lvlJc w:val="left"/>
+      <w:pPr>
+        <w:tabs>
+          <w:tab w:val="num" w:pos="6480"/>
+        </w:tabs>
+        <w:ind w:left="6480" w:hanging="360"/>
+      </w:pPr>
+      <w:rPr>
+        <w:rFonts w:ascii="Arial" w:hAnsi="Arial" w:hint="default"/>
+      </w:rPr>
+    </w:lvl>
+  </w:abstractNum>
+  <w:abstractNum w:abstractNumId="3" w15:restartNumberingAfterBreak="0">
+    <w:nsid w:val="4282266E"/>
+    <w:multiLevelType w:val="hybridMultilevel"/>
+    <w:tmpl w:val="F5FC6E10"/>
+    <w:lvl w:ilvl="0" w:tplc="08090001">
+      <w:start w:val="1"/>
+      <w:numFmt w:val="bullet"/>
+      <w:lvlText w:val=""/>
+      <w:lvlJc w:val="left"/>
+      <w:pPr>
+        <w:ind w:left="720" w:hanging="360"/>
+      </w:pPr>
+      <w:rPr>
+        <w:rFonts w:ascii="Symbol" w:hAnsi="Symbol" w:hint="default"/>
+      </w:rPr>
+    </w:lvl>
+    <w:lvl w:ilvl="1" w:tplc="08090003">
+      <w:start w:val="1"/>
+      <w:numFmt w:val="bullet"/>
+      <w:lvlText w:val="o"/>
+      <w:lvlJc w:val="left"/>
+      <w:pPr>
+        <w:ind w:left="1440" w:hanging="360"/>
+      </w:pPr>
+      <w:rPr>
+        <w:rFonts w:ascii="Courier New" w:hAnsi="Courier New" w:cs="Courier New" w:hint="default"/>
+      </w:rPr>
+    </w:lvl>
+    <w:lvl w:ilvl="2" w:tplc="08090005" w:tentative="1">
+      <w:start w:val="1"/>
+      <w:numFmt w:val="bullet"/>
+      <w:lvlText w:val=""/>
+      <w:lvlJc w:val="left"/>
+      <w:pPr>
+        <w:ind w:left="2160" w:hanging="360"/>
+      </w:pPr>
+      <w:rPr>
+        <w:rFonts w:ascii="Wingdings" w:hAnsi="Wingdings" w:hint="default"/>
+      </w:rPr>
+    </w:lvl>
+    <w:lvl w:ilvl="3" w:tplc="08090001" w:tentative="1">
+      <w:start w:val="1"/>
+      <w:numFmt w:val="bullet"/>
+      <w:lvlText w:val=""/>
+      <w:lvlJc w:val="left"/>
+      <w:pPr>
+        <w:ind w:left="2880" w:hanging="360"/>
+      </w:pPr>
+      <w:rPr>
+        <w:rFonts w:ascii="Symbol" w:hAnsi="Symbol" w:hint="default"/>
+      </w:rPr>
+    </w:lvl>
+    <w:lvl w:ilvl="4" w:tplc="08090003" w:tentative="1">
+      <w:start w:val="1"/>
+      <w:numFmt w:val="bullet"/>
+      <w:lvlText w:val="o"/>
+      <w:lvlJc w:val="left"/>
+      <w:pPr>
+        <w:ind w:left="3600" w:hanging="360"/>
+      </w:pPr>
+      <w:rPr>
+        <w:rFonts w:ascii="Courier New" w:hAnsi="Courier New" w:cs="Courier New" w:hint="default"/>
+      </w:rPr>
+    </w:lvl>
+    <w:lvl w:ilvl="5" w:tplc="08090005" w:tentative="1">
+      <w:start w:val="1"/>
+      <w:numFmt w:val="bullet"/>
+      <w:lvlText w:val=""/>
+      <w:lvlJc w:val="left"/>
+      <w:pPr>
+        <w:ind w:left="4320" w:hanging="360"/>
+      </w:pPr>
+      <w:rPr>
+        <w:rFonts w:ascii="Wingdings" w:hAnsi="Wingdings" w:hint="default"/>
+      </w:rPr>
+    </w:lvl>
+    <w:lvl w:ilvl="6" w:tplc="08090001" w:tentative="1">
+      <w:start w:val="1"/>
+      <w:numFmt w:val="bullet"/>
+      <w:lvlText w:val=""/>
+      <w:lvlJc w:val="left"/>
+      <w:pPr>
+        <w:ind w:left="5040" w:hanging="360"/>
+      </w:pPr>
+      <w:rPr>
+        <w:rFonts w:ascii="Symbol" w:hAnsi="Symbol" w:hint="default"/>
+      </w:rPr>
+    </w:lvl>
+    <w:lvl w:ilvl="7" w:tplc="08090003" w:tentative="1">
+      <w:start w:val="1"/>
+      <w:numFmt w:val="bullet"/>
+      <w:lvlText w:val="o"/>
+      <w:lvlJc w:val="left"/>
+      <w:pPr>
+        <w:ind w:left="5760" w:hanging="360"/>
+      </w:pPr>
+      <w:rPr>
+        <w:rFonts w:ascii="Courier New" w:hAnsi="Courier New" w:cs="Courier New" w:hint="default"/>
+      </w:rPr>
+    </w:lvl>
+    <w:lvl w:ilvl="8" w:tplc="08090005" w:tentative="1">
+      <w:start w:val="1"/>
+      <w:numFmt w:val="bullet"/>
+      <w:lvlText w:val=""/>
+      <w:lvlJc w:val="left"/>
+      <w:pPr>
+        <w:ind w:left="6480" w:hanging="360"/>
+      </w:pPr>
+      <w:rPr>
+        <w:rFonts w:ascii="Wingdings" w:hAnsi="Wingdings" w:hint="default"/>
+      </w:rPr>
+    </w:lvl>
+  </w:abstractNum>
+  <w:abstractNum w:abstractNumId="4" w15:restartNumberingAfterBreak="0">
+    <w:nsid w:val="51672335"/>
+    <w:multiLevelType w:val="hybridMultilevel"/>
+    <w:tmpl w:val="AA121B74"/>
+    <w:lvl w:ilvl="0" w:tplc="08090001">
+      <w:start w:val="1"/>
+      <w:numFmt w:val="bullet"/>
+      <w:lvlText w:val=""/>
+      <w:lvlJc w:val="left"/>
+      <w:pPr>
+        <w:ind w:left="720" w:hanging="360"/>
+      </w:pPr>
+      <w:rPr>
+        <w:rFonts w:ascii="Symbol" w:hAnsi="Symbol" w:hint="default"/>
+      </w:rPr>
+    </w:lvl>
+    <w:lvl w:ilvl="1" w:tplc="08090003" w:tentative="1">
+      <w:start w:val="1"/>
+      <w:numFmt w:val="bullet"/>
+      <w:lvlText w:val="o"/>
+      <w:lvlJc w:val="left"/>
+      <w:pPr>
+        <w:ind w:left="1440" w:hanging="360"/>
+      </w:pPr>
+      <w:rPr>
+        <w:rFonts w:ascii="Courier New" w:hAnsi="Courier New" w:cs="Courier New" w:hint="default"/>
+      </w:rPr>
+    </w:lvl>
+    <w:lvl w:ilvl="2" w:tplc="08090005" w:tentative="1">
+      <w:start w:val="1"/>
+      <w:numFmt w:val="bullet"/>
+      <w:lvlText w:val=""/>
+      <w:lvlJc w:val="left"/>
+      <w:pPr>
+        <w:ind w:left="2160" w:hanging="360"/>
+      </w:pPr>
+      <w:rPr>
+        <w:rFonts w:ascii="Wingdings" w:hAnsi="Wingdings" w:hint="default"/>
+      </w:rPr>
+    </w:lvl>
+    <w:lvl w:ilvl="3" w:tplc="08090001" w:tentative="1">
+      <w:start w:val="1"/>
+      <w:numFmt w:val="bullet"/>
+      <w:lvlText w:val=""/>
+      <w:lvlJc w:val="left"/>
+      <w:pPr>
+        <w:ind w:left="2880" w:hanging="360"/>
+      </w:pPr>
+      <w:rPr>
+        <w:rFonts w:ascii="Symbol" w:hAnsi="Symbol" w:hint="default"/>
+      </w:rPr>
+    </w:lvl>
+    <w:lvl w:ilvl="4" w:tplc="08090003" w:tentative="1">
+      <w:start w:val="1"/>
+      <w:numFmt w:val="bullet"/>
+      <w:lvlText w:val="o"/>
+      <w:lvlJc w:val="left"/>
+      <w:pPr>
+        <w:ind w:left="3600" w:hanging="360"/>
+      </w:pPr>
+      <w:rPr>
+        <w:rFonts w:ascii="Courier New" w:hAnsi="Courier New" w:cs="Courier New" w:hint="default"/>
+      </w:rPr>
+    </w:lvl>
+    <w:lvl w:ilvl="5" w:tplc="08090005" w:tentative="1">
+      <w:start w:val="1"/>
+      <w:numFmt w:val="bullet"/>
+      <w:lvlText w:val=""/>
+      <w:lvlJc w:val="left"/>
+      <w:pPr>
+        <w:ind w:left="4320" w:hanging="360"/>
+      </w:pPr>
+      <w:rPr>
+        <w:rFonts w:ascii="Wingdings" w:hAnsi="Wingdings" w:hint="default"/>
+      </w:rPr>
+    </w:lvl>
+    <w:lvl w:ilvl="6" w:tplc="08090001" w:tentative="1">
+      <w:start w:val="1"/>
+      <w:numFmt w:val="bullet"/>
+      <w:lvlText w:val=""/>
+      <w:lvlJc w:val="left"/>
+      <w:pPr>
+        <w:ind w:left="5040" w:hanging="360"/>
+      </w:pPr>
+      <w:rPr>
+        <w:rFonts w:ascii="Symbol" w:hAnsi="Symbol" w:hint="default"/>
+      </w:rPr>
+    </w:lvl>
+    <w:lvl w:ilvl="7" w:tplc="08090003" w:tentative="1">
+      <w:start w:val="1"/>
+      <w:numFmt w:val="bullet"/>
+      <w:lvlText w:val="o"/>
+      <w:lvlJc w:val="left"/>
+      <w:pPr>
+        <w:ind w:left="5760" w:hanging="360"/>
+      </w:pPr>
+      <w:rPr>
+        <w:rFonts w:ascii="Courier New" w:hAnsi="Courier New" w:cs="Courier New" w:hint="default"/>
+      </w:rPr>
+    </w:lvl>
+    <w:lvl w:ilvl="8" w:tplc="08090005" w:tentative="1">
+      <w:start w:val="1"/>
+      <w:numFmt w:val="bullet"/>
+      <w:lvlText w:val=""/>
+      <w:lvlJc w:val="left"/>
+      <w:pPr>
+        <w:ind w:left="6480" w:hanging="360"/>
+      </w:pPr>
+      <w:rPr>
+        <w:rFonts w:ascii="Wingdings" w:hAnsi="Wingdings" w:hint="default"/>
+      </w:rPr>
+    </w:lvl>
+  </w:abstractNum>
+  <w:abstractNum w:abstractNumId="5" w15:restartNumberingAfterBreak="0">
+    <w:nsid w:val="5EC32EA0"/>
+    <w:multiLevelType w:val="hybridMultilevel"/>
+    <w:tmpl w:val="D7BCED08"/>
+    <w:lvl w:ilvl="0" w:tplc="08090001">
+      <w:start w:val="1"/>
+      <w:numFmt w:val="bullet"/>
+      <w:lvlText w:val=""/>
+      <w:lvlJc w:val="left"/>
+      <w:pPr>
+        <w:ind w:left="720" w:hanging="360"/>
+      </w:pPr>
+      <w:rPr>
+        <w:rFonts w:ascii="Symbol" w:hAnsi="Symbol" w:hint="default"/>
+      </w:rPr>
+    </w:lvl>
+    <w:lvl w:ilvl="1" w:tplc="08090003" w:tentative="1">
+      <w:start w:val="1"/>
+      <w:numFmt w:val="bullet"/>
+      <w:lvlText w:val="o"/>
+      <w:lvlJc w:val="left"/>
+      <w:pPr>
+        <w:ind w:left="1440" w:hanging="360"/>
+      </w:pPr>
+      <w:rPr>
+        <w:rFonts w:ascii="Courier New" w:hAnsi="Courier New" w:cs="Courier New" w:hint="default"/>
+      </w:rPr>
+    </w:lvl>
+    <w:lvl w:ilvl="2" w:tplc="08090005" w:tentative="1">
+      <w:start w:val="1"/>
+      <w:numFmt w:val="bullet"/>
+      <w:lvlText w:val=""/>
+      <w:lvlJc w:val="left"/>
+      <w:pPr>
+        <w:ind w:left="2160" w:hanging="360"/>
+      </w:pPr>
+      <w:rPr>
+        <w:rFonts w:ascii="Wingdings" w:hAnsi="Wingdings" w:hint="default"/>
+      </w:rPr>
+    </w:lvl>
+    <w:lvl w:ilvl="3" w:tplc="08090001" w:tentative="1">
+      <w:start w:val="1"/>
+      <w:numFmt w:val="bullet"/>
+      <w:lvlText w:val=""/>
+      <w:lvlJc w:val="left"/>
+      <w:pPr>
+        <w:ind w:left="2880" w:hanging="360"/>
+      </w:pPr>
+      <w:rPr>
+        <w:rFonts w:ascii="Symbol" w:hAnsi="Symbol" w:hint="default"/>
+      </w:rPr>
+    </w:lvl>
+    <w:lvl w:ilvl="4" w:tplc="08090003" w:tentative="1">
+      <w:start w:val="1"/>
+      <w:numFmt w:val="bullet"/>
+      <w:lvlText w:val="o"/>
+      <w:lvlJc w:val="left"/>
+      <w:pPr>
+        <w:ind w:left="3600" w:hanging="360"/>
+      </w:pPr>
+      <w:rPr>
+        <w:rFonts w:ascii="Courier New" w:hAnsi="Courier New" w:cs="Courier New" w:hint="default"/>
+      </w:rPr>
+    </w:lvl>
+    <w:lvl w:ilvl="5" w:tplc="08090005" w:tentative="1">
+      <w:start w:val="1"/>
+      <w:numFmt w:val="bullet"/>
+      <w:lvlText w:val=""/>
+      <w:lvlJc w:val="left"/>
+      <w:pPr>
+        <w:ind w:left="4320" w:hanging="360"/>
+      </w:pPr>
+      <w:rPr>
+        <w:rFonts w:ascii="Wingdings" w:hAnsi="Wingdings" w:hint="default"/>
+      </w:rPr>
+    </w:lvl>
+    <w:lvl w:ilvl="6" w:tplc="08090001" w:tentative="1">
+      <w:start w:val="1"/>
+      <w:numFmt w:val="bullet"/>
+      <w:lvlText w:val=""/>
+      <w:lvlJc w:val="left"/>
+      <w:pPr>
+        <w:ind w:left="5040" w:hanging="360"/>
+      </w:pPr>
+      <w:rPr>
+        <w:rFonts w:ascii="Symbol" w:hAnsi="Symbol" w:hint="default"/>
+      </w:rPr>
+    </w:lvl>
+    <w:lvl w:ilvl="7" w:tplc="08090003" w:tentative="1">
+      <w:start w:val="1"/>
+      <w:numFmt w:val="bullet"/>
+      <w:lvlText w:val="o"/>
+      <w:lvlJc w:val="left"/>
+      <w:pPr>
+        <w:ind w:left="5760" w:hanging="360"/>
+      </w:pPr>
+      <w:rPr>
+        <w:rFonts w:ascii="Courier New" w:hAnsi="Courier New" w:cs="Courier New" w:hint="default"/>
+      </w:rPr>
+    </w:lvl>
+    <w:lvl w:ilvl="8" w:tplc="08090005" w:tentative="1">
+      <w:start w:val="1"/>
+      <w:numFmt w:val="bullet"/>
+      <w:lvlText w:val=""/>
+      <w:lvlJc w:val="left"/>
+      <w:pPr>
+        <w:ind w:left="6480" w:hanging="360"/>
+      </w:pPr>
+      <w:rPr>
+        <w:rFonts w:ascii="Wingdings" w:hAnsi="Wingdings" w:hint="default"/>
+      </w:rPr>
+    </w:lvl>
+  </w:abstractNum>
+  <w:abstractNum w:abstractNumId="6" w15:restartNumberingAfterBreak="0">
+    <w:nsid w:val="6288527D"/>
+    <w:multiLevelType w:val="hybridMultilevel"/>
+    <w:tmpl w:val="9E3030CA"/>
+    <w:lvl w:ilvl="0" w:tplc="0DDC0740">
+      <w:start w:val="1"/>
+      <w:numFmt w:val="bullet"/>
+      <w:lvlText w:val="•"/>
+      <w:lvlJc w:val="left"/>
+      <w:pPr>
+        <w:tabs>
+          <w:tab w:val="num" w:pos="720"/>
+        </w:tabs>
+        <w:ind w:left="720" w:hanging="360"/>
+      </w:pPr>
+      <w:rPr>
+        <w:rFonts w:ascii="Arial" w:hAnsi="Arial" w:hint="default"/>
+      </w:rPr>
+    </w:lvl>
+    <w:lvl w:ilvl="1" w:tplc="6C2E9508">
+      <w:start w:val="1"/>
+      <w:numFmt w:val="bullet"/>
+      <w:lvlText w:val="•"/>
+      <w:lvlJc w:val="left"/>
+      <w:pPr>
+        <w:tabs>
+          <w:tab w:val="num" w:pos="1440"/>
+        </w:tabs>
+        <w:ind w:left="1440" w:hanging="360"/>
+      </w:pPr>
+      <w:rPr>
+        <w:rFonts w:ascii="Arial" w:hAnsi="Arial" w:hint="default"/>
+      </w:rPr>
+    </w:lvl>
+    <w:lvl w:ilvl="2" w:tplc="E13C39B2" w:tentative="1">
+      <w:start w:val="1"/>
+      <w:numFmt w:val="bullet"/>
+      <w:lvlText w:val="•"/>
+      <w:lvlJc w:val="left"/>
+      <w:pPr>
+        <w:tabs>
+          <w:tab w:val="num" w:pos="2160"/>
+        </w:tabs>
+        <w:ind w:left="2160" w:hanging="360"/>
+      </w:pPr>
+      <w:rPr>
+        <w:rFonts w:ascii="Arial" w:hAnsi="Arial" w:hint="default"/>
+      </w:rPr>
+    </w:lvl>
+    <w:lvl w:ilvl="3" w:tplc="BD2A696E" w:tentative="1">
+      <w:start w:val="1"/>
+      <w:numFmt w:val="bullet"/>
+      <w:lvlText w:val="•"/>
+      <w:lvlJc w:val="left"/>
+      <w:pPr>
+        <w:tabs>
+          <w:tab w:val="num" w:pos="2880"/>
+        </w:tabs>
+        <w:ind w:left="2880" w:hanging="360"/>
+      </w:pPr>
+      <w:rPr>
+        <w:rFonts w:ascii="Arial" w:hAnsi="Arial" w:hint="default"/>
+      </w:rPr>
+    </w:lvl>
+    <w:lvl w:ilvl="4" w:tplc="189C8C62" w:tentative="1">
+      <w:start w:val="1"/>
+      <w:numFmt w:val="bullet"/>
+      <w:lvlText w:val="•"/>
+      <w:lvlJc w:val="left"/>
+      <w:pPr>
+        <w:tabs>
+          <w:tab w:val="num" w:pos="3600"/>
+        </w:tabs>
+        <w:ind w:left="3600" w:hanging="360"/>
+      </w:pPr>
+      <w:rPr>
+        <w:rFonts w:ascii="Arial" w:hAnsi="Arial" w:hint="default"/>
+      </w:rPr>
+    </w:lvl>
+    <w:lvl w:ilvl="5" w:tplc="04EC1D10" w:tentative="1">
+      <w:start w:val="1"/>
+      <w:numFmt w:val="bullet"/>
+      <w:lvlText w:val="•"/>
+      <w:lvlJc w:val="left"/>
+      <w:pPr>
+        <w:tabs>
+          <w:tab w:val="num" w:pos="4320"/>
+        </w:tabs>
+        <w:ind w:left="4320" w:hanging="360"/>
+      </w:pPr>
+      <w:rPr>
+        <w:rFonts w:ascii="Arial" w:hAnsi="Arial" w:hint="default"/>
+      </w:rPr>
+    </w:lvl>
+    <w:lvl w:ilvl="6" w:tplc="3214A55C" w:tentative="1">
+      <w:start w:val="1"/>
+      <w:numFmt w:val="bullet"/>
+      <w:lvlText w:val="•"/>
+      <w:lvlJc w:val="left"/>
+      <w:pPr>
+        <w:tabs>
+          <w:tab w:val="num" w:pos="5040"/>
+        </w:tabs>
+        <w:ind w:left="5040" w:hanging="360"/>
+      </w:pPr>
+      <w:rPr>
+        <w:rFonts w:ascii="Arial" w:hAnsi="Arial" w:hint="default"/>
+      </w:rPr>
+    </w:lvl>
+    <w:lvl w:ilvl="7" w:tplc="43129140" w:tentative="1">
+      <w:start w:val="1"/>
+      <w:numFmt w:val="bullet"/>
+      <w:lvlText w:val="•"/>
+      <w:lvlJc w:val="left"/>
+      <w:pPr>
+        <w:tabs>
+          <w:tab w:val="num" w:pos="5760"/>
+        </w:tabs>
+        <w:ind w:left="5760" w:hanging="360"/>
+      </w:pPr>
+      <w:rPr>
+        <w:rFonts w:ascii="Arial" w:hAnsi="Arial" w:hint="default"/>
+      </w:rPr>
+    </w:lvl>
+    <w:lvl w:ilvl="8" w:tplc="C9C899B4" w:tentative="1">
+      <w:start w:val="1"/>
+      <w:numFmt w:val="bullet"/>
+      <w:lvlText w:val="•"/>
+      <w:lvlJc w:val="left"/>
+      <w:pPr>
+        <w:tabs>
+          <w:tab w:val="num" w:pos="6480"/>
+        </w:tabs>
+        <w:ind w:left="6480" w:hanging="360"/>
+      </w:pPr>
+      <w:rPr>
+        <w:rFonts w:ascii="Arial" w:hAnsi="Arial" w:hint="default"/>
+      </w:rPr>
+    </w:lvl>
+  </w:abstractNum>
+  <w:abstractNum w:abstractNumId="7" w15:restartNumberingAfterBreak="0">
+    <w:nsid w:val="63050DB1"/>
+    <w:multiLevelType w:val="hybridMultilevel"/>
+    <w:tmpl w:val="CBC4A8BE"/>
+    <w:lvl w:ilvl="0" w:tplc="08090001">
+      <w:start w:val="1"/>
+      <w:numFmt w:val="bullet"/>
+      <w:lvlText w:val=""/>
+      <w:lvlJc w:val="left"/>
+      <w:pPr>
+        <w:ind w:left="720" w:hanging="360"/>
+      </w:pPr>
+      <w:rPr>
+        <w:rFonts w:ascii="Symbol" w:hAnsi="Symbol" w:hint="default"/>
+      </w:rPr>
+    </w:lvl>
+    <w:lvl w:ilvl="1" w:tplc="08090003" w:tentative="1">
+      <w:start w:val="1"/>
+      <w:numFmt w:val="bullet"/>
+      <w:lvlText w:val="o"/>
+      <w:lvlJc w:val="left"/>
+      <w:pPr>
+        <w:ind w:left="1440" w:hanging="360"/>
+      </w:pPr>
+      <w:rPr>
+        <w:rFonts w:ascii="Courier New" w:hAnsi="Courier New" w:cs="Courier New" w:hint="default"/>
+      </w:rPr>
+    </w:lvl>
+    <w:lvl w:ilvl="2" w:tplc="08090005" w:tentative="1">
+      <w:start w:val="1"/>
+      <w:numFmt w:val="bullet"/>
+      <w:lvlText w:val=""/>
+      <w:lvlJc w:val="left"/>
+      <w:pPr>
+        <w:ind w:left="2160" w:hanging="360"/>
+      </w:pPr>
+      <w:rPr>
+        <w:rFonts w:ascii="Wingdings" w:hAnsi="Wingdings" w:hint="default"/>
+      </w:rPr>
+    </w:lvl>
+    <w:lvl w:ilvl="3" w:tplc="08090001" w:tentative="1">
+      <w:start w:val="1"/>
+      <w:numFmt w:val="bullet"/>
+      <w:lvlText w:val=""/>
+      <w:lvlJc w:val="left"/>
+      <w:pPr>
+        <w:ind w:left="2880" w:hanging="360"/>
+      </w:pPr>
+      <w:rPr>
+        <w:rFonts w:ascii="Symbol" w:hAnsi="Symbol" w:hint="default"/>
+      </w:rPr>
+    </w:lvl>
+    <w:lvl w:ilvl="4" w:tplc="08090003" w:tentative="1">
+      <w:start w:val="1"/>
+      <w:numFmt w:val="bullet"/>
+      <w:lvlText w:val="o"/>
+      <w:lvlJc w:val="left"/>
+      <w:pPr>
+        <w:ind w:left="3600" w:hanging="360"/>
+      </w:pPr>
+      <w:rPr>
+        <w:rFonts w:ascii="Courier New" w:hAnsi="Courier New" w:cs="Courier New" w:hint="default"/>
+      </w:rPr>
+    </w:lvl>
+    <w:lvl w:ilvl="5" w:tplc="08090005" w:tentative="1">
+      <w:start w:val="1"/>
+      <w:numFmt w:val="bullet"/>
+      <w:lvlText w:val=""/>
+      <w:lvlJc w:val="left"/>
+      <w:pPr>
+        <w:ind w:left="4320" w:hanging="360"/>
+      </w:pPr>
+      <w:rPr>
+        <w:rFonts w:ascii="Wingdings" w:hAnsi="Wingdings" w:hint="default"/>
+      </w:rPr>
+    </w:lvl>
+    <w:lvl w:ilvl="6" w:tplc="08090001" w:tentative="1">
+      <w:start w:val="1"/>
+      <w:numFmt w:val="bullet"/>
+      <w:lvlText w:val=""/>
+      <w:lvlJc w:val="left"/>
+      <w:pPr>
+        <w:ind w:left="5040" w:hanging="360"/>
+      </w:pPr>
+      <w:rPr>
+        <w:rFonts w:ascii="Symbol" w:hAnsi="Symbol" w:hint="default"/>
+      </w:rPr>
+    </w:lvl>
+    <w:lvl w:ilvl="7" w:tplc="08090003" w:tentative="1">
+      <w:start w:val="1"/>
+      <w:numFmt w:val="bullet"/>
+      <w:lvlText w:val="o"/>
+      <w:lvlJc w:val="left"/>
+      <w:pPr>
+        <w:ind w:left="5760" w:hanging="360"/>
+      </w:pPr>
+      <w:rPr>
+        <w:rFonts w:ascii="Courier New" w:hAnsi="Courier New" w:cs="Courier New" w:hint="default"/>
+      </w:rPr>
+    </w:lvl>
+    <w:lvl w:ilvl="8" w:tplc="08090005" w:tentative="1">
+      <w:start w:val="1"/>
+      <w:numFmt w:val="bullet"/>
+      <w:lvlText w:val=""/>
+      <w:lvlJc w:val="left"/>
+      <w:pPr>
+        <w:ind w:left="6480" w:hanging="360"/>
+      </w:pPr>
+      <w:rPr>
+        <w:rFonts w:ascii="Wingdings" w:hAnsi="Wingdings" w:hint="default"/>
+      </w:rPr>
+    </w:lvl>
+  </w:abstractNum>
   <w:num w:numId="1" w16cid:durableId="675307509">
+    <w:abstractNumId w:val="1"/>
+  </w:num>
+  <w:num w:numId="2" w16cid:durableId="193156310">
+    <w:abstractNumId w:val="5"/>
+  </w:num>
+  <w:num w:numId="3" w16cid:durableId="1478759305">
+    <w:abstractNumId w:val="2"/>
+  </w:num>
+  <w:num w:numId="4" w16cid:durableId="214898804">
+    <w:abstractNumId w:val="3"/>
+  </w:num>
+  <w:num w:numId="5" w16cid:durableId="144470544">
+    <w:abstractNumId w:val="6"/>
+  </w:num>
+  <w:num w:numId="6" w16cid:durableId="800147851">
     <w:abstractNumId w:val="0"/>
+  </w:num>
+  <w:num w:numId="7" w16cid:durableId="1808206600">
+    <w:abstractNumId w:val="4"/>
+  </w:num>
+  <w:num w:numId="8" w16cid:durableId="1964916595">
+    <w:abstractNumId w:val="7"/>
   </w:num>
 </w:numbering>
 </file>
@@ -1623,6 +3905,7 @@
   <w:style w:type="character" w:default="1" w:styleId="DefaultParagraphFont">
     <w:name w:val="Default Paragraph Font"/>
     <w:uiPriority w:val="1"/>
+    <w:semiHidden/>
     <w:unhideWhenUsed/>
   </w:style>
   <w:style w:type="table" w:default="1" w:styleId="TableNormal">
@@ -1978,6 +4261,62 @@
       <w:u w:val="single"/>
     </w:rPr>
   </w:style>
+  <w:style w:type="paragraph" w:styleId="TOC2">
+    <w:name w:val="toc 2"/>
+    <w:basedOn w:val="Normal"/>
+    <w:next w:val="Normal"/>
+    <w:autoRedefine/>
+    <w:uiPriority w:val="39"/>
+    <w:unhideWhenUsed/>
+    <w:rsid w:val="003B467D"/>
+    <w:pPr>
+      <w:spacing w:after="100"/>
+      <w:ind w:left="220"/>
+    </w:pPr>
+  </w:style>
+  <w:style w:type="character" w:styleId="UnresolvedMention">
+    <w:name w:val="Unresolved Mention"/>
+    <w:basedOn w:val="DefaultParagraphFont"/>
+    <w:uiPriority w:val="99"/>
+    <w:semiHidden/>
+    <w:unhideWhenUsed/>
+    <w:rsid w:val="003B467D"/>
+    <w:rPr>
+      <w:color w:val="605E5C"/>
+      <w:shd w:val="clear" w:color="auto" w:fill="E1DFDD"/>
+    </w:rPr>
+  </w:style>
+  <w:style w:type="table" w:styleId="TableGrid">
+    <w:name w:val="Table Grid"/>
+    <w:basedOn w:val="TableNormal"/>
+    <w:uiPriority w:val="39"/>
+    <w:rsid w:val="00221485"/>
+    <w:pPr>
+      <w:spacing w:after="0" w:line="240" w:lineRule="auto"/>
+    </w:pPr>
+    <w:tblPr>
+      <w:tblBorders>
+        <w:top w:val="single" w:sz="4" w:space="0" w:color="auto"/>
+        <w:left w:val="single" w:sz="4" w:space="0" w:color="auto"/>
+        <w:bottom w:val="single" w:sz="4" w:space="0" w:color="auto"/>
+        <w:right w:val="single" w:sz="4" w:space="0" w:color="auto"/>
+        <w:insideH w:val="single" w:sz="4" w:space="0" w:color="auto"/>
+        <w:insideV w:val="single" w:sz="4" w:space="0" w:color="auto"/>
+      </w:tblBorders>
+    </w:tblPr>
+  </w:style>
+  <w:style w:type="character" w:styleId="FollowedHyperlink">
+    <w:name w:val="FollowedHyperlink"/>
+    <w:basedOn w:val="DefaultParagraphFont"/>
+    <w:uiPriority w:val="99"/>
+    <w:semiHidden/>
+    <w:unhideWhenUsed/>
+    <w:rsid w:val="00DD6092"/>
+    <w:rPr>
+      <w:color w:val="96607D" w:themeColor="followedHyperlink"/>
+      <w:u w:val="single"/>
+    </w:rPr>
+  </w:style>
 </w:styles>
 </file>
 

</xml_diff>

<commit_message>
Initial version of report that is to be sent to supervisor
</commit_message>
<xml_diff>
--- a/MSc Preliminary Project Report.docx
+++ b/MSc Preliminary Project Report.docx
@@ -70,7 +70,7 @@
           <w:r>
             <w:fldChar w:fldCharType="separate"/>
           </w:r>
-          <w:hyperlink w:anchor="_Toc227463667" w:history="1">
+          <w:hyperlink w:anchor="_Toc227561164" w:history="1">
             <w:r>
               <w:rPr>
                 <w:rStyle w:val="Hyperlink"/>
@@ -97,7 +97,7 @@
                 <w:noProof/>
                 <w:webHidden/>
               </w:rPr>
-              <w:instrText xml:space="preserve"> PAGEREF _Toc227463667 \h </w:instrText>
+              <w:instrText xml:space="preserve"> PAGEREF _Toc227561164 \h </w:instrText>
             </w:r>
             <w:r>
               <w:rPr>
@@ -117,7 +117,7 @@
                 <w:noProof/>
                 <w:webHidden/>
               </w:rPr>
-              <w:t>1</w:t>
+              <w:t>2</w:t>
             </w:r>
             <w:r>
               <w:rPr>
@@ -135,10 +135,14 @@
               <w:tab w:val="right" w:leader="dot" w:pos="9016"/>
             </w:tabs>
             <w:rPr>
+              <w:rFonts w:eastAsiaTheme="minorEastAsia"/>
               <w:noProof/>
+              <w:sz w:val="24"/>
+              <w:szCs w:val="24"/>
+              <w:lang w:eastAsia="en-GB"/>
             </w:rPr>
           </w:pPr>
-          <w:hyperlink w:anchor="_Toc227463668" w:history="1">
+          <w:hyperlink w:anchor="_Toc227561165" w:history="1">
             <w:r>
               <w:rPr>
                 <w:rStyle w:val="Hyperlink"/>
@@ -165,7 +169,7 @@
                 <w:noProof/>
                 <w:webHidden/>
               </w:rPr>
-              <w:instrText xml:space="preserve"> PAGEREF _Toc227463668 \h </w:instrText>
+              <w:instrText xml:space="preserve"> PAGEREF _Toc227561165 \h </w:instrText>
             </w:r>
             <w:r>
               <w:rPr>
@@ -185,7 +189,7 @@
                 <w:noProof/>
                 <w:webHidden/>
               </w:rPr>
-              <w:t>1</w:t>
+              <w:t>2</w:t>
             </w:r>
             <w:r>
               <w:rPr>
@@ -203,10 +207,14 @@
               <w:tab w:val="right" w:leader="dot" w:pos="9016"/>
             </w:tabs>
             <w:rPr>
+              <w:rFonts w:eastAsiaTheme="minorEastAsia"/>
               <w:noProof/>
+              <w:sz w:val="24"/>
+              <w:szCs w:val="24"/>
+              <w:lang w:eastAsia="en-GB"/>
             </w:rPr>
           </w:pPr>
-          <w:hyperlink w:anchor="_Toc227463669" w:history="1">
+          <w:hyperlink w:anchor="_Toc227561166" w:history="1">
             <w:r>
               <w:rPr>
                 <w:rStyle w:val="Hyperlink"/>
@@ -233,7 +241,7 @@
                 <w:noProof/>
                 <w:webHidden/>
               </w:rPr>
-              <w:instrText xml:space="preserve"> PAGEREF _Toc227463669 \h </w:instrText>
+              <w:instrText xml:space="preserve"> PAGEREF _Toc227561166 \h </w:instrText>
             </w:r>
             <w:r>
               <w:rPr>
@@ -271,10 +279,14 @@
               <w:tab w:val="right" w:leader="dot" w:pos="9016"/>
             </w:tabs>
             <w:rPr>
+              <w:rFonts w:eastAsiaTheme="minorEastAsia"/>
               <w:noProof/>
+              <w:sz w:val="24"/>
+              <w:szCs w:val="24"/>
+              <w:lang w:eastAsia="en-GB"/>
             </w:rPr>
           </w:pPr>
-          <w:hyperlink w:anchor="_Toc227463670" w:history="1">
+          <w:hyperlink w:anchor="_Toc227561167" w:history="1">
             <w:r>
               <w:rPr>
                 <w:rStyle w:val="Hyperlink"/>
@@ -301,7 +313,7 @@
                 <w:noProof/>
                 <w:webHidden/>
               </w:rPr>
-              <w:instrText xml:space="preserve"> PAGEREF _Toc227463670 \h </w:instrText>
+              <w:instrText xml:space="preserve"> PAGEREF _Toc227561167 \h </w:instrText>
             </w:r>
             <w:r>
               <w:rPr>
@@ -321,7 +333,7 @@
                 <w:noProof/>
                 <w:webHidden/>
               </w:rPr>
-              <w:t>2</w:t>
+              <w:t>3</w:t>
             </w:r>
             <w:r>
               <w:rPr>
@@ -339,16 +351,20 @@
               <w:tab w:val="right" w:leader="dot" w:pos="9016"/>
             </w:tabs>
             <w:rPr>
+              <w:rFonts w:eastAsiaTheme="minorEastAsia"/>
               <w:noProof/>
+              <w:sz w:val="24"/>
+              <w:szCs w:val="24"/>
+              <w:lang w:eastAsia="en-GB"/>
             </w:rPr>
           </w:pPr>
-          <w:hyperlink w:anchor="_Toc227463671" w:history="1">
+          <w:hyperlink w:anchor="_Toc227561168" w:history="1">
             <w:r>
               <w:rPr>
                 <w:rStyle w:val="Hyperlink"/>
                 <w:noProof/>
               </w:rPr>
-              <w:t>Technical Specifications</w:t>
+              <w:t>Technical Specifications (how will these designs look)</w:t>
             </w:r>
             <w:r>
               <w:rPr>
@@ -369,7 +385,7 @@
                 <w:noProof/>
                 <w:webHidden/>
               </w:rPr>
-              <w:instrText xml:space="preserve"> PAGEREF _Toc227463671 \h </w:instrText>
+              <w:instrText xml:space="preserve"> PAGEREF _Toc227561168 \h </w:instrText>
             </w:r>
             <w:r>
               <w:rPr>
@@ -389,7 +405,7 @@
                 <w:noProof/>
                 <w:webHidden/>
               </w:rPr>
-              <w:t>2</w:t>
+              <w:t>3</w:t>
             </w:r>
             <w:r>
               <w:rPr>
@@ -407,16 +423,20 @@
               <w:tab w:val="right" w:leader="dot" w:pos="9016"/>
             </w:tabs>
             <w:rPr>
+              <w:rFonts w:eastAsiaTheme="minorEastAsia"/>
               <w:noProof/>
+              <w:sz w:val="24"/>
+              <w:szCs w:val="24"/>
+              <w:lang w:eastAsia="en-GB"/>
             </w:rPr>
           </w:pPr>
-          <w:hyperlink w:anchor="_Toc227463672" w:history="1">
+          <w:hyperlink w:anchor="_Toc227561169" w:history="1">
             <w:r>
               <w:rPr>
                 <w:rStyle w:val="Hyperlink"/>
                 <w:noProof/>
               </w:rPr>
-              <w:t>Methodologies</w:t>
+              <w:t>Methodologies (how am I going to create these designs and achieve the goal)</w:t>
             </w:r>
             <w:r>
               <w:rPr>
@@ -437,7 +457,7 @@
                 <w:noProof/>
                 <w:webHidden/>
               </w:rPr>
-              <w:instrText xml:space="preserve"> PAGEREF _Toc227463672 \h </w:instrText>
+              <w:instrText xml:space="preserve"> PAGEREF _Toc227561169 \h </w:instrText>
             </w:r>
             <w:r>
               <w:rPr>
@@ -457,7 +477,7 @@
                 <w:noProof/>
                 <w:webHidden/>
               </w:rPr>
-              <w:t>2</w:t>
+              <w:t>4</w:t>
             </w:r>
             <w:r>
               <w:rPr>
@@ -482,7 +502,7 @@
               <w:lang w:eastAsia="en-GB"/>
             </w:rPr>
           </w:pPr>
-          <w:hyperlink w:anchor="_Toc227463673" w:history="1">
+          <w:hyperlink w:anchor="_Toc227561170" w:history="1">
             <w:r>
               <w:rPr>
                 <w:rStyle w:val="Hyperlink"/>
@@ -509,7 +529,7 @@
                 <w:noProof/>
                 <w:webHidden/>
               </w:rPr>
-              <w:instrText xml:space="preserve"> PAGEREF _Toc227463673 \h </w:instrText>
+              <w:instrText xml:space="preserve"> PAGEREF _Toc227561170 \h </w:instrText>
             </w:r>
             <w:r>
               <w:rPr>
@@ -529,7 +549,7 @@
                 <w:noProof/>
                 <w:webHidden/>
               </w:rPr>
-              <w:t>2</w:t>
+              <w:t>4</w:t>
             </w:r>
             <w:r>
               <w:rPr>
@@ -547,10 +567,14 @@
               <w:tab w:val="right" w:leader="dot" w:pos="9016"/>
             </w:tabs>
             <w:rPr>
+              <w:rFonts w:eastAsiaTheme="minorEastAsia"/>
               <w:noProof/>
+              <w:sz w:val="24"/>
+              <w:szCs w:val="24"/>
+              <w:lang w:eastAsia="en-GB"/>
             </w:rPr>
           </w:pPr>
-          <w:hyperlink w:anchor="_Toc227463674" w:history="1">
+          <w:hyperlink w:anchor="_Toc227561171" w:history="1">
             <w:r>
               <w:rPr>
                 <w:rStyle w:val="Hyperlink"/>
@@ -577,7 +601,7 @@
                 <w:noProof/>
                 <w:webHidden/>
               </w:rPr>
-              <w:instrText xml:space="preserve"> PAGEREF _Toc227463674 \h </w:instrText>
+              <w:instrText xml:space="preserve"> PAGEREF _Toc227561171 \h </w:instrText>
             </w:r>
             <w:r>
               <w:rPr>
@@ -597,7 +621,7 @@
                 <w:noProof/>
                 <w:webHidden/>
               </w:rPr>
-              <w:t>3</w:t>
+              <w:t>4</w:t>
             </w:r>
             <w:r>
               <w:rPr>
@@ -615,10 +639,14 @@
               <w:tab w:val="right" w:leader="dot" w:pos="9016"/>
             </w:tabs>
             <w:rPr>
+              <w:rFonts w:eastAsiaTheme="minorEastAsia"/>
               <w:noProof/>
+              <w:sz w:val="24"/>
+              <w:szCs w:val="24"/>
+              <w:lang w:eastAsia="en-GB"/>
             </w:rPr>
           </w:pPr>
-          <w:hyperlink w:anchor="_Toc227463675" w:history="1">
+          <w:hyperlink w:anchor="_Toc227561172" w:history="1">
             <w:r>
               <w:rPr>
                 <w:rStyle w:val="Hyperlink"/>
@@ -645,7 +673,7 @@
                 <w:noProof/>
                 <w:webHidden/>
               </w:rPr>
-              <w:instrText xml:space="preserve"> PAGEREF _Toc227463675 \h </w:instrText>
+              <w:instrText xml:space="preserve"> PAGEREF _Toc227561172 \h </w:instrText>
             </w:r>
             <w:r>
               <w:rPr>
@@ -665,7 +693,7 @@
                 <w:noProof/>
                 <w:webHidden/>
               </w:rPr>
-              <w:t>3</w:t>
+              <w:t>4</w:t>
             </w:r>
             <w:r>
               <w:rPr>
@@ -683,10 +711,14 @@
               <w:tab w:val="right" w:leader="dot" w:pos="9016"/>
             </w:tabs>
             <w:rPr>
+              <w:rFonts w:eastAsiaTheme="minorEastAsia"/>
               <w:noProof/>
+              <w:sz w:val="24"/>
+              <w:szCs w:val="24"/>
+              <w:lang w:eastAsia="en-GB"/>
             </w:rPr>
           </w:pPr>
-          <w:hyperlink w:anchor="_Toc227463676" w:history="1">
+          <w:hyperlink w:anchor="_Toc227561173" w:history="1">
             <w:r>
               <w:rPr>
                 <w:rStyle w:val="Hyperlink"/>
@@ -713,7 +745,7 @@
                 <w:noProof/>
                 <w:webHidden/>
               </w:rPr>
-              <w:instrText xml:space="preserve"> PAGEREF _Toc227463676 \h </w:instrText>
+              <w:instrText xml:space="preserve"> PAGEREF _Toc227561173 \h </w:instrText>
             </w:r>
             <w:r>
               <w:rPr>
@@ -733,7 +765,7 @@
                 <w:noProof/>
                 <w:webHidden/>
               </w:rPr>
-              <w:t>3</w:t>
+              <w:t>5</w:t>
             </w:r>
             <w:r>
               <w:rPr>
@@ -751,10 +783,14 @@
               <w:tab w:val="right" w:leader="dot" w:pos="9016"/>
             </w:tabs>
             <w:rPr>
+              <w:rFonts w:eastAsiaTheme="minorEastAsia"/>
               <w:noProof/>
+              <w:sz w:val="24"/>
+              <w:szCs w:val="24"/>
+              <w:lang w:eastAsia="en-GB"/>
             </w:rPr>
           </w:pPr>
-          <w:hyperlink w:anchor="_Toc227463677" w:history="1">
+          <w:hyperlink w:anchor="_Toc227561174" w:history="1">
             <w:r>
               <w:rPr>
                 <w:rStyle w:val="Hyperlink"/>
@@ -781,7 +817,7 @@
                 <w:noProof/>
                 <w:webHidden/>
               </w:rPr>
-              <w:instrText xml:space="preserve"> PAGEREF _Toc227463677 \h </w:instrText>
+              <w:instrText xml:space="preserve"> PAGEREF _Toc227561174 \h </w:instrText>
             </w:r>
             <w:r>
               <w:rPr>
@@ -801,7 +837,7 @@
                 <w:noProof/>
                 <w:webHidden/>
               </w:rPr>
-              <w:t>3</w:t>
+              <w:t>5</w:t>
             </w:r>
             <w:r>
               <w:rPr>
@@ -826,7 +862,7 @@
               <w:lang w:eastAsia="en-GB"/>
             </w:rPr>
           </w:pPr>
-          <w:hyperlink w:anchor="_Toc227463678" w:history="1">
+          <w:hyperlink w:anchor="_Toc227561175" w:history="1">
             <w:r>
               <w:rPr>
                 <w:rStyle w:val="Hyperlink"/>
@@ -853,7 +889,7 @@
                 <w:noProof/>
                 <w:webHidden/>
               </w:rPr>
-              <w:instrText xml:space="preserve"> PAGEREF _Toc227463678 \h </w:instrText>
+              <w:instrText xml:space="preserve"> PAGEREF _Toc227561175 \h </w:instrText>
             </w:r>
             <w:r>
               <w:rPr>
@@ -873,7 +909,415 @@
                 <w:noProof/>
                 <w:webHidden/>
               </w:rPr>
-              <w:t>3</w:t>
+              <w:t>5</w:t>
+            </w:r>
+            <w:r>
+              <w:rPr>
+                <w:noProof/>
+                <w:webHidden/>
+              </w:rPr>
+              <w:fldChar w:fldCharType="end"/>
+            </w:r>
+          </w:hyperlink>
+        </w:p>
+        <w:p>
+          <w:pPr>
+            <w:pStyle w:val="TOC2"/>
+            <w:tabs>
+              <w:tab w:val="right" w:leader="dot" w:pos="9016"/>
+            </w:tabs>
+            <w:rPr>
+              <w:rFonts w:eastAsiaTheme="minorEastAsia"/>
+              <w:noProof/>
+              <w:sz w:val="24"/>
+              <w:szCs w:val="24"/>
+              <w:lang w:eastAsia="en-GB"/>
+            </w:rPr>
+          </w:pPr>
+          <w:hyperlink w:anchor="_Toc227561176" w:history="1">
+            <w:r>
+              <w:rPr>
+                <w:rStyle w:val="Hyperlink"/>
+                <w:noProof/>
+              </w:rPr>
+              <w:t>Sprint 1 (5</w:t>
+            </w:r>
+            <w:r>
+              <w:rPr>
+                <w:rStyle w:val="Hyperlink"/>
+                <w:noProof/>
+                <w:vertAlign w:val="superscript"/>
+              </w:rPr>
+              <w:t>th</w:t>
+            </w:r>
+            <w:r>
+              <w:rPr>
+                <w:rStyle w:val="Hyperlink"/>
+                <w:noProof/>
+              </w:rPr>
+              <w:t xml:space="preserve"> March – 2</w:t>
+            </w:r>
+            <w:r>
+              <w:rPr>
+                <w:rStyle w:val="Hyperlink"/>
+                <w:noProof/>
+                <w:vertAlign w:val="superscript"/>
+              </w:rPr>
+              <w:t>nd</w:t>
+            </w:r>
+            <w:r>
+              <w:rPr>
+                <w:rStyle w:val="Hyperlink"/>
+                <w:noProof/>
+              </w:rPr>
+              <w:t xml:space="preserve"> April)</w:t>
+            </w:r>
+            <w:r>
+              <w:rPr>
+                <w:noProof/>
+                <w:webHidden/>
+              </w:rPr>
+              <w:tab/>
+            </w:r>
+            <w:r>
+              <w:rPr>
+                <w:noProof/>
+                <w:webHidden/>
+              </w:rPr>
+              <w:fldChar w:fldCharType="begin"/>
+            </w:r>
+            <w:r>
+              <w:rPr>
+                <w:noProof/>
+                <w:webHidden/>
+              </w:rPr>
+              <w:instrText xml:space="preserve"> PAGEREF _Toc227561176 \h </w:instrText>
+            </w:r>
+            <w:r>
+              <w:rPr>
+                <w:noProof/>
+                <w:webHidden/>
+              </w:rPr>
+            </w:r>
+            <w:r>
+              <w:rPr>
+                <w:noProof/>
+                <w:webHidden/>
+              </w:rPr>
+              <w:fldChar w:fldCharType="separate"/>
+            </w:r>
+            <w:r>
+              <w:rPr>
+                <w:noProof/>
+                <w:webHidden/>
+              </w:rPr>
+              <w:t>5</w:t>
+            </w:r>
+            <w:r>
+              <w:rPr>
+                <w:noProof/>
+                <w:webHidden/>
+              </w:rPr>
+              <w:fldChar w:fldCharType="end"/>
+            </w:r>
+          </w:hyperlink>
+        </w:p>
+        <w:p>
+          <w:pPr>
+            <w:pStyle w:val="TOC2"/>
+            <w:tabs>
+              <w:tab w:val="right" w:leader="dot" w:pos="9016"/>
+            </w:tabs>
+            <w:rPr>
+              <w:rFonts w:eastAsiaTheme="minorEastAsia"/>
+              <w:noProof/>
+              <w:sz w:val="24"/>
+              <w:szCs w:val="24"/>
+              <w:lang w:eastAsia="en-GB"/>
+            </w:rPr>
+          </w:pPr>
+          <w:hyperlink w:anchor="_Toc227561177" w:history="1">
+            <w:r>
+              <w:rPr>
+                <w:rStyle w:val="Hyperlink"/>
+                <w:noProof/>
+              </w:rPr>
+              <w:t>Sprint 2 (3</w:t>
+            </w:r>
+            <w:r>
+              <w:rPr>
+                <w:rStyle w:val="Hyperlink"/>
+                <w:noProof/>
+                <w:vertAlign w:val="superscript"/>
+              </w:rPr>
+              <w:t>rd</w:t>
+            </w:r>
+            <w:r>
+              <w:rPr>
+                <w:rStyle w:val="Hyperlink"/>
+                <w:noProof/>
+              </w:rPr>
+              <w:t xml:space="preserve"> April – 30</w:t>
+            </w:r>
+            <w:r>
+              <w:rPr>
+                <w:rStyle w:val="Hyperlink"/>
+                <w:noProof/>
+                <w:vertAlign w:val="superscript"/>
+              </w:rPr>
+              <w:t>th</w:t>
+            </w:r>
+            <w:r>
+              <w:rPr>
+                <w:rStyle w:val="Hyperlink"/>
+                <w:noProof/>
+              </w:rPr>
+              <w:t xml:space="preserve"> April)</w:t>
+            </w:r>
+            <w:r>
+              <w:rPr>
+                <w:noProof/>
+                <w:webHidden/>
+              </w:rPr>
+              <w:tab/>
+            </w:r>
+            <w:r>
+              <w:rPr>
+                <w:noProof/>
+                <w:webHidden/>
+              </w:rPr>
+              <w:fldChar w:fldCharType="begin"/>
+            </w:r>
+            <w:r>
+              <w:rPr>
+                <w:noProof/>
+                <w:webHidden/>
+              </w:rPr>
+              <w:instrText xml:space="preserve"> PAGEREF _Toc227561177 \h </w:instrText>
+            </w:r>
+            <w:r>
+              <w:rPr>
+                <w:noProof/>
+                <w:webHidden/>
+              </w:rPr>
+            </w:r>
+            <w:r>
+              <w:rPr>
+                <w:noProof/>
+                <w:webHidden/>
+              </w:rPr>
+              <w:fldChar w:fldCharType="separate"/>
+            </w:r>
+            <w:r>
+              <w:rPr>
+                <w:noProof/>
+                <w:webHidden/>
+              </w:rPr>
+              <w:t>5</w:t>
+            </w:r>
+            <w:r>
+              <w:rPr>
+                <w:noProof/>
+                <w:webHidden/>
+              </w:rPr>
+              <w:fldChar w:fldCharType="end"/>
+            </w:r>
+          </w:hyperlink>
+        </w:p>
+        <w:p>
+          <w:pPr>
+            <w:pStyle w:val="TOC2"/>
+            <w:tabs>
+              <w:tab w:val="right" w:leader="dot" w:pos="9016"/>
+            </w:tabs>
+            <w:rPr>
+              <w:rFonts w:eastAsiaTheme="minorEastAsia"/>
+              <w:noProof/>
+              <w:sz w:val="24"/>
+              <w:szCs w:val="24"/>
+              <w:lang w:eastAsia="en-GB"/>
+            </w:rPr>
+          </w:pPr>
+          <w:hyperlink w:anchor="_Toc227561178" w:history="1">
+            <w:r>
+              <w:rPr>
+                <w:rStyle w:val="Hyperlink"/>
+                <w:noProof/>
+              </w:rPr>
+              <w:t>Sprint 3 (1</w:t>
+            </w:r>
+            <w:r>
+              <w:rPr>
+                <w:rStyle w:val="Hyperlink"/>
+                <w:noProof/>
+                <w:vertAlign w:val="superscript"/>
+              </w:rPr>
+              <w:t>st</w:t>
+            </w:r>
+            <w:r>
+              <w:rPr>
+                <w:rStyle w:val="Hyperlink"/>
+                <w:noProof/>
+              </w:rPr>
+              <w:t xml:space="preserve"> May – 2</w:t>
+            </w:r>
+            <w:r>
+              <w:rPr>
+                <w:rStyle w:val="Hyperlink"/>
+                <w:noProof/>
+                <w:vertAlign w:val="superscript"/>
+              </w:rPr>
+              <w:t>nd</w:t>
+            </w:r>
+            <w:r>
+              <w:rPr>
+                <w:rStyle w:val="Hyperlink"/>
+                <w:noProof/>
+              </w:rPr>
+              <w:t xml:space="preserve"> July)</w:t>
+            </w:r>
+            <w:r>
+              <w:rPr>
+                <w:noProof/>
+                <w:webHidden/>
+              </w:rPr>
+              <w:tab/>
+            </w:r>
+            <w:r>
+              <w:rPr>
+                <w:noProof/>
+                <w:webHidden/>
+              </w:rPr>
+              <w:fldChar w:fldCharType="begin"/>
+            </w:r>
+            <w:r>
+              <w:rPr>
+                <w:noProof/>
+                <w:webHidden/>
+              </w:rPr>
+              <w:instrText xml:space="preserve"> PAGEREF _Toc227561178 \h </w:instrText>
+            </w:r>
+            <w:r>
+              <w:rPr>
+                <w:noProof/>
+                <w:webHidden/>
+              </w:rPr>
+            </w:r>
+            <w:r>
+              <w:rPr>
+                <w:noProof/>
+                <w:webHidden/>
+              </w:rPr>
+              <w:fldChar w:fldCharType="separate"/>
+            </w:r>
+            <w:r>
+              <w:rPr>
+                <w:noProof/>
+                <w:webHidden/>
+              </w:rPr>
+              <w:t>5</w:t>
+            </w:r>
+            <w:r>
+              <w:rPr>
+                <w:noProof/>
+                <w:webHidden/>
+              </w:rPr>
+              <w:fldChar w:fldCharType="end"/>
+            </w:r>
+          </w:hyperlink>
+        </w:p>
+        <w:p>
+          <w:pPr>
+            <w:pStyle w:val="TOC2"/>
+            <w:tabs>
+              <w:tab w:val="right" w:leader="dot" w:pos="9016"/>
+            </w:tabs>
+            <w:rPr>
+              <w:rFonts w:eastAsiaTheme="minorEastAsia"/>
+              <w:noProof/>
+              <w:sz w:val="24"/>
+              <w:szCs w:val="24"/>
+              <w:lang w:eastAsia="en-GB"/>
+            </w:rPr>
+          </w:pPr>
+          <w:hyperlink w:anchor="_Toc227561179" w:history="1">
+            <w:r>
+              <w:rPr>
+                <w:rStyle w:val="Hyperlink"/>
+                <w:noProof/>
+              </w:rPr>
+              <w:t>Sprint 4 (3</w:t>
+            </w:r>
+            <w:r>
+              <w:rPr>
+                <w:rStyle w:val="Hyperlink"/>
+                <w:noProof/>
+                <w:vertAlign w:val="superscript"/>
+              </w:rPr>
+              <w:t>rd</w:t>
+            </w:r>
+            <w:r>
+              <w:rPr>
+                <w:rStyle w:val="Hyperlink"/>
+                <w:noProof/>
+              </w:rPr>
+              <w:t xml:space="preserve"> July – 6</w:t>
+            </w:r>
+            <w:r>
+              <w:rPr>
+                <w:rStyle w:val="Hyperlink"/>
+                <w:noProof/>
+                <w:vertAlign w:val="superscript"/>
+              </w:rPr>
+              <w:t>th</w:t>
+            </w:r>
+            <w:r>
+              <w:rPr>
+                <w:rStyle w:val="Hyperlink"/>
+                <w:noProof/>
+              </w:rPr>
+              <w:t xml:space="preserve"> August)</w:t>
+            </w:r>
+            <w:r>
+              <w:rPr>
+                <w:noProof/>
+                <w:webHidden/>
+              </w:rPr>
+              <w:tab/>
+            </w:r>
+            <w:r>
+              <w:rPr>
+                <w:noProof/>
+                <w:webHidden/>
+              </w:rPr>
+              <w:fldChar w:fldCharType="begin"/>
+            </w:r>
+            <w:r>
+              <w:rPr>
+                <w:noProof/>
+                <w:webHidden/>
+              </w:rPr>
+              <w:instrText xml:space="preserve"> PAGEREF _Toc227561179 \h </w:instrText>
+            </w:r>
+            <w:r>
+              <w:rPr>
+                <w:noProof/>
+                <w:webHidden/>
+              </w:rPr>
+            </w:r>
+            <w:r>
+              <w:rPr>
+                <w:noProof/>
+                <w:webHidden/>
+              </w:rPr>
+              <w:fldChar w:fldCharType="separate"/>
+            </w:r>
+            <w:r>
+              <w:rPr>
+                <w:noProof/>
+                <w:webHidden/>
+              </w:rPr>
+              <w:t>6</w:t>
             </w:r>
             <w:r>
               <w:rPr>
@@ -898,7 +1342,7 @@
               <w:lang w:eastAsia="en-GB"/>
             </w:rPr>
           </w:pPr>
-          <w:hyperlink w:anchor="_Toc227463679" w:history="1">
+          <w:hyperlink w:anchor="_Toc227561180" w:history="1">
             <w:r>
               <w:rPr>
                 <w:rStyle w:val="Hyperlink"/>
@@ -925,7 +1369,7 @@
                 <w:noProof/>
                 <w:webHidden/>
               </w:rPr>
-              <w:instrText xml:space="preserve"> PAGEREF _Toc227463679 \h </w:instrText>
+              <w:instrText xml:space="preserve"> PAGEREF _Toc227561180 \h </w:instrText>
             </w:r>
             <w:r>
               <w:rPr>
@@ -945,7 +1389,7 @@
                 <w:noProof/>
                 <w:webHidden/>
               </w:rPr>
-              <w:t>4</w:t>
+              <w:t>6</w:t>
             </w:r>
             <w:r>
               <w:rPr>
@@ -968,213 +1412,361 @@
       </w:sdtContent>
     </w:sdt>
     <w:p/>
-    <w:p>
-      <w:pPr>
-        <w:pStyle w:val="Heading1"/>
-      </w:pPr>
-      <w:bookmarkStart w:id="0" w:name="_Toc227463667"/>
-      <w:r>
-        <w:t>Introduction</w:t>
-      </w:r>
-      <w:bookmarkStart w:id="1" w:name="_Toc227463668"/>
-      <w:bookmarkEnd w:id="0"/>
-    </w:p>
-    <w:p>
-      <w:pPr>
-        <w:pStyle w:val="Heading2"/>
-      </w:pPr>
-      <w:r>
-        <w:t>Problem Description, Background and Motivations</w:t>
-      </w:r>
-      <w:bookmarkEnd w:id="1"/>
-    </w:p>
-    <w:p>
-      <w:r>
-        <w:t>The number of autonomous vehicles has greatly risen in recent years</w:t>
-      </w:r>
-      <w:r>
-        <w:t>,</w:t>
-      </w:r>
-      <w:r>
-        <w:t xml:space="preserve"> but</w:t>
-      </w:r>
-      <w:r>
-        <w:t xml:space="preserve"> does the property of security (authenticated sensor data) at one layer compose to guarantee the property of safety (accurate obstacle detection) at a different layer of </w:t>
-      </w:r>
-      <w:r>
-        <w:t xml:space="preserve">vehicle </w:t>
-      </w:r>
-      <w:r>
-        <w:t xml:space="preserve">system architecture? How do architectural constructs, such as Redundancy, Hierarchical Decomposition, and Shared Resources, </w:t>
-      </w:r>
-      <w:r>
-        <w:t xml:space="preserve">of which these systems may be based upon </w:t>
-      </w:r>
-      <w:r>
-        <w:t>govern whether this cross-layer composition holds?</w:t>
-      </w:r>
-    </w:p>
-    <w:p>
-      <w:r>
-        <w:t>Autonomous vehicles are marketed as the future of transportation and as a luxury, but how can they truly be successful and reliable when most of the public are too hesitant to trust them with complete control over driving?</w:t>
-      </w:r>
-    </w:p>
-    <w:p>
-      <w:r>
-        <w:t>Given existing cases about malfunctioning autonomous vehicles, such as some Waymo self-driving vehicles failing to sense oncoming pedestrians [1], it’s understandable that the public wouldn’t want to be completely left at the hands of an autonomous vehicle</w:t>
-      </w:r>
-    </w:p>
-    <w:p>
-      <w:r>
-        <w:t>It raises questions about the designs of these existing systems and how factors such as redundancy, shared resources, and hierarchical decomposition are considered in these existing designs</w:t>
-      </w:r>
-      <w:r>
-        <w:t>.</w:t>
-      </w:r>
-    </w:p>
-    <w:p/>
-    <w:p>
-      <w:r>
-        <w:t xml:space="preserve">If the cross-layer composition between safety and security can’t be guaranteed, then it could allow external malicious sources to exploit these systems. </w:t>
-      </w:r>
-      <w:r>
-        <w:t>An example of a malicious source would be the potential risk that a malicious message could hijack a self-driving car and cause it to hit pedestrians (risking safety AND security). This can appear in the form of a physical attacker holding a clear sign that can misdirect the vehicle</w:t>
-      </w:r>
-      <w:r>
-        <w:t xml:space="preserve"> [2]</w:t>
-      </w:r>
-      <w:r>
-        <w:t xml:space="preserve"> (similar to SQL Injection Attacks on Automatic Number Plate Recognition software [</w:t>
-      </w:r>
-      <w:r>
-        <w:t>3</w:t>
-      </w:r>
-      <w:r>
-        <w:t>])</w:t>
-      </w:r>
-      <w:r>
-        <w:t>.</w:t>
-      </w:r>
-    </w:p>
-    <w:p/>
-    <w:p>
-      <w:pPr>
-        <w:pStyle w:val="Heading2"/>
-      </w:pPr>
-      <w:bookmarkStart w:id="2" w:name="_Toc227463669"/>
-      <w:r>
-        <w:t>Aims</w:t>
-      </w:r>
-      <w:bookmarkEnd w:id="2"/>
-    </w:p>
-    <w:p>
-      <w:r>
-        <w:t>The first aim of this project is to d</w:t>
-      </w:r>
-      <w:r>
-        <w:t>evelop a robust system architecture that remains safe and secure-by-design, regardless of different architectural constructs that would be applied to ensure an efficient autonomous driving system</w:t>
-      </w:r>
-    </w:p>
-    <w:p>
-      <w:r>
-        <w:t>The</w:t>
-      </w:r>
-      <w:r>
-        <w:t xml:space="preserve"> second</w:t>
-      </w:r>
-      <w:r>
-        <w:t xml:space="preserve"> aim of this project is to </w:t>
-      </w:r>
-      <w:r>
-        <w:t>e</w:t>
-      </w:r>
-      <w:r>
-        <w:t>nsure that architectural patterns that maintain safety and security properties are present and only benefit the overall system</w:t>
-      </w:r>
-    </w:p>
-    <w:p>
-      <w:r>
-        <w:t>The</w:t>
-      </w:r>
-      <w:r>
-        <w:t xml:space="preserve"> third</w:t>
-      </w:r>
-      <w:r>
-        <w:t xml:space="preserve"> aim of this project is to </w:t>
-      </w:r>
-      <w:r>
-        <w:t>e</w:t>
-      </w:r>
-      <w:r>
-        <w:t>xamine redundancy, shared resources, and hierarchical decomposition within the system and how the design choices used to solve this problem will affect these areas</w:t>
-      </w:r>
-    </w:p>
-    <w:p/>
-    <w:p>
-      <w:pPr>
-        <w:pStyle w:val="Heading2"/>
-      </w:pPr>
-      <w:bookmarkStart w:id="3" w:name="_Toc227463670"/>
-      <w:r>
-        <w:t>Objectives</w:t>
-      </w:r>
-      <w:bookmarkEnd w:id="3"/>
-    </w:p>
-    <w:p>
-      <w:r>
-        <w:t>Identify architectural patterns to implement in the system</w:t>
-      </w:r>
-    </w:p>
-    <w:p>
-      <w:r>
-        <w:t>Design the</w:t>
-      </w:r>
-      <w:r>
-        <w:t xml:space="preserve"> base</w:t>
-      </w:r>
-      <w:r>
-        <w:t xml:space="preserve"> system architecture using a chosen Unified Modelling Language (UML) tool</w:t>
-      </w:r>
-    </w:p>
-    <w:p>
-      <w:r>
-        <w:t>Perform Compositional Verification (where each component is verified and tested individually to ensure the whole system works correctly)</w:t>
-      </w:r>
-    </w:p>
-    <w:p>
-      <w:r>
-        <w:t>Report findings and progress throughout the project</w:t>
-      </w:r>
-    </w:p>
-    <w:p/>
-    <w:p>
-      <w:pPr>
-        <w:pStyle w:val="Heading2"/>
-      </w:pPr>
-      <w:bookmarkStart w:id="4" w:name="_Toc227463671"/>
-      <w:r>
-        <w:t>Technical Specifications</w:t>
-      </w:r>
-      <w:bookmarkEnd w:id="4"/>
-    </w:p>
-    <w:p/>
-    <w:p>
-      <w:pPr>
-        <w:pStyle w:val="Heading2"/>
-      </w:pPr>
-      <w:bookmarkStart w:id="5" w:name="_Toc227463672"/>
-      <w:r>
-        <w:t>Methodologies</w:t>
-      </w:r>
-      <w:bookmarkEnd w:id="5"/>
-    </w:p>
     <w:p/>
     <w:p/>
+    <w:p/>
+    <w:p/>
+    <w:p/>
+    <w:p/>
+    <w:p/>
+    <w:p/>
+    <w:p/>
+    <w:p/>
     <w:p>
       <w:pPr>
         <w:pStyle w:val="Heading1"/>
       </w:pPr>
-      <w:bookmarkStart w:id="6" w:name="_Toc227463673"/>
+      <w:bookmarkStart w:id="0" w:name="_Toc227561164"/>
+      <w:r>
+        <w:lastRenderedPageBreak/>
+        <w:t>Introduction</w:t>
+      </w:r>
+      <w:bookmarkEnd w:id="0"/>
+    </w:p>
+    <w:p>
+      <w:pPr>
+        <w:pStyle w:val="Heading2"/>
+      </w:pPr>
+      <w:bookmarkStart w:id="1" w:name="_Toc227561165"/>
+      <w:r>
+        <w:t>Problem Description, Background and Motivations</w:t>
+      </w:r>
+      <w:bookmarkEnd w:id="1"/>
+    </w:p>
+    <w:p>
+      <w:r>
+        <w:t>The number of autonomous vehicles has greatly risen in recent years</w:t>
+      </w:r>
+      <w:r>
+        <w:t>,</w:t>
+      </w:r>
+      <w:r>
+        <w:t xml:space="preserve"> but</w:t>
+      </w:r>
+      <w:r>
+        <w:t xml:space="preserve"> does the property of security (authenticated sensor data) at one layer compose to guarantee the property of safety (accurate obstacle detection) at a different layer of </w:t>
+      </w:r>
+      <w:r>
+        <w:t xml:space="preserve">vehicle </w:t>
+      </w:r>
+      <w:r>
+        <w:t xml:space="preserve">system architecture? How do architectural constructs, such as Redundancy, Hierarchical Decomposition, and Shared Resources, </w:t>
+      </w:r>
+      <w:r>
+        <w:t xml:space="preserve">of which these systems may be based upon </w:t>
+      </w:r>
+      <w:r>
+        <w:t>govern whether this cross-layer composition holds?</w:t>
+      </w:r>
+    </w:p>
+    <w:p>
+      <w:r>
+        <w:t>Autonomous vehicles are marketed as the future of transportation and as a luxury, but how can they truly be successful and reliable when most of the public are too hesitant to trust them with complete control over driving?</w:t>
+      </w:r>
+    </w:p>
+    <w:p/>
+    <w:p>
+      <w:r>
+        <w:t>Given existing cases about malfunctioning autonomous vehicles, such as some Waymo self-driving vehicles failing to sense oncoming pedestrians [1], it’s understandable that the public wouldn’t want to be completely left at the hands of an autonomous vehicle</w:t>
+      </w:r>
+    </w:p>
+    <w:p/>
+    <w:p>
+      <w:r>
+        <w:t>It raises questions about the designs of these existing systems and how factors such as redundancy, shared resources, and hierarchical decomposition are considered in these existing designs</w:t>
+      </w:r>
+      <w:r>
+        <w:t>.</w:t>
+      </w:r>
+    </w:p>
+    <w:p/>
+    <w:p>
+      <w:r>
+        <w:t xml:space="preserve">If the cross-layer composition between safety and security can’t be guaranteed, then it could allow external malicious sources to exploit these systems. </w:t>
+      </w:r>
+      <w:r>
+        <w:t>An example of a malicious source would be the potential risk that a malicious message could hijack a self-driving car and cause it to hit pedestrians (risking safety AND security). This can appear in the form of a physical attacker holding a clear sign that can misdirect the vehicle</w:t>
+      </w:r>
+      <w:r>
+        <w:t xml:space="preserve"> [2]</w:t>
+      </w:r>
+      <w:r>
+        <w:t xml:space="preserve"> (similar to SQL Injection Attacks on Automatic Number Plate Recognition software [</w:t>
+      </w:r>
+      <w:r>
+        <w:t>3</w:t>
+      </w:r>
+      <w:r>
+        <w:t>])</w:t>
+      </w:r>
+      <w:r>
+        <w:t>.</w:t>
+      </w:r>
+    </w:p>
+    <w:p/>
+    <w:p>
+      <w:pPr>
+        <w:pStyle w:val="Heading2"/>
+      </w:pPr>
+      <w:bookmarkStart w:id="2" w:name="_Toc227561166"/>
+      <w:r>
+        <w:t>Aims</w:t>
+      </w:r>
+      <w:bookmarkEnd w:id="2"/>
+    </w:p>
+    <w:p>
+      <w:r>
+        <w:t>The first aim of this project is to d</w:t>
+      </w:r>
+      <w:r>
+        <w:t>evelop a robust system architecture that remains safe and secure-by-design, regardless of different architectural constructs that would be applied to ensure an efficient autonomous driving system</w:t>
+      </w:r>
+    </w:p>
+    <w:p/>
+    <w:p>
+      <w:r>
+        <w:t>The</w:t>
+      </w:r>
+      <w:r>
+        <w:t xml:space="preserve"> second</w:t>
+      </w:r>
+      <w:r>
+        <w:t xml:space="preserve"> aim of this project is to </w:t>
+      </w:r>
+      <w:r>
+        <w:t>e</w:t>
+      </w:r>
+      <w:r>
+        <w:t>nsure that architectural patterns that maintain safety and security properties are present and only benefit the overall system</w:t>
+      </w:r>
+    </w:p>
+    <w:p/>
+    <w:p>
+      <w:r>
+        <w:t>The</w:t>
+      </w:r>
+      <w:r>
+        <w:t xml:space="preserve"> third</w:t>
+      </w:r>
+      <w:r>
+        <w:t xml:space="preserve"> aim of this project is to </w:t>
+      </w:r>
+      <w:r>
+        <w:t>e</w:t>
+      </w:r>
+      <w:r>
+        <w:t>xamine redundancy, shared resources, and hierarchical decomposition within the system and how the design choices used to solve this problem will affect these areas</w:t>
+      </w:r>
+    </w:p>
+    <w:p/>
+    <w:p>
+      <w:pPr>
+        <w:pStyle w:val="Heading2"/>
+      </w:pPr>
+      <w:bookmarkStart w:id="3" w:name="_Toc227561167"/>
+      <w:r>
+        <w:t>Objectives</w:t>
+      </w:r>
+      <w:bookmarkEnd w:id="3"/>
+    </w:p>
+    <w:p>
+      <w:r>
+        <w:t>Design the</w:t>
+      </w:r>
+      <w:r>
+        <w:t xml:space="preserve"> base</w:t>
+      </w:r>
+      <w:r>
+        <w:t xml:space="preserve"> system architecture using a chosen Unified Modelling Language (UML) tool</w:t>
+      </w:r>
+    </w:p>
+    <w:p/>
+    <w:p>
+      <w:r>
+        <w:t>Research the chosen architectural patterns (Redundancy, Shared Resources, and Hierarchical Decomposition) to then produce architectural designs based on each pattern</w:t>
+      </w:r>
+    </w:p>
+    <w:p/>
+    <w:p>
+      <w:r>
+        <w:t>Seek similar work done by other researchers working on similar problems are compare</w:t>
+      </w:r>
+      <w:r>
+        <w:t xml:space="preserve"> existing designs to the planned specification of the architectural design to identify any improvements that could be mended.</w:t>
+      </w:r>
+    </w:p>
+    <w:p/>
+    <w:p>
+      <w:r>
+        <w:t>Perform Compositional Verification (where each component is verified and tested individually to ensure the whole system works correctly)</w:t>
+      </w:r>
+    </w:p>
+    <w:p/>
+    <w:p>
+      <w:r>
+        <w:t>Test each design pattern through specific safety scenarios that test relationships between certain components across different layers</w:t>
+      </w:r>
+    </w:p>
+    <w:p/>
+    <w:p>
+      <w:r>
+        <w:t>Report findings and progress throughout the project</w:t>
+      </w:r>
+    </w:p>
+    <w:p/>
+    <w:p>
+      <w:pPr>
+        <w:pStyle w:val="Heading2"/>
+      </w:pPr>
+      <w:bookmarkStart w:id="4" w:name="_Toc227561168"/>
+      <w:r>
+        <w:t>Technical Specifications</w:t>
+      </w:r>
+      <w:r>
+        <w:t xml:space="preserve"> (how will these designs look)</w:t>
+      </w:r>
+      <w:bookmarkEnd w:id="4"/>
+    </w:p>
+    <w:p>
+      <w:r>
+        <w:t xml:space="preserve">For the specification of this project, based on the prior skills of the researcher, it is decided that the system architecture designs are to be produced in Eclipse Papyrus through the use of Java code generating the components, layers, and therefore the internal relationships and constructs of these designs. </w:t>
+      </w:r>
+    </w:p>
+    <w:p/>
+    <w:p>
+      <w:r>
+        <w:t xml:space="preserve">Due to the nature of Formal Modelling </w:t>
+      </w:r>
+      <w:r>
+        <w:t>requiring precise and correct semantics with no ambiguity in its mathematical representations, the use of Java code can help achieve this standard when designing these systems.</w:t>
+      </w:r>
+    </w:p>
+    <w:p/>
+    <w:p>
+      <w:r>
+        <w:t>Eclipse Papyrus</w:t>
+      </w:r>
+      <w:r>
+        <w:t xml:space="preserve"> is an industrial-grade </w:t>
+      </w:r>
+      <w:r>
+        <w:t>open-source</w:t>
+      </w:r>
+      <w:r>
+        <w:t xml:space="preserve"> model-based engineering tool [4]</w:t>
+      </w:r>
+      <w:r>
+        <w:t xml:space="preserve">. Upon initial usage, it works as a UML (Unified Modelling Language) tool that allows the user to use code to implement different components and variables into the design interface, as well as regular drag-and-drop that every other UML tool allows for. </w:t>
+      </w:r>
+    </w:p>
+    <w:p/>
+    <w:p>
+      <w:pPr>
+        <w:pStyle w:val="Heading2"/>
+      </w:pPr>
+      <w:bookmarkStart w:id="5" w:name="_Toc227561169"/>
+      <w:r>
+        <w:lastRenderedPageBreak/>
+        <w:t>Methodologies</w:t>
+      </w:r>
+      <w:bookmarkEnd w:id="5"/>
+    </w:p>
+    <w:p>
+      <w:r>
+        <w:t>In order to carry out this project, it is important to adopt an Agile methodology and divide this workload into “sprints”.</w:t>
+      </w:r>
+      <w:r>
+        <w:t xml:space="preserve"> </w:t>
+      </w:r>
+    </w:p>
+    <w:p/>
+    <w:p>
+      <w:r>
+        <w:t>In the first sprint</w:t>
+      </w:r>
+      <w:r>
+        <w:t xml:space="preserve">, and any work done prior to the second sprint, </w:t>
+      </w:r>
+      <w:r>
+        <w:t>the main activities taken place mostly revolved around</w:t>
+      </w:r>
+      <w:r>
+        <w:t xml:space="preserve"> learning and researching the topic at hand, as well as understanding the problem to be solved and forming the framework of the solution to be produced</w:t>
+      </w:r>
+      <w:r>
+        <w:t>.</w:t>
+      </w:r>
+    </w:p>
+    <w:p/>
+    <w:p>
+      <w:r>
+        <w:t xml:space="preserve">In the second sprint, this very preliminary report will be written which encapsulates the current progress of the project, as well as </w:t>
+      </w:r>
+      <w:r>
+        <w:t>acting as the initiation of the implementation phase of the project, where development of the base system architecture will begin.</w:t>
+      </w:r>
+      <w:r>
+        <w:t xml:space="preserve"> The entire development of these systems will take place within Eclipse Papyrus.</w:t>
+      </w:r>
+    </w:p>
+    <w:p/>
+    <w:p>
+      <w:r>
+        <w:t xml:space="preserve">In the </w:t>
+      </w:r>
+      <w:r>
+        <w:t>third</w:t>
+      </w:r>
+      <w:r>
+        <w:t xml:space="preserve"> sprint,</w:t>
+      </w:r>
+      <w:r>
+        <w:t xml:space="preserve"> the implementation phase will continue and should aim to conclude by the end of the sprint. Along this, preparations will be made for the first individual meeting, as well as carrying out Compositional Verification for each design</w:t>
+      </w:r>
+      <w:r>
+        <w:t>, verifying whether the designs comply with the safety and security scenarios and allow for those properties to be preserved,</w:t>
+      </w:r>
+      <w:r>
+        <w:t xml:space="preserve"> and</w:t>
+      </w:r>
+      <w:r>
+        <w:t xml:space="preserve"> to begin </w:t>
+      </w:r>
+      <w:r>
+        <w:t>drafting the final project report. The most progress will take place during this period and will allow for more flexibility based on any changes due to feedback.</w:t>
+      </w:r>
+    </w:p>
+    <w:p/>
+    <w:p>
+      <w:r>
+        <w:t xml:space="preserve">In the </w:t>
+      </w:r>
+      <w:r>
+        <w:t>fourth</w:t>
+      </w:r>
+      <w:r>
+        <w:t xml:space="preserve"> sprint,</w:t>
+      </w:r>
+      <w:r>
+        <w:t xml:space="preserve"> the project will aim to fully conclude with the final project report being fully written, along with the second individual meeting occurring and the video presentation being submitted. </w:t>
+      </w:r>
+    </w:p>
+    <w:p/>
+    <w:p>
+      <w:pPr>
+        <w:pStyle w:val="Heading1"/>
+      </w:pPr>
+      <w:bookmarkStart w:id="6" w:name="_Toc227561170"/>
       <w:r>
         <w:t>Background Material</w:t>
       </w:r>
@@ -1182,181 +1774,9 @@
     </w:p>
     <w:p>
       <w:pPr>
-        <w:rPr>
-          <w:i/>
-          <w:iCs/>
-        </w:rPr>
-      </w:pPr>
-      <w:r>
-        <w:rPr>
-          <w:i/>
-          <w:iCs/>
-        </w:rPr>
-        <w:t xml:space="preserve">which states the </w:t>
-      </w:r>
-      <w:r>
-        <w:rPr>
-          <w:b/>
-          <w:bCs/>
-          <w:i/>
-          <w:iCs/>
-        </w:rPr>
-        <w:t>state-of-the-art</w:t>
-      </w:r>
-      <w:r>
-        <w:rPr>
-          <w:i/>
-          <w:iCs/>
-        </w:rPr>
-        <w:t xml:space="preserve"> of the topic.  This includes general background on your topic area, a critical review of relevant </w:t>
-      </w:r>
-      <w:r>
-        <w:rPr>
-          <w:b/>
-          <w:bCs/>
-          <w:i/>
-          <w:iCs/>
-        </w:rPr>
-        <w:t>research literature</w:t>
-      </w:r>
-      <w:r>
-        <w:rPr>
-          <w:i/>
-          <w:iCs/>
-        </w:rPr>
-        <w:t xml:space="preserve">, a description of </w:t>
-      </w:r>
-      <w:r>
-        <w:rPr>
-          <w:b/>
-          <w:bCs/>
-          <w:i/>
-          <w:iCs/>
-        </w:rPr>
-        <w:t>previous work done in related areas</w:t>
-      </w:r>
-      <w:r>
-        <w:rPr>
-          <w:i/>
-          <w:iCs/>
-        </w:rPr>
-        <w:t xml:space="preserve">, and an outline of </w:t>
-      </w:r>
-      <w:r>
-        <w:rPr>
-          <w:b/>
-          <w:bCs/>
-          <w:i/>
-          <w:iCs/>
-        </w:rPr>
-        <w:t>existing methods/approaches proposed by others handling similar problems</w:t>
-      </w:r>
-      <w:r>
-        <w:rPr>
-          <w:i/>
-          <w:iCs/>
-        </w:rPr>
-        <w:t xml:space="preserve">. </w:t>
-      </w:r>
-      <w:r>
-        <w:rPr>
-          <w:b/>
-          <w:bCs/>
-          <w:i/>
-          <w:iCs/>
-        </w:rPr>
-        <w:t>Constructive criticism on the existing methods/approaches</w:t>
-      </w:r>
-      <w:r>
-        <w:rPr>
-          <w:i/>
-          <w:iCs/>
-        </w:rPr>
-        <w:t xml:space="preserve"> should be </w:t>
-      </w:r>
-      <w:r>
-        <w:rPr>
-          <w:i/>
-          <w:iCs/>
-        </w:rPr>
-        <w:lastRenderedPageBreak/>
-        <w:t xml:space="preserve">given.  In this section, you have to demonstrate a </w:t>
-      </w:r>
-      <w:r>
-        <w:rPr>
-          <w:b/>
-          <w:bCs/>
-          <w:i/>
-          <w:iCs/>
-          <w:u w:val="single"/>
-        </w:rPr>
-        <w:t>good understanding</w:t>
-      </w:r>
-      <w:r>
-        <w:rPr>
-          <w:i/>
-          <w:iCs/>
-        </w:rPr>
-        <w:t xml:space="preserve"> of the topic. See the Resources section on this KEATS page for helpful links for finding appropriate literature (e.g., scholarly/academic search engines) and citing references properly.</w:t>
-      </w:r>
-      <w:r>
-        <w:rPr>
-          <w:noProof/>
-        </w:rPr>
-        <w:t xml:space="preserve"> </w:t>
-      </w:r>
-      <w:r>
-        <w:rPr>
-          <w:noProof/>
-        </w:rPr>
-        <w:drawing>
-          <wp:inline distT="0" distB="0" distL="0" distR="0" wp14:anchorId="532BBCCD" wp14:editId="74A81A1D">
-            <wp:extent cx="2698750" cy="839470"/>
-            <wp:effectExtent l="0" t="0" r="6350" b="0"/>
-            <wp:docPr id="1255259783" name="Picture 1"/>
-            <wp:cNvGraphicFramePr>
-              <a:graphicFrameLocks xmlns:a="http://schemas.openxmlformats.org/drawingml/2006/main" noChangeAspect="1"/>
-            </wp:cNvGraphicFramePr>
-            <a:graphic xmlns:a="http://schemas.openxmlformats.org/drawingml/2006/main">
-              <a:graphicData uri="http://schemas.openxmlformats.org/drawingml/2006/picture">
-                <pic:pic xmlns:pic="http://schemas.openxmlformats.org/drawingml/2006/picture">
-                  <pic:nvPicPr>
-                    <pic:cNvPr id="1255259783" name=""/>
-                    <pic:cNvPicPr/>
-                  </pic:nvPicPr>
-                  <pic:blipFill>
-                    <a:blip r:embed="rId6" cstate="print">
-                      <a:extLst>
-                        <a:ext uri="{28A0092B-C50C-407E-A947-70E740481C1C}">
-                          <a14:useLocalDpi xmlns:a14="http://schemas.microsoft.com/office/drawing/2010/main" val="0"/>
-                        </a:ext>
-                      </a:extLst>
-                    </a:blip>
-                    <a:stretch>
-                      <a:fillRect/>
-                    </a:stretch>
-                  </pic:blipFill>
-                  <pic:spPr>
-                    <a:xfrm>
-                      <a:off x="0" y="0"/>
-                      <a:ext cx="2698750" cy="839470"/>
-                    </a:xfrm>
-                    <a:prstGeom prst="rect">
-                      <a:avLst/>
-                    </a:prstGeom>
-                  </pic:spPr>
-                </pic:pic>
-              </a:graphicData>
-            </a:graphic>
-          </wp:inline>
-        </w:drawing>
-      </w:r>
-    </w:p>
-    <w:p>
-      <w:pPr>
         <w:pStyle w:val="Heading2"/>
       </w:pPr>
-      <w:bookmarkStart w:id="7" w:name="_Toc227463674"/>
+      <w:bookmarkStart w:id="7" w:name="_Toc227561171"/>
       <w:r>
         <w:t>Topic Background</w:t>
       </w:r>
@@ -1367,47 +1787,179 @@
       <w:pPr>
         <w:pStyle w:val="Heading2"/>
       </w:pPr>
-      <w:bookmarkStart w:id="8" w:name="_Toc227463675"/>
+      <w:bookmarkStart w:id="8" w:name="_Toc227561172"/>
       <w:r>
         <w:t>Literature Review</w:t>
       </w:r>
       <w:bookmarkEnd w:id="8"/>
     </w:p>
+    <w:tbl>
+      <w:tblPr>
+        <w:tblStyle w:val="TableGrid"/>
+        <w:tblW w:w="0" w:type="auto"/>
+        <w:tblLook w:val="04A0" w:firstRow="1" w:lastRow="0" w:firstColumn="1" w:lastColumn="0" w:noHBand="0" w:noVBand="1"/>
+      </w:tblPr>
+      <w:tblGrid>
+        <w:gridCol w:w="4508"/>
+        <w:gridCol w:w="4508"/>
+      </w:tblGrid>
+      <w:tr>
+        <w:tc>
+          <w:tcPr>
+            <w:tcW w:w="4508" w:type="dxa"/>
+          </w:tcPr>
+          <w:p>
+            <w:r>
+              <w:t>Literature</w:t>
+            </w:r>
+          </w:p>
+        </w:tc>
+        <w:tc>
+          <w:tcPr>
+            <w:tcW w:w="4508" w:type="dxa"/>
+          </w:tcPr>
+          <w:p>
+            <w:r>
+              <w:t>Overview</w:t>
+            </w:r>
+          </w:p>
+        </w:tc>
+      </w:tr>
+      <w:tr>
+        <w:tc>
+          <w:tcPr>
+            <w:tcW w:w="4508" w:type="dxa"/>
+          </w:tcPr>
+          <w:p>
+            <w:r>
+              <w:t>Cofer, D., Gacek, A., Miller, S., Whalen, M. W., LaValley, B., &amp; Sha, L. (2012, April). Compositional verification of architectural models. In NASA Formal Methods Symposium, Berlin, Heidelberg: Springer Berlin Heidelberg.</w:t>
+            </w:r>
+          </w:p>
+        </w:tc>
+        <w:tc>
+          <w:tcPr>
+            <w:tcW w:w="4508" w:type="dxa"/>
+          </w:tcPr>
+          <w:p>
+            <w:r>
+              <w:t>Presents a methodology for designing and verifying complex cyber-physical systems using formal methods that scale to large, real-world systems</w:t>
+            </w:r>
+          </w:p>
+          <w:p/>
+        </w:tc>
+      </w:tr>
+      <w:tr>
+        <w:tc>
+          <w:tcPr>
+            <w:tcW w:w="4508" w:type="dxa"/>
+          </w:tcPr>
+          <w:p>
+            <w:r>
+              <w:t xml:space="preserve">Khoka, S., </w:t>
+            </w:r>
+            <w:r>
+              <w:rPr>
+                <w:i/>
+                <w:iCs/>
+              </w:rPr>
+              <w:t>Integrating Safety and Security in Autonomous Vehicles: A Comprehensive Review</w:t>
+            </w:r>
+          </w:p>
+        </w:tc>
+        <w:tc>
+          <w:tcPr>
+            <w:tcW w:w="4508" w:type="dxa"/>
+          </w:tcPr>
+          <w:p>
+            <w:r>
+              <w:t xml:space="preserve">Addresses safety and security concerns with autonomous vehicles and explores </w:t>
+            </w:r>
+            <w:r>
+              <w:lastRenderedPageBreak/>
+              <w:t>possibilities of integration, along with potential challenges</w:t>
+            </w:r>
+            <w:r>
+              <w:t>.</w:t>
+            </w:r>
+          </w:p>
+        </w:tc>
+      </w:tr>
+      <w:tr>
+        <w:tc>
+          <w:tcPr>
+            <w:tcW w:w="4508" w:type="dxa"/>
+          </w:tcPr>
+          <w:p/>
+        </w:tc>
+        <w:tc>
+          <w:tcPr>
+            <w:tcW w:w="4508" w:type="dxa"/>
+          </w:tcPr>
+          <w:p/>
+        </w:tc>
+      </w:tr>
+      <w:tr>
+        <w:tc>
+          <w:tcPr>
+            <w:tcW w:w="4508" w:type="dxa"/>
+          </w:tcPr>
+          <w:p/>
+        </w:tc>
+        <w:tc>
+          <w:tcPr>
+            <w:tcW w:w="4508" w:type="dxa"/>
+          </w:tcPr>
+          <w:p/>
+        </w:tc>
+      </w:tr>
+      <w:tr>
+        <w:tc>
+          <w:tcPr>
+            <w:tcW w:w="4508" w:type="dxa"/>
+          </w:tcPr>
+          <w:p/>
+        </w:tc>
+        <w:tc>
+          <w:tcPr>
+            <w:tcW w:w="4508" w:type="dxa"/>
+          </w:tcPr>
+          <w:p/>
+        </w:tc>
+      </w:tr>
+    </w:tbl>
     <w:p/>
     <w:p>
       <w:pPr>
         <w:pStyle w:val="Heading2"/>
       </w:pPr>
-      <w:bookmarkStart w:id="9" w:name="_Toc227463676"/>
+      <w:bookmarkStart w:id="9" w:name="_Toc227561173"/>
       <w:r>
         <w:t>Previous Work</w:t>
       </w:r>
       <w:bookmarkEnd w:id="9"/>
     </w:p>
+    <w:p>
+      <w:r>
+        <w:t>Write about personal work and studies that relate to the topic of this project?</w:t>
+      </w:r>
+    </w:p>
     <w:p/>
     <w:p>
       <w:pPr>
         <w:pStyle w:val="Heading2"/>
       </w:pPr>
-      <w:bookmarkStart w:id="10" w:name="_Toc227463677"/>
+      <w:bookmarkStart w:id="10" w:name="_Toc227561174"/>
       <w:r>
         <w:t>Existing Approaches by Others</w:t>
       </w:r>
       <w:bookmarkEnd w:id="10"/>
     </w:p>
-    <w:p>
-      <w:r>
-        <w:t>Site literature of people doing the same project</w:t>
-      </w:r>
-      <w:r>
-        <w:t xml:space="preserve"> and give constructive criticism</w:t>
-      </w:r>
-    </w:p>
+    <w:p/>
     <w:p>
       <w:pPr>
         <w:pStyle w:val="Heading1"/>
       </w:pPr>
-      <w:bookmarkStart w:id="11" w:name="_Toc227463678"/>
+      <w:bookmarkStart w:id="11" w:name="_Toc227561175"/>
       <w:r>
         <w:t>Project Schedule</w:t>
       </w:r>
@@ -1836,6 +2388,7 @@
       <w:pPr>
         <w:pStyle w:val="Heading2"/>
       </w:pPr>
+      <w:bookmarkStart w:id="12" w:name="_Toc227561176"/>
       <w:r>
         <w:t>Sprint 1</w:t>
       </w:r>
@@ -1860,6 +2413,7 @@
       <w:r>
         <w:t xml:space="preserve"> April)</w:t>
       </w:r>
+      <w:bookmarkEnd w:id="12"/>
     </w:p>
     <w:p>
       <w:pPr>
@@ -1931,6 +2485,7 @@
       <w:pPr>
         <w:pStyle w:val="Heading2"/>
       </w:pPr>
+      <w:bookmarkStart w:id="13" w:name="_Toc227561177"/>
       <w:r>
         <w:t>Sprint 2</w:t>
       </w:r>
@@ -1955,6 +2510,7 @@
       <w:r>
         <w:t xml:space="preserve"> April)</w:t>
       </w:r>
+      <w:bookmarkEnd w:id="13"/>
     </w:p>
     <w:p>
       <w:pPr>
@@ -1990,8 +2546,8 @@
       <w:pPr>
         <w:pStyle w:val="Heading2"/>
       </w:pPr>
-      <w:r>
-        <w:lastRenderedPageBreak/>
+      <w:bookmarkStart w:id="14" w:name="_Toc227561178"/>
+      <w:r>
         <w:t>Sprint 3</w:t>
       </w:r>
       <w:r>
@@ -2018,6 +2574,7 @@
       <w:r>
         <w:t xml:space="preserve"> July)</w:t>
       </w:r>
+      <w:bookmarkEnd w:id="14"/>
     </w:p>
     <w:p>
       <w:pPr>
@@ -2088,13 +2645,18 @@
         </w:numPr>
       </w:pPr>
       <w:r>
-        <w:t>Being drafting Final Project Report</w:t>
+        <w:lastRenderedPageBreak/>
+        <w:t xml:space="preserve">Begin </w:t>
+      </w:r>
+      <w:r>
+        <w:t>drafting Final Project Report</w:t>
       </w:r>
     </w:p>
     <w:p>
       <w:pPr>
         <w:pStyle w:val="Heading2"/>
       </w:pPr>
+      <w:bookmarkStart w:id="15" w:name="_Toc227561179"/>
       <w:r>
         <w:t>Sprint 4</w:t>
       </w:r>
@@ -2119,6 +2681,7 @@
       <w:r>
         <w:t xml:space="preserve"> August)</w:t>
       </w:r>
+      <w:bookmarkEnd w:id="15"/>
     </w:p>
     <w:p>
       <w:pPr>
@@ -2160,11 +2723,11 @@
       <w:pPr>
         <w:pStyle w:val="Heading1"/>
       </w:pPr>
-      <w:bookmarkStart w:id="12" w:name="_Toc227463679"/>
+      <w:bookmarkStart w:id="16" w:name="_Toc227561180"/>
       <w:r>
         <w:t>References</w:t>
       </w:r>
-      <w:bookmarkEnd w:id="12"/>
+      <w:bookmarkEnd w:id="16"/>
     </w:p>
     <w:p>
       <w:pPr>
@@ -2186,7 +2749,7 @@
       <w:r>
         <w:t xml:space="preserve">, 2026. [Online]. Available at: </w:t>
       </w:r>
-      <w:hyperlink r:id="rId7" w:history="1">
+      <w:hyperlink r:id="rId6" w:history="1">
         <w:r>
           <w:rPr>
             <w:rStyle w:val="Hyperlink"/>
@@ -2224,7 +2787,7 @@
       <w:r>
         <w:t xml:space="preserve">, 2025. [Online], p. 3. Available at: </w:t>
       </w:r>
-      <w:hyperlink r:id="rId8" w:history="1">
+      <w:hyperlink r:id="rId7" w:history="1">
         <w:r>
           <w:rPr>
             <w:rStyle w:val="Hyperlink"/>
@@ -2248,15 +2811,7 @@
         <w:t>3</w:t>
       </w:r>
       <w:r>
-        <w:t xml:space="preserve">]: </w:t>
-      </w:r>
-      <w:proofErr w:type="spellStart"/>
-      <w:r>
-        <w:t>RoadieRich</w:t>
-      </w:r>
-      <w:proofErr w:type="spellEnd"/>
-      <w:r>
-        <w:t>, “Speed camera SQL Injection”, Reddit, July 29</w:t>
+        <w:t>]: RoadieRich, “Speed camera SQL Injection”, Reddit, July 29</w:t>
       </w:r>
       <w:r>
         <w:rPr>
@@ -2266,13 +2821,36 @@
       </w:r>
       <w:r>
         <w:t xml:space="preserve">, 2013. [Online]. Available at: </w:t>
+      </w:r>
+      <w:hyperlink r:id="rId8" w:history="1">
+        <w:r>
+          <w:rPr>
+            <w:rStyle w:val="Hyperlink"/>
+          </w:rPr>
+          <w:t>https://www.reddit.com/r/geek/comments/1j9tn3/speed_camera_sql_injection/</w:t>
+        </w:r>
+      </w:hyperlink>
+      <w:r>
+        <w:t xml:space="preserve"> </w:t>
+      </w:r>
+    </w:p>
+    <w:p>
+      <w:pPr>
+        <w:pStyle w:val="ListParagraph"/>
+        <w:numPr>
+          <w:ilvl w:val="0"/>
+          <w:numId w:val="2"/>
+        </w:numPr>
+      </w:pPr>
+      <w:r>
+        <w:t xml:space="preserve">[4]: Eclipse Foundation, “Eclipse Papyrus Modelling Environment”, Eclipse Papyrus homepage. Available at: </w:t>
       </w:r>
       <w:hyperlink r:id="rId9" w:history="1">
         <w:r>
           <w:rPr>
             <w:rStyle w:val="Hyperlink"/>
           </w:rPr>
-          <w:t>https://www.reddit.com/r/geek/comments/1j9tn3/speed_camera_sql_injection/</w:t>
+          <w:t>https://eclipse.dev/papyrus/</w:t>
         </w:r>
       </w:hyperlink>
       <w:r>
@@ -3905,7 +4483,6 @@
   <w:style w:type="character" w:default="1" w:styleId="DefaultParagraphFont">
     <w:name w:val="Default Paragraph Font"/>
     <w:uiPriority w:val="1"/>
-    <w:semiHidden/>
     <w:unhideWhenUsed/>
   </w:style>
   <w:style w:type="table" w:default="1" w:styleId="TableNormal">

</xml_diff>

<commit_message>
Final preliminary report version to be submitted
</commit_message>
<xml_diff>
--- a/MSc Preliminary Project Report.docx
+++ b/MSc Preliminary Project Report.docx
@@ -1054,7 +1054,7 @@
           <w:r>
             <w:fldChar w:fldCharType="separate"/>
           </w:r>
-          <w:hyperlink w:anchor="_Toc228442450" w:history="1">
+          <w:hyperlink w:anchor="_Toc228445618" w:history="1">
             <w:r>
               <w:rPr>
                 <w:rStyle w:val="Hyperlink"/>
@@ -1098,7 +1098,7 @@
                 <w:noProof/>
                 <w:webHidden/>
               </w:rPr>
-              <w:instrText xml:space="preserve"> PAGEREF _Toc228442450 \h </w:instrText>
+              <w:instrText xml:space="preserve"> PAGEREF _Toc228445618 \h </w:instrText>
             </w:r>
             <w:r>
               <w:rPr>
@@ -1118,7 +1118,7 @@
                 <w:noProof/>
                 <w:webHidden/>
               </w:rPr>
-              <w:t>3</w:t>
+              <w:t>2</w:t>
             </w:r>
             <w:r>
               <w:rPr>
@@ -1143,7 +1143,7 @@
               <w:lang w:eastAsia="en-GB"/>
             </w:rPr>
           </w:pPr>
-          <w:hyperlink w:anchor="_Toc228442451" w:history="1">
+          <w:hyperlink w:anchor="_Toc228445619" w:history="1">
             <w:r>
               <w:rPr>
                 <w:rStyle w:val="Hyperlink"/>
@@ -1170,7 +1170,7 @@
                 <w:noProof/>
                 <w:webHidden/>
               </w:rPr>
-              <w:instrText xml:space="preserve"> PAGEREF _Toc228442451 \h </w:instrText>
+              <w:instrText xml:space="preserve"> PAGEREF _Toc228445619 \h </w:instrText>
             </w:r>
             <w:r>
               <w:rPr>
@@ -1190,7 +1190,7 @@
                 <w:noProof/>
                 <w:webHidden/>
               </w:rPr>
-              <w:t>3</w:t>
+              <w:t>2</w:t>
             </w:r>
             <w:r>
               <w:rPr>
@@ -1215,13 +1215,13 @@
               <w:lang w:eastAsia="en-GB"/>
             </w:rPr>
           </w:pPr>
-          <w:hyperlink w:anchor="_Toc228442452" w:history="1">
+          <w:hyperlink w:anchor="_Toc228445620" w:history="1">
             <w:r>
               <w:rPr>
                 <w:rStyle w:val="Hyperlink"/>
                 <w:noProof/>
               </w:rPr>
-              <w:t>1.2 Project Aims and Objectives</w:t>
+              <w:t>1.2 Project Aim and Objectives</w:t>
             </w:r>
             <w:r>
               <w:rPr>
@@ -1242,7 +1242,7 @@
                 <w:noProof/>
                 <w:webHidden/>
               </w:rPr>
-              <w:instrText xml:space="preserve"> PAGEREF _Toc228442452 \h </w:instrText>
+              <w:instrText xml:space="preserve"> PAGEREF _Toc228445620 \h </w:instrText>
             </w:r>
             <w:r>
               <w:rPr>
@@ -1287,7 +1287,7 @@
               <w:lang w:eastAsia="en-GB"/>
             </w:rPr>
           </w:pPr>
-          <w:hyperlink w:anchor="_Toc228442453" w:history="1">
+          <w:hyperlink w:anchor="_Toc228445621" w:history="1">
             <w:r>
               <w:rPr>
                 <w:rStyle w:val="Hyperlink"/>
@@ -1314,7 +1314,7 @@
                 <w:noProof/>
                 <w:webHidden/>
               </w:rPr>
-              <w:instrText xml:space="preserve"> PAGEREF _Toc228442453 \h </w:instrText>
+              <w:instrText xml:space="preserve"> PAGEREF _Toc228445621 \h </w:instrText>
             </w:r>
             <w:r>
               <w:rPr>
@@ -1359,7 +1359,7 @@
               <w:lang w:eastAsia="en-GB"/>
             </w:rPr>
           </w:pPr>
-          <w:hyperlink w:anchor="_Toc228442454" w:history="1">
+          <w:hyperlink w:anchor="_Toc228445622" w:history="1">
             <w:r>
               <w:rPr>
                 <w:rStyle w:val="Hyperlink"/>
@@ -1386,7 +1386,7 @@
                 <w:noProof/>
                 <w:webHidden/>
               </w:rPr>
-              <w:instrText xml:space="preserve"> PAGEREF _Toc228442454 \h </w:instrText>
+              <w:instrText xml:space="preserve"> PAGEREF _Toc228445622 \h </w:instrText>
             </w:r>
             <w:r>
               <w:rPr>
@@ -1406,7 +1406,7 @@
                 <w:noProof/>
                 <w:webHidden/>
               </w:rPr>
-              <w:t>5</w:t>
+              <w:t>4</w:t>
             </w:r>
             <w:r>
               <w:rPr>
@@ -1432,7 +1432,7 @@
               <w:lang w:eastAsia="en-GB"/>
             </w:rPr>
           </w:pPr>
-          <w:hyperlink w:anchor="_Toc228442455" w:history="1">
+          <w:hyperlink w:anchor="_Toc228445623" w:history="1">
             <w:r>
               <w:rPr>
                 <w:rStyle w:val="Hyperlink"/>
@@ -1476,7 +1476,7 @@
                 <w:noProof/>
                 <w:webHidden/>
               </w:rPr>
-              <w:instrText xml:space="preserve"> PAGEREF _Toc228442455 \h </w:instrText>
+              <w:instrText xml:space="preserve"> PAGEREF _Toc228445623 \h </w:instrText>
             </w:r>
             <w:r>
               <w:rPr>
@@ -1521,7 +1521,7 @@
               <w:lang w:eastAsia="en-GB"/>
             </w:rPr>
           </w:pPr>
-          <w:hyperlink w:anchor="_Toc228442456" w:history="1">
+          <w:hyperlink w:anchor="_Toc228445624" w:history="1">
             <w:r>
               <w:rPr>
                 <w:rStyle w:val="Hyperlink"/>
@@ -1548,7 +1548,7 @@
                 <w:noProof/>
                 <w:webHidden/>
               </w:rPr>
-              <w:instrText xml:space="preserve"> PAGEREF _Toc228442456 \h </w:instrText>
+              <w:instrText xml:space="preserve"> PAGEREF _Toc228445624 \h </w:instrText>
             </w:r>
             <w:r>
               <w:rPr>
@@ -1593,13 +1593,13 @@
               <w:lang w:eastAsia="en-GB"/>
             </w:rPr>
           </w:pPr>
-          <w:hyperlink w:anchor="_Toc228442457" w:history="1">
+          <w:hyperlink w:anchor="_Toc228445625" w:history="1">
             <w:r>
               <w:rPr>
                 <w:rStyle w:val="Hyperlink"/>
                 <w:noProof/>
               </w:rPr>
-              <w:t>2.2 Previous Work</w:t>
+              <w:t>2.2 Existing Approaches by Others</w:t>
             </w:r>
             <w:r>
               <w:rPr>
@@ -1620,79 +1620,7 @@
                 <w:noProof/>
                 <w:webHidden/>
               </w:rPr>
-              <w:instrText xml:space="preserve"> PAGEREF _Toc228442457 \h </w:instrText>
-            </w:r>
-            <w:r>
-              <w:rPr>
-                <w:noProof/>
-                <w:webHidden/>
-              </w:rPr>
-            </w:r>
-            <w:r>
-              <w:rPr>
-                <w:noProof/>
-                <w:webHidden/>
-              </w:rPr>
-              <w:fldChar w:fldCharType="separate"/>
-            </w:r>
-            <w:r>
-              <w:rPr>
-                <w:noProof/>
-                <w:webHidden/>
-              </w:rPr>
-              <w:t>6</w:t>
-            </w:r>
-            <w:r>
-              <w:rPr>
-                <w:noProof/>
-                <w:webHidden/>
-              </w:rPr>
-              <w:fldChar w:fldCharType="end"/>
-            </w:r>
-          </w:hyperlink>
-        </w:p>
-        <w:p>
-          <w:pPr>
-            <w:pStyle w:val="TOC2"/>
-            <w:tabs>
-              <w:tab w:val="right" w:leader="dot" w:pos="9016"/>
-            </w:tabs>
-            <w:rPr>
-              <w:rFonts w:eastAsiaTheme="minorEastAsia"/>
-              <w:noProof/>
-              <w:sz w:val="24"/>
-              <w:szCs w:val="24"/>
-              <w:lang w:eastAsia="en-GB"/>
-            </w:rPr>
-          </w:pPr>
-          <w:hyperlink w:anchor="_Toc228442458" w:history="1">
-            <w:r>
-              <w:rPr>
-                <w:rStyle w:val="Hyperlink"/>
-                <w:noProof/>
-              </w:rPr>
-              <w:t>2.3 Existing Approaches by Others</w:t>
-            </w:r>
-            <w:r>
-              <w:rPr>
-                <w:noProof/>
-                <w:webHidden/>
-              </w:rPr>
-              <w:tab/>
-            </w:r>
-            <w:r>
-              <w:rPr>
-                <w:noProof/>
-                <w:webHidden/>
-              </w:rPr>
-              <w:fldChar w:fldCharType="begin"/>
-            </w:r>
-            <w:r>
-              <w:rPr>
-                <w:noProof/>
-                <w:webHidden/>
-              </w:rPr>
-              <w:instrText xml:space="preserve"> PAGEREF _Toc228442458 \h </w:instrText>
+              <w:instrText xml:space="preserve"> PAGEREF _Toc228445625 \h </w:instrText>
             </w:r>
             <w:r>
               <w:rPr>
@@ -1738,7 +1666,7 @@
               <w:lang w:eastAsia="en-GB"/>
             </w:rPr>
           </w:pPr>
-          <w:hyperlink w:anchor="_Toc228442459" w:history="1">
+          <w:hyperlink w:anchor="_Toc228445626" w:history="1">
             <w:r>
               <w:rPr>
                 <w:rStyle w:val="Hyperlink"/>
@@ -1782,7 +1710,7 @@
                 <w:noProof/>
                 <w:webHidden/>
               </w:rPr>
-              <w:instrText xml:space="preserve"> PAGEREF _Toc228442459 \h </w:instrText>
+              <w:instrText xml:space="preserve"> PAGEREF _Toc228445626 \h </w:instrText>
             </w:r>
             <w:r>
               <w:rPr>
@@ -1802,7 +1730,7 @@
                 <w:noProof/>
                 <w:webHidden/>
               </w:rPr>
-              <w:t>7</w:t>
+              <w:t>8</w:t>
             </w:r>
             <w:r>
               <w:rPr>
@@ -1827,7 +1755,7 @@
               <w:lang w:eastAsia="en-GB"/>
             </w:rPr>
           </w:pPr>
-          <w:hyperlink w:anchor="_Toc228442460" w:history="1">
+          <w:hyperlink w:anchor="_Toc228445627" w:history="1">
             <w:r>
               <w:rPr>
                 <w:rStyle w:val="Hyperlink"/>
@@ -1854,7 +1782,7 @@
                 <w:noProof/>
                 <w:webHidden/>
               </w:rPr>
-              <w:instrText xml:space="preserve"> PAGEREF _Toc228442460 \h </w:instrText>
+              <w:instrText xml:space="preserve"> PAGEREF _Toc228445627 \h </w:instrText>
             </w:r>
             <w:r>
               <w:rPr>
@@ -1899,7 +1827,7 @@
               <w:lang w:eastAsia="en-GB"/>
             </w:rPr>
           </w:pPr>
-          <w:hyperlink w:anchor="_Toc228442461" w:history="1">
+          <w:hyperlink w:anchor="_Toc228445628" w:history="1">
             <w:r>
               <w:rPr>
                 <w:rStyle w:val="Hyperlink"/>
@@ -1926,7 +1854,7 @@
                 <w:noProof/>
                 <w:webHidden/>
               </w:rPr>
-              <w:instrText xml:space="preserve"> PAGEREF _Toc228442461 \h </w:instrText>
+              <w:instrText xml:space="preserve"> PAGEREF _Toc228445628 \h </w:instrText>
             </w:r>
             <w:r>
               <w:rPr>
@@ -1971,7 +1899,7 @@
               <w:lang w:eastAsia="en-GB"/>
             </w:rPr>
           </w:pPr>
-          <w:hyperlink w:anchor="_Toc228442462" w:history="1">
+          <w:hyperlink w:anchor="_Toc228445629" w:history="1">
             <w:r>
               <w:rPr>
                 <w:rStyle w:val="Hyperlink"/>
@@ -1998,7 +1926,7 @@
                 <w:noProof/>
                 <w:webHidden/>
               </w:rPr>
-              <w:instrText xml:space="preserve"> PAGEREF _Toc228442462 \h </w:instrText>
+              <w:instrText xml:space="preserve"> PAGEREF _Toc228445629 \h </w:instrText>
             </w:r>
             <w:r>
               <w:rPr>
@@ -2043,7 +1971,7 @@
               <w:lang w:eastAsia="en-GB"/>
             </w:rPr>
           </w:pPr>
-          <w:hyperlink w:anchor="_Toc228442463" w:history="1">
+          <w:hyperlink w:anchor="_Toc228445630" w:history="1">
             <w:r>
               <w:rPr>
                 <w:rStyle w:val="Hyperlink"/>
@@ -2070,7 +1998,7 @@
                 <w:noProof/>
                 <w:webHidden/>
               </w:rPr>
-              <w:instrText xml:space="preserve"> PAGEREF _Toc228442463 \h </w:instrText>
+              <w:instrText xml:space="preserve"> PAGEREF _Toc228445630 \h </w:instrText>
             </w:r>
             <w:r>
               <w:rPr>
@@ -2115,7 +2043,7 @@
               <w:lang w:eastAsia="en-GB"/>
             </w:rPr>
           </w:pPr>
-          <w:hyperlink w:anchor="_Toc228442464" w:history="1">
+          <w:hyperlink w:anchor="_Toc228445631" w:history="1">
             <w:r>
               <w:rPr>
                 <w:rStyle w:val="Hyperlink"/>
@@ -2142,7 +2070,7 @@
                 <w:noProof/>
                 <w:webHidden/>
               </w:rPr>
-              <w:instrText xml:space="preserve"> PAGEREF _Toc228442464 \h </w:instrText>
+              <w:instrText xml:space="preserve"> PAGEREF _Toc228445631 \h </w:instrText>
             </w:r>
             <w:r>
               <w:rPr>
@@ -2162,7 +2090,7 @@
                 <w:noProof/>
                 <w:webHidden/>
               </w:rPr>
-              <w:t>8</w:t>
+              <w:t>9</w:t>
             </w:r>
             <w:r>
               <w:rPr>
@@ -2193,13 +2121,12 @@
     <w:p/>
     <w:p/>
     <w:p/>
+    <w:p>
+      <w:pPr>
+        <w:pStyle w:val="Heading1"/>
+      </w:pPr>
+    </w:p>
     <w:p/>
-    <w:p/>
-    <w:p>
-      <w:pPr>
-        <w:pStyle w:val="Heading1"/>
-      </w:pPr>
-    </w:p>
     <w:p>
       <w:pPr>
         <w:pStyle w:val="Heading1"/>
@@ -2208,7 +2135,7 @@
           <w:numId w:val="11"/>
         </w:numPr>
       </w:pPr>
-      <w:bookmarkStart w:id="0" w:name="_Toc228442450"/>
+      <w:bookmarkStart w:id="0" w:name="_Toc228445618"/>
       <w:r>
         <w:t>Introduction</w:t>
       </w:r>
@@ -2218,7 +2145,7 @@
       <w:pPr>
         <w:pStyle w:val="Heading2"/>
       </w:pPr>
-      <w:bookmarkStart w:id="1" w:name="_Toc228442451"/>
+      <w:bookmarkStart w:id="1" w:name="_Toc228445619"/>
       <w:r>
         <w:t xml:space="preserve">1.1 </w:t>
       </w:r>
@@ -2235,7 +2162,11 @@
     </w:p>
     <w:p>
       <w:r>
-        <w:t>//Write paragraph introducing and explaining multi-layered system architecture</w:t>
+        <w:t xml:space="preserve">Multi-layered system architecture is an approach to system architecture design where a system can be split into different layers that represent different purposes, interfaces, and rules regarding the system and its overall requirements. Implementing this approach can allow for </w:t>
+      </w:r>
+      <w:r>
+        <w:lastRenderedPageBreak/>
+        <w:t>components and subsystems to be arranged accordingly for easier understanding, verification, maintenance, and design.</w:t>
       </w:r>
     </w:p>
     <w:p/>
@@ -2449,7 +2380,7 @@
       <w:pPr>
         <w:pStyle w:val="Heading2"/>
       </w:pPr>
-      <w:bookmarkStart w:id="2" w:name="_Toc228442452"/>
+      <w:bookmarkStart w:id="2" w:name="_Toc228445620"/>
       <w:r>
         <w:t xml:space="preserve">1.2 </w:t>
       </w:r>
@@ -2475,262 +2406,261 @@
     <w:p/>
     <w:p>
       <w:r>
+        <w:t xml:space="preserve">The first objective is </w:t>
+      </w:r>
+      <w:r>
+        <w:t xml:space="preserve">to </w:t>
+      </w:r>
+      <w:r>
+        <w:t>e</w:t>
+      </w:r>
+      <w:r>
+        <w:t>nsure that architectural patterns that maintain safety and security properties are present and only benefit the overall system</w:t>
+      </w:r>
+    </w:p>
+    <w:p/>
+    <w:p>
+      <w:r>
+        <w:t xml:space="preserve">The </w:t>
+      </w:r>
+      <w:r>
+        <w:t>second</w:t>
+      </w:r>
+      <w:r>
+        <w:t xml:space="preserve"> objective is to </w:t>
+      </w:r>
+      <w:r>
+        <w:t>e</w:t>
+      </w:r>
+      <w:r>
+        <w:t>xamine redundancy, shared resources, and hierarchical decomposition within the system</w:t>
+      </w:r>
+      <w:r>
+        <w:t>.</w:t>
+      </w:r>
+    </w:p>
+    <w:p/>
+    <w:p>
+      <w:r>
+        <w:t xml:space="preserve">The </w:t>
+      </w:r>
+      <w:r>
+        <w:t>third</w:t>
+      </w:r>
+      <w:r>
+        <w:t xml:space="preserve"> objective is to d</w:t>
+      </w:r>
+      <w:r>
+        <w:t>esign the</w:t>
+      </w:r>
+      <w:r>
+        <w:t xml:space="preserve"> </w:t>
+      </w:r>
+      <w:r>
+        <w:t>system architecture using a chosen Unified Modelling Language (UML) tool</w:t>
+      </w:r>
+      <w:r>
+        <w:t>.</w:t>
+      </w:r>
+    </w:p>
+    <w:p/>
+    <w:p>
+      <w:r>
+        <w:t xml:space="preserve">The </w:t>
+      </w:r>
+      <w:r>
+        <w:t>fourth</w:t>
+      </w:r>
+      <w:r>
+        <w:t xml:space="preserve"> objective is to </w:t>
+      </w:r>
+      <w:r>
+        <w:t>i</w:t>
+      </w:r>
+      <w:r>
+        <w:t>nvestigate</w:t>
+      </w:r>
+      <w:r>
+        <w:t xml:space="preserve"> the chosen architectural patterns (Redundancy, Shared Resources, and Hierarchical Decomposition) to produce architectural designs based on each pattern</w:t>
+      </w:r>
+      <w:r>
+        <w:t>.</w:t>
+      </w:r>
+    </w:p>
+    <w:p/>
+    <w:p>
+      <w:r>
+        <w:t xml:space="preserve">The </w:t>
+      </w:r>
+      <w:r>
+        <w:t>fifth</w:t>
+      </w:r>
+      <w:r>
+        <w:t xml:space="preserve"> objective is to </w:t>
+      </w:r>
+      <w:r>
+        <w:t>p</w:t>
+      </w:r>
+      <w:r>
+        <w:t>erform Compositional Verification</w:t>
+      </w:r>
+      <w:r>
+        <w:t>,</w:t>
+      </w:r>
+      <w:r>
+        <w:t xml:space="preserve"> where each component is verified and tested individually to ensure the whole system works correctl</w:t>
+      </w:r>
+      <w:r>
+        <w:t>y.</w:t>
+      </w:r>
+    </w:p>
+    <w:p/>
+    <w:p>
+      <w:r>
+        <w:t xml:space="preserve">The </w:t>
+      </w:r>
+      <w:r>
+        <w:t>sixth</w:t>
+      </w:r>
+      <w:r>
+        <w:t xml:space="preserve"> objective is to </w:t>
+      </w:r>
+      <w:r>
+        <w:t>t</w:t>
+      </w:r>
+      <w:r>
+        <w:t>est each design pattern through specific safety</w:t>
+      </w:r>
+      <w:r>
+        <w:t xml:space="preserve"> and security</w:t>
+      </w:r>
+      <w:r>
+        <w:t xml:space="preserve"> scenarios that </w:t>
+      </w:r>
+      <w:r>
+        <w:t>model</w:t>
+      </w:r>
+      <w:r>
+        <w:t xml:space="preserve"> relationships between </w:t>
+      </w:r>
+      <w:r>
+        <w:t xml:space="preserve">both for </w:t>
+      </w:r>
+      <w:r>
+        <w:t>certain</w:t>
+      </w:r>
+      <w:r>
+        <w:t xml:space="preserve"> elements</w:t>
+      </w:r>
+      <w:r>
+        <w:t xml:space="preserve"> across different layers</w:t>
+      </w:r>
+    </w:p>
+    <w:p/>
+    <w:p>
+      <w:pPr>
+        <w:pStyle w:val="Heading2"/>
+      </w:pPr>
+      <w:bookmarkStart w:id="3" w:name="_Toc228445621"/>
+      <w:r>
+        <w:t xml:space="preserve">1.3 </w:t>
+      </w:r>
+      <w:r>
+        <w:t>Technical Specifications</w:t>
+      </w:r>
+      <w:bookmarkEnd w:id="3"/>
+    </w:p>
+    <w:p>
+      <w:r>
+        <w:t xml:space="preserve">For the specification of this project, </w:t>
+      </w:r>
+      <w:r>
+        <w:t xml:space="preserve">it </w:t>
+      </w:r>
+      <w:r>
+        <w:t xml:space="preserve">is decided that the system architecture designs are to be produced in Eclipse Papyrus </w:t>
+      </w:r>
+      <w:r>
+        <w:t xml:space="preserve">supporting the generation </w:t>
+      </w:r>
+      <w:r>
+        <w:t>of Java cod</w:t>
+      </w:r>
+      <w:r>
+        <w:t xml:space="preserve">e, for the system architecture at </w:t>
+      </w:r>
+      <w:r>
+        <w:t>layers</w:t>
+      </w:r>
+      <w:r>
+        <w:t xml:space="preserve"> of the multi-layered system model,</w:t>
+      </w:r>
+      <w:r>
+        <w:t xml:space="preserve"> and therefore the internal relationships and constructs of these designs. </w:t>
+      </w:r>
+      <w:r>
+        <w:t xml:space="preserve">Eclipse Papyrus is an industrial-grade open-source model-based engineering tool [4]. Upon initial usage, it works as a UML (Unified Modelling Language) tool that allows the user to use code to implement different components and variables into the design interface, as well as regular drag-and-drop that every other UML tool allows for. </w:t>
+      </w:r>
+    </w:p>
+    <w:p/>
+    <w:p>
+      <w:r>
+        <w:t xml:space="preserve">Due to the nature of Formal Modelling </w:t>
+      </w:r>
+      <w:r>
+        <w:t xml:space="preserve">requiring precise and correct semantics with no ambiguity in its mathematical representations, the use of Java code can help </w:t>
+      </w:r>
+      <w:r>
+        <w:t>facilitate</w:t>
+      </w:r>
+      <w:r>
+        <w:t xml:space="preserve"> </w:t>
+      </w:r>
+      <w:r>
+        <w:t>a correct-by-semantics system design.</w:t>
+      </w:r>
+    </w:p>
+    <w:p/>
+    <w:p>
+      <w:pPr>
+        <w:pStyle w:val="Heading2"/>
+      </w:pPr>
+      <w:bookmarkStart w:id="4" w:name="_Toc228445622"/>
+      <w:r>
+        <w:t xml:space="preserve">1.4 </w:t>
+      </w:r>
+      <w:r>
+        <w:t>Methodolog</w:t>
+      </w:r>
+      <w:r>
+        <w:t>y</w:t>
+      </w:r>
+      <w:bookmarkEnd w:id="4"/>
+    </w:p>
+    <w:p>
+      <w:r>
+        <w:t xml:space="preserve">In order to carry out this project, </w:t>
+      </w:r>
+      <w:r>
+        <w:t xml:space="preserve">I am choosing to </w:t>
+      </w:r>
+      <w:r>
+        <w:t>adopt an Agile methodology and divide this workload into “sprints”.</w:t>
+      </w:r>
+      <w:r>
+        <w:t xml:space="preserve"> </w:t>
+      </w:r>
+    </w:p>
+    <w:p/>
+    <w:p>
+      <w:r>
+        <w:t>Agile Methodology is a project methodology, catered towards software development, that uses an iterative and incremental approach to decide upcoming work at various points throughout the project during set meetings between “sprints”, which are the different work periods of the project. This methodology also implements concepts such as “Kanban” and “Adaptive System Development”.</w:t>
+      </w:r>
+    </w:p>
+    <w:p/>
+    <w:p>
+      <w:r>
         <w:lastRenderedPageBreak/>
-        <w:t xml:space="preserve">The first objective is </w:t>
-      </w:r>
-      <w:r>
-        <w:t xml:space="preserve">to </w:t>
-      </w:r>
-      <w:r>
-        <w:t>e</w:t>
-      </w:r>
-      <w:r>
-        <w:t>nsure that architectural patterns that maintain safety and security properties are present and only benefit the overall system</w:t>
-      </w:r>
-    </w:p>
-    <w:p/>
-    <w:p>
-      <w:r>
-        <w:t xml:space="preserve">The </w:t>
-      </w:r>
-      <w:r>
-        <w:t>second</w:t>
-      </w:r>
-      <w:r>
-        <w:t xml:space="preserve"> objective is to </w:t>
-      </w:r>
-      <w:r>
-        <w:t>e</w:t>
-      </w:r>
-      <w:r>
-        <w:t>xamine redundancy, shared resources, and hierarchical decomposition within the system</w:t>
-      </w:r>
-      <w:r>
-        <w:t>.</w:t>
-      </w:r>
-    </w:p>
-    <w:p/>
-    <w:p>
-      <w:r>
-        <w:t xml:space="preserve">The </w:t>
-      </w:r>
-      <w:r>
-        <w:t>third</w:t>
-      </w:r>
-      <w:r>
-        <w:t xml:space="preserve"> objective is to d</w:t>
-      </w:r>
-      <w:r>
-        <w:t>esign the</w:t>
-      </w:r>
-      <w:r>
-        <w:t xml:space="preserve"> </w:t>
-      </w:r>
-      <w:r>
-        <w:t>system architecture using a chosen Unified Modelling Language (UML) tool</w:t>
-      </w:r>
-      <w:r>
-        <w:t>.</w:t>
-      </w:r>
-    </w:p>
-    <w:p/>
-    <w:p>
-      <w:r>
-        <w:t xml:space="preserve">The </w:t>
-      </w:r>
-      <w:r>
-        <w:t>fourth</w:t>
-      </w:r>
-      <w:r>
-        <w:t xml:space="preserve"> objective is to </w:t>
-      </w:r>
-      <w:r>
-        <w:t>i</w:t>
-      </w:r>
-      <w:r>
-        <w:t>nvestigate</w:t>
-      </w:r>
-      <w:r>
-        <w:t xml:space="preserve"> the chosen architectural patterns (Redundancy, Shared Resources, and Hierarchical Decomposition) to produce architectural designs based on each pattern</w:t>
-      </w:r>
-      <w:r>
-        <w:t>.</w:t>
-      </w:r>
-    </w:p>
-    <w:p/>
-    <w:p>
-      <w:r>
-        <w:t xml:space="preserve">The </w:t>
-      </w:r>
-      <w:r>
-        <w:t>fifth</w:t>
-      </w:r>
-      <w:r>
-        <w:t xml:space="preserve"> objective is to </w:t>
-      </w:r>
-      <w:r>
-        <w:t>p</w:t>
-      </w:r>
-      <w:r>
-        <w:t>erform Compositional Verification</w:t>
-      </w:r>
-      <w:r>
-        <w:t>,</w:t>
-      </w:r>
-      <w:r>
-        <w:t xml:space="preserve"> where each component is verified and tested individually to ensure the whole system works correctl</w:t>
-      </w:r>
-      <w:r>
-        <w:t>y.</w:t>
-      </w:r>
-    </w:p>
-    <w:p/>
-    <w:p>
-      <w:r>
-        <w:t xml:space="preserve">The </w:t>
-      </w:r>
-      <w:r>
-        <w:t>sixth</w:t>
-      </w:r>
-      <w:r>
-        <w:t xml:space="preserve"> objective is to </w:t>
-      </w:r>
-      <w:r>
-        <w:t>t</w:t>
-      </w:r>
-      <w:r>
-        <w:t>est each design pattern through specific safety</w:t>
-      </w:r>
-      <w:r>
-        <w:t xml:space="preserve"> and security</w:t>
-      </w:r>
-      <w:r>
-        <w:t xml:space="preserve"> scenarios that </w:t>
-      </w:r>
-      <w:r>
-        <w:t>model</w:t>
-      </w:r>
-      <w:r>
-        <w:t xml:space="preserve"> relationships between </w:t>
-      </w:r>
-      <w:r>
-        <w:t xml:space="preserve">both for </w:t>
-      </w:r>
-      <w:r>
-        <w:t>certain</w:t>
-      </w:r>
-      <w:r>
-        <w:t xml:space="preserve"> elements</w:t>
-      </w:r>
-      <w:r>
-        <w:t xml:space="preserve"> across different layers</w:t>
-      </w:r>
-    </w:p>
-    <w:p/>
-    <w:p>
-      <w:pPr>
-        <w:pStyle w:val="Heading2"/>
-      </w:pPr>
-      <w:bookmarkStart w:id="3" w:name="_Toc228442453"/>
-      <w:r>
-        <w:t xml:space="preserve">1.3 </w:t>
-      </w:r>
-      <w:r>
-        <w:t>Technical Specifications</w:t>
-      </w:r>
-      <w:bookmarkEnd w:id="3"/>
-    </w:p>
-    <w:p>
-      <w:r>
-        <w:t xml:space="preserve">For the specification of this project, </w:t>
-      </w:r>
-      <w:r>
-        <w:t xml:space="preserve">it </w:t>
-      </w:r>
-      <w:r>
-        <w:t xml:space="preserve">is decided that the system architecture designs are to be produced in Eclipse Papyrus </w:t>
-      </w:r>
-      <w:r>
-        <w:t xml:space="preserve">supporting the generation </w:t>
-      </w:r>
-      <w:r>
-        <w:t>of Java cod</w:t>
-      </w:r>
-      <w:r>
-        <w:t xml:space="preserve">e, for the system architecture at </w:t>
-      </w:r>
-      <w:r>
-        <w:t>layers</w:t>
-      </w:r>
-      <w:r>
-        <w:t xml:space="preserve"> of the multi-layered system model,</w:t>
-      </w:r>
-      <w:r>
-        <w:t xml:space="preserve"> and therefore the internal relationships and constructs of these designs. </w:t>
-      </w:r>
-      <w:r>
-        <w:t xml:space="preserve">Eclipse Papyrus is an industrial-grade open-source model-based engineering tool [4]. Upon initial usage, it works as a UML (Unified Modelling Language) tool that allows the user to use code to implement different components and variables into the design interface, as well as regular drag-and-drop that every other UML tool allows for. </w:t>
-      </w:r>
-    </w:p>
-    <w:p/>
-    <w:p>
-      <w:r>
-        <w:t xml:space="preserve">Due to the nature of Formal Modelling </w:t>
-      </w:r>
-      <w:r>
-        <w:t xml:space="preserve">requiring precise and correct semantics with no ambiguity in its mathematical representations, the use of Java code can help </w:t>
-      </w:r>
-      <w:r>
-        <w:t>facilitate</w:t>
-      </w:r>
-      <w:r>
-        <w:t xml:space="preserve"> </w:t>
-      </w:r>
-      <w:r>
-        <w:t>a correct-by-semantics system design.</w:t>
-      </w:r>
-    </w:p>
-    <w:p/>
-    <w:p>
-      <w:pPr>
-        <w:pStyle w:val="Heading2"/>
-      </w:pPr>
-      <w:bookmarkStart w:id="4" w:name="_Toc228442454"/>
-      <w:r>
-        <w:t xml:space="preserve">1.4 </w:t>
-      </w:r>
-      <w:r>
-        <w:t>Methodolog</w:t>
-      </w:r>
-      <w:r>
-        <w:t>y</w:t>
-      </w:r>
-      <w:bookmarkEnd w:id="4"/>
-    </w:p>
-    <w:p>
-      <w:r>
-        <w:t xml:space="preserve">In order to carry out this project, </w:t>
-      </w:r>
-      <w:r>
-        <w:t xml:space="preserve">I am choosing to </w:t>
-      </w:r>
-      <w:r>
-        <w:t>adopt an Agile methodology and divide this workload into “sprints”.</w:t>
-      </w:r>
-      <w:r>
-        <w:t xml:space="preserve"> </w:t>
-      </w:r>
-    </w:p>
-    <w:p/>
-    <w:p>
-      <w:r>
-        <w:lastRenderedPageBreak/>
-        <w:t>Agile Methodology is a project methodology, catered towards software development, that uses an iterative and incremental approach to decide upcoming work at various points throughout the project during set meetings between “sprints”, which are the different work periods of the project. This methodology also implements concepts such as “Kanban” and “Adaptive System Development”.</w:t>
-      </w:r>
-    </w:p>
-    <w:p/>
-    <w:p>
-      <w:r>
         <w:t>In the first sprin</w:t>
       </w:r>
       <w:r>
@@ -2875,7 +2805,7 @@
           <w:numId w:val="11"/>
         </w:numPr>
       </w:pPr>
-      <w:bookmarkStart w:id="5" w:name="_Toc228442455"/>
+      <w:bookmarkStart w:id="5" w:name="_Toc228445623"/>
       <w:r>
         <w:t>Background Material</w:t>
       </w:r>
@@ -2885,7 +2815,7 @@
       <w:pPr>
         <w:pStyle w:val="Heading2"/>
       </w:pPr>
-      <w:bookmarkStart w:id="6" w:name="_Toc228442456"/>
+      <w:bookmarkStart w:id="6" w:name="_Toc228445624"/>
       <w:r>
         <w:t xml:space="preserve">2.1 </w:t>
       </w:r>
@@ -2971,7 +2901,15 @@
           </w:tcPr>
           <w:p>
             <w:r>
-              <w:t>Jean, X., Gatti, M., Faura, D., Pautet, L., Robert, T.</w:t>
+              <w:t xml:space="preserve">Jean, X., Gatti, M., Faura, D., </w:t>
+            </w:r>
+            <w:proofErr w:type="spellStart"/>
+            <w:r>
+              <w:t>Pautet</w:t>
+            </w:r>
+            <w:proofErr w:type="spellEnd"/>
+            <w:r>
+              <w:t>, L., Robert, T.</w:t>
             </w:r>
             <w:r>
               <w:t xml:space="preserve"> (2013</w:t>
@@ -3000,11 +2938,7 @@
               <w:t>A</w:t>
             </w:r>
             <w:r>
-              <w:t xml:space="preserve">ddresses timing unpredictability in safety-critical multicore avionic systems caused by shared hardware resource contention. The authors propose constraining resource usage to predefined "usage domains" where </w:t>
-            </w:r>
-            <w:r>
-              <w:lastRenderedPageBreak/>
-              <w:t>processor behaviour remains deterministic and analysable for certification.</w:t>
+              <w:t>ddresses timing unpredictability in safety-critical multicore avionic systems caused by shared hardware resource contention. The authors propose constraining resource usage to predefined "usage domains" where processor behaviour remains deterministic and analysable for certification.</w:t>
             </w:r>
           </w:p>
         </w:tc>
@@ -3015,9 +2949,21 @@
             <w:tcW w:w="4508" w:type="dxa"/>
           </w:tcPr>
           <w:p>
-            <w:r>
-              <w:lastRenderedPageBreak/>
-              <w:t>Krishnamachari, R.S., Papalambros, P.</w:t>
+            <w:proofErr w:type="spellStart"/>
+            <w:r>
+              <w:t>Krishnamachari</w:t>
+            </w:r>
+            <w:proofErr w:type="spellEnd"/>
+            <w:r>
+              <w:t xml:space="preserve">, R.S., </w:t>
+            </w:r>
+            <w:proofErr w:type="spellStart"/>
+            <w:r>
+              <w:t>Papalambros</w:t>
+            </w:r>
+            <w:proofErr w:type="spellEnd"/>
+            <w:r>
+              <w:t>, P.</w:t>
             </w:r>
             <w:r>
               <w:t xml:space="preserve"> (1995, August). </w:t>
@@ -3049,6 +2995,7 @@
           </w:tcPr>
           <w:p>
             <w:r>
+              <w:lastRenderedPageBreak/>
               <w:t xml:space="preserve">Cofer, D., Gacek, A., Miller, S., Whalen, M. W., LaValley, B., Sha, L. (2012, April). </w:t>
             </w:r>
             <w:r>
@@ -3063,15 +3010,24 @@
                 <w:i/>
                 <w:iCs/>
               </w:rPr>
-              <w:t>Compositional verification of architectural models</w:t>
-            </w:r>
+              <w:t xml:space="preserve">Compositional verification of architectural </w:t>
+            </w:r>
+            <w:proofErr w:type="gramStart"/>
             <w:r>
               <w:rPr>
                 <w:i/>
                 <w:iCs/>
               </w:rPr>
+              <w:t>models</w:t>
+            </w:r>
+            <w:r>
+              <w:rPr>
+                <w:i/>
+                <w:iCs/>
+              </w:rPr>
               <w:t>’</w:t>
             </w:r>
+            <w:proofErr w:type="gramEnd"/>
             <w:r>
               <w:t>. In NASA Formal Methods Symposium, Berlin, Heidelberg: Springer Berlin Heidelberg.</w:t>
             </w:r>
@@ -3152,34 +3108,20 @@
       <w:pPr>
         <w:pStyle w:val="Heading2"/>
       </w:pPr>
-      <w:bookmarkStart w:id="7" w:name="_Toc228442457"/>
-      <w:r>
-        <w:t xml:space="preserve">2.2 </w:t>
-      </w:r>
-      <w:r>
-        <w:t>Previous Work</w:t>
+      <w:bookmarkStart w:id="7" w:name="_Toc228445625"/>
+      <w:r>
+        <w:t>2.</w:t>
+      </w:r>
+      <w:r>
+        <w:t>2</w:t>
+      </w:r>
+      <w:r>
+        <w:t xml:space="preserve"> </w:t>
+      </w:r>
+      <w:r>
+        <w:t>Existing Approaches by Others</w:t>
       </w:r>
       <w:bookmarkEnd w:id="7"/>
-    </w:p>
-    <w:p>
-      <w:r>
-        <w:t>Write about personal work and studies that relate to the topic of this project?</w:t>
-      </w:r>
-    </w:p>
-    <w:p/>
-    <w:p>
-      <w:pPr>
-        <w:pStyle w:val="Heading2"/>
-      </w:pPr>
-      <w:bookmarkStart w:id="8" w:name="_Toc228442458"/>
-      <w:r>
-        <w:lastRenderedPageBreak/>
-        <w:t xml:space="preserve">2.3 </w:t>
-      </w:r>
-      <w:r>
-        <w:t>Existing Approaches by Others</w:t>
-      </w:r>
-      <w:bookmarkEnd w:id="8"/>
     </w:p>
     <w:tbl>
       <w:tblPr>
@@ -3235,8 +3177,13 @@
               <w:t>,</w:t>
             </w:r>
             <w:r>
-              <w:t xml:space="preserve"> K-Y., Tavva</w:t>
-            </w:r>
+              <w:t xml:space="preserve"> K-Y., </w:t>
+            </w:r>
+            <w:proofErr w:type="spellStart"/>
+            <w:r>
+              <w:t>Tavva</w:t>
+            </w:r>
+            <w:proofErr w:type="spellEnd"/>
             <w:r>
               <w:t>,</w:t>
             </w:r>
@@ -3292,8 +3239,14 @@
             <w:tcW w:w="4508" w:type="dxa"/>
           </w:tcPr>
           <w:p>
-            <w:r>
-              <w:t>Khoka, S.</w:t>
+            <w:proofErr w:type="spellStart"/>
+            <w:r>
+              <w:lastRenderedPageBreak/>
+              <w:t>Khoka</w:t>
+            </w:r>
+            <w:proofErr w:type="spellEnd"/>
+            <w:r>
+              <w:t>, S.</w:t>
             </w:r>
             <w:r>
               <w:t xml:space="preserve"> (2024, October).</w:t>
@@ -3395,6 +3348,7 @@
         <w:t xml:space="preserve"> </w:t>
       </w:r>
     </w:p>
+    <w:p/>
     <w:p>
       <w:r>
         <w:t>Some</w:t>
@@ -3463,9 +3417,9 @@
         <w:t>. They also assesses the trends, challenges, and future directions of AV development, where they believe that AI and ML development, Vehicle-to-Everything (V2X) communication, and use of Digital Twins are major trends, the maintenance of strong safety and security being a challenge in development in terms of financial and computational, and future directions revolving around enhancing all of the prior technologies and concepts mentioned.</w:t>
       </w:r>
     </w:p>
-    <w:p>
-      <w:r>
-        <w:lastRenderedPageBreak/>
+    <w:p/>
+    <w:p>
+      <w:r>
         <w:t>Although the study does mention redundancy as a viable method in strengthening the relationship between safety and security</w:t>
       </w:r>
       <w:r>
@@ -3493,11 +3447,12 @@
           <w:numId w:val="11"/>
         </w:numPr>
       </w:pPr>
-      <w:bookmarkStart w:id="9" w:name="_Toc228442459"/>
-      <w:r>
+      <w:bookmarkStart w:id="8" w:name="_Toc228445626"/>
+      <w:r>
+        <w:lastRenderedPageBreak/>
         <w:t>Project Schedule</w:t>
       </w:r>
-      <w:bookmarkEnd w:id="9"/>
+      <w:bookmarkEnd w:id="8"/>
     </w:p>
     <w:tbl>
       <w:tblPr>
@@ -3922,11 +3877,11 @@
       <w:pPr>
         <w:pStyle w:val="Heading2"/>
       </w:pPr>
-      <w:bookmarkStart w:id="10" w:name="_Toc228442460"/>
+      <w:bookmarkStart w:id="9" w:name="_Toc228445627"/>
       <w:r>
         <w:t>Sprint 1</w:t>
       </w:r>
-      <w:bookmarkEnd w:id="10"/>
+      <w:bookmarkEnd w:id="9"/>
       <w:r>
         <w:t xml:space="preserve"> </w:t>
       </w:r>
@@ -3997,15 +3952,16 @@
         <w:t>Extend literature review</w:t>
       </w:r>
     </w:p>
+    <w:p/>
     <w:p>
       <w:pPr>
         <w:pStyle w:val="Heading2"/>
       </w:pPr>
-      <w:bookmarkStart w:id="11" w:name="_Toc228442461"/>
+      <w:bookmarkStart w:id="10" w:name="_Toc228445628"/>
       <w:r>
         <w:t>Sprint 2</w:t>
       </w:r>
-      <w:bookmarkEnd w:id="11"/>
+      <w:bookmarkEnd w:id="10"/>
     </w:p>
     <w:p>
       <w:pPr>
@@ -4037,15 +3993,16 @@
         <w:t xml:space="preserve"> system architecture</w:t>
       </w:r>
     </w:p>
+    <w:p/>
     <w:p>
       <w:pPr>
         <w:pStyle w:val="Heading2"/>
       </w:pPr>
-      <w:bookmarkStart w:id="12" w:name="_Toc228442462"/>
+      <w:bookmarkStart w:id="11" w:name="_Toc228445629"/>
       <w:r>
         <w:t>Sprint 3</w:t>
       </w:r>
-      <w:bookmarkEnd w:id="12"/>
+      <w:bookmarkEnd w:id="11"/>
     </w:p>
     <w:p>
       <w:pPr>
@@ -4122,15 +4079,16 @@
         <w:t>drafting Final Project Report</w:t>
       </w:r>
     </w:p>
+    <w:p/>
     <w:p>
       <w:pPr>
         <w:pStyle w:val="Heading2"/>
       </w:pPr>
-      <w:bookmarkStart w:id="13" w:name="_Toc228442463"/>
+      <w:bookmarkStart w:id="12" w:name="_Toc228445630"/>
       <w:r>
         <w:t>Sprint 4</w:t>
       </w:r>
-      <w:bookmarkEnd w:id="13"/>
+      <w:bookmarkEnd w:id="12"/>
     </w:p>
     <w:p>
       <w:pPr>
@@ -4168,11 +4126,12 @@
         <w:t>Complete and submit Video Presentation</w:t>
       </w:r>
     </w:p>
+    <w:p/>
     <w:p>
       <w:pPr>
         <w:pStyle w:val="Heading1"/>
       </w:pPr>
-      <w:bookmarkStart w:id="14" w:name="_Toc228442464"/>
+      <w:bookmarkStart w:id="13" w:name="_Toc228445631"/>
       <w:r>
         <w:lastRenderedPageBreak/>
         <w:t xml:space="preserve">4. </w:t>
@@ -4180,7 +4139,7 @@
       <w:r>
         <w:t>References</w:t>
       </w:r>
-      <w:bookmarkEnd w:id="14"/>
+      <w:bookmarkEnd w:id="13"/>
     </w:p>
     <w:p>
       <w:r>
@@ -4243,7 +4202,15 @@
         <w:t>3</w:t>
       </w:r>
       <w:r>
-        <w:t>]: RoadieRich, “Speed camera SQL Injection”, Reddit, July 29</w:t>
+        <w:t xml:space="preserve">]: </w:t>
+      </w:r>
+      <w:proofErr w:type="spellStart"/>
+      <w:r>
+        <w:t>RoadieRich</w:t>
+      </w:r>
+      <w:proofErr w:type="spellEnd"/>
+      <w:r>
+        <w:t>, “Speed camera SQL Injection”, Reddit, July 29</w:t>
       </w:r>
       <w:r>
         <w:rPr>
@@ -6714,6 +6681,7 @@
     <w:rsidRoot w:val="00964146"/>
     <w:rsid w:val="00104F11"/>
     <w:rsid w:val="001E1D2B"/>
+    <w:rsid w:val="0025427F"/>
     <w:rsid w:val="00637722"/>
     <w:rsid w:val="00964146"/>
     <w:rsid w:val="00DE7D3D"/>

</xml_diff>

<commit_message>
Fixed issue with line spacing before introduction section, subsequently converted to PDF once again
</commit_message>
<xml_diff>
--- a/MSc Preliminary Project Report.docx
+++ b/MSc Preliminary Project Report.docx
@@ -2127,6 +2127,7 @@
       </w:pPr>
     </w:p>
     <w:p/>
+    <w:p/>
     <w:p>
       <w:pPr>
         <w:pStyle w:val="Heading1"/>
@@ -2137,6 +2138,7 @@
       </w:pPr>
       <w:bookmarkStart w:id="0" w:name="_Toc228445618"/>
       <w:r>
+        <w:lastRenderedPageBreak/>
         <w:t>Introduction</w:t>
       </w:r>
       <w:bookmarkEnd w:id="0"/>
@@ -2162,505 +2164,502 @@
     </w:p>
     <w:p>
       <w:r>
-        <w:t xml:space="preserve">Multi-layered system architecture is an approach to system architecture design where a system can be split into different layers that represent different purposes, interfaces, and rules regarding the system and its overall requirements. Implementing this approach can allow for </w:t>
-      </w:r>
+        <w:t>Multi-layered system architecture is an approach to system architecture design where a system can be split into different layers that represent different purposes, interfaces, and rules regarding the system and its overall requirements. Implementing this approach can allow for components and subsystems to be arranged accordingly for easier understanding, verification, maintenance, and design.</w:t>
+      </w:r>
+    </w:p>
+    <w:p/>
+    <w:p>
+      <w:r>
+        <w:t xml:space="preserve">The number of autonomous vehicles has risen </w:t>
+      </w:r>
+      <w:r>
+        <w:t xml:space="preserve">significantly </w:t>
+      </w:r>
+      <w:r>
+        <w:t>in recent years</w:t>
+      </w:r>
+      <w:r>
+        <w:t>,</w:t>
+      </w:r>
+      <w:r>
+        <w:t xml:space="preserve"> but</w:t>
+      </w:r>
+      <w:r>
+        <w:t xml:space="preserve"> </w:t>
+      </w:r>
+      <w:r>
+        <w:t>do</w:t>
+      </w:r>
+      <w:r>
+        <w:t xml:space="preserve"> the </w:t>
+      </w:r>
+      <w:r>
+        <w:t xml:space="preserve">security </w:t>
+      </w:r>
+      <w:r>
+        <w:t>propert</w:t>
+      </w:r>
+      <w:r>
+        <w:t>ies</w:t>
+      </w:r>
+      <w:r>
+        <w:t xml:space="preserve"> (</w:t>
+      </w:r>
+      <w:r>
+        <w:t xml:space="preserve">e.g. </w:t>
+      </w:r>
+      <w:r>
+        <w:t>sensor data</w:t>
+      </w:r>
+      <w:r>
+        <w:t xml:space="preserve"> authenticity</w:t>
+      </w:r>
+      <w:r>
+        <w:t xml:space="preserve">) </w:t>
+      </w:r>
+      <w:r>
+        <w:t>on</w:t>
+      </w:r>
+      <w:r>
+        <w:t xml:space="preserve"> one layer compose to guarantee the </w:t>
+      </w:r>
+      <w:r>
+        <w:t xml:space="preserve">safety </w:t>
+      </w:r>
+      <w:r>
+        <w:t>propert</w:t>
+      </w:r>
+      <w:r>
+        <w:t xml:space="preserve">ies </w:t>
+      </w:r>
+      <w:r>
+        <w:t>(</w:t>
+      </w:r>
+      <w:r>
+        <w:t>integrity of</w:t>
+      </w:r>
+      <w:r>
+        <w:t xml:space="preserve"> obstacle detection</w:t>
+      </w:r>
+      <w:r>
+        <w:t xml:space="preserve"> mechanisms</w:t>
+      </w:r>
+      <w:r>
+        <w:t xml:space="preserve">) at a different layer of </w:t>
+      </w:r>
+      <w:r>
+        <w:t xml:space="preserve">vehicle </w:t>
+      </w:r>
+      <w:r>
+        <w:t xml:space="preserve">system architecture? How do architectural constructs, such as </w:t>
+      </w:r>
+      <w:r>
+        <w:t>r</w:t>
+      </w:r>
+      <w:r>
+        <w:t xml:space="preserve">edundancy, </w:t>
+      </w:r>
+      <w:r>
+        <w:t>h</w:t>
+      </w:r>
+      <w:r>
+        <w:t xml:space="preserve">ierarchical </w:t>
+      </w:r>
+      <w:r>
+        <w:t>d</w:t>
+      </w:r>
+      <w:r>
+        <w:t xml:space="preserve">ecomposition, and </w:t>
+      </w:r>
+      <w:r>
+        <w:t>s</w:t>
+      </w:r>
+      <w:r>
+        <w:t xml:space="preserve">hared </w:t>
+      </w:r>
+      <w:r>
+        <w:t>r</w:t>
+      </w:r>
+      <w:r>
+        <w:t xml:space="preserve">esources, </w:t>
+      </w:r>
+      <w:r>
+        <w:t>upon</w:t>
+      </w:r>
+      <w:r>
+        <w:t xml:space="preserve"> which these systems may be based</w:t>
+      </w:r>
+      <w:r>
+        <w:t xml:space="preserve">, </w:t>
+      </w:r>
+      <w:r>
+        <w:t>govern whether this cross-layer composition holds?</w:t>
+      </w:r>
+    </w:p>
+    <w:p>
+      <w:r>
+        <w:t xml:space="preserve">Autonomous vehicles are marketed as the future of transportation and as a luxury, but how can they truly be successful and reliable when most of the public </w:t>
+      </w:r>
+      <w:r>
+        <w:t>is</w:t>
+      </w:r>
+      <w:r>
+        <w:t xml:space="preserve"> too hesitant to trust them with complete control over driving?</w:t>
+      </w:r>
+    </w:p>
+    <w:p/>
+    <w:p>
+      <w:r>
+        <w:t>Given existing cases about malfunctioning autonomous vehicles, such as some Waymo self-driving vehicles failing to sense oncoming pedestrians [1], it’s understandable that the public would</w:t>
+      </w:r>
+      <w:r>
+        <w:t xml:space="preserve"> </w:t>
+      </w:r>
+      <w:r>
+        <w:t>n</w:t>
+      </w:r>
+      <w:r>
+        <w:t>o</w:t>
+      </w:r>
+      <w:r>
+        <w:t xml:space="preserve">t want to be completely left </w:t>
+      </w:r>
+      <w:r>
+        <w:t>in</w:t>
+      </w:r>
+      <w:r>
+        <w:t xml:space="preserve"> the hands of an autonomous vehicle</w:t>
+      </w:r>
+      <w:r>
+        <w:t>.</w:t>
+      </w:r>
+    </w:p>
+    <w:p/>
+    <w:p>
+      <w:r>
+        <w:t>It raises questions about the designs of these existing systems and how factors such as redundancy, shared resources, and hierarchical decomposition are considered in these existing designs</w:t>
+      </w:r>
+      <w:r>
+        <w:t>.</w:t>
+      </w:r>
+    </w:p>
+    <w:p/>
+    <w:p>
+      <w:r>
+        <w:t xml:space="preserve">If the cross-layer composition between safety and security </w:t>
+      </w:r>
+      <w:r>
+        <w:t>cannot</w:t>
+      </w:r>
+      <w:r>
+        <w:t xml:space="preserve"> be guaranteed, then it could allow external malicious sources to exploit these systems. </w:t>
+      </w:r>
+      <w:r>
+        <w:t>An example of a malicious source would be the potential risk that a malicious message could hijack a self-driving car and cause it to hit pedestrians (risking safety AND security). This can appear in the form of a physical attacker holding a clear sign that can misdirect the vehicle</w:t>
+      </w:r>
+      <w:r>
+        <w:t xml:space="preserve"> [2]</w:t>
+      </w:r>
+      <w:r>
+        <w:t xml:space="preserve"> (similar to SQL Injection Attacks on Automatic Number Plate Recognition software [</w:t>
+      </w:r>
+      <w:r>
+        <w:t>3</w:t>
+      </w:r>
+      <w:r>
+        <w:t>])</w:t>
+      </w:r>
+      <w:r>
+        <w:t>.</w:t>
+      </w:r>
+    </w:p>
+    <w:p/>
+    <w:p>
+      <w:pPr>
+        <w:pStyle w:val="Heading2"/>
+      </w:pPr>
+      <w:bookmarkStart w:id="2" w:name="_Toc228445620"/>
+      <w:r>
+        <w:t xml:space="preserve">1.2 </w:t>
+      </w:r>
+      <w:r>
+        <w:t xml:space="preserve">Project </w:t>
+      </w:r>
+      <w:r>
+        <w:t>Aim</w:t>
+      </w:r>
+      <w:r>
+        <w:t xml:space="preserve"> and Objectives</w:t>
+      </w:r>
+      <w:bookmarkEnd w:id="2"/>
+    </w:p>
+    <w:p>
+      <w:r>
+        <w:t>The aim of this project is to d</w:t>
+      </w:r>
+      <w:r>
+        <w:t>evelop a robust system architecture that remains safe and secure-by-design, regardless of different architectural constructs that would be applied to ensure an efficient autonomous driving system</w:t>
+      </w:r>
+    </w:p>
+    <w:p/>
+    <w:p>
       <w:r>
         <w:lastRenderedPageBreak/>
-        <w:t>components and subsystems to be arranged accordingly for easier understanding, verification, maintenance, and design.</w:t>
+        <w:t xml:space="preserve">The first objective is </w:t>
+      </w:r>
+      <w:r>
+        <w:t xml:space="preserve">to </w:t>
+      </w:r>
+      <w:r>
+        <w:t>e</w:t>
+      </w:r>
+      <w:r>
+        <w:t>nsure that architectural patterns that maintain safety and security properties are present and only benefit the overall system</w:t>
       </w:r>
     </w:p>
     <w:p/>
     <w:p>
       <w:r>
-        <w:t xml:space="preserve">The number of autonomous vehicles has risen </w:t>
-      </w:r>
-      <w:r>
-        <w:t xml:space="preserve">significantly </w:t>
-      </w:r>
-      <w:r>
-        <w:t>in recent years</w:t>
+        <w:t xml:space="preserve">The </w:t>
+      </w:r>
+      <w:r>
+        <w:t>second</w:t>
+      </w:r>
+      <w:r>
+        <w:t xml:space="preserve"> objective is to </w:t>
+      </w:r>
+      <w:r>
+        <w:t>e</w:t>
+      </w:r>
+      <w:r>
+        <w:t>xamine redundancy, shared resources, and hierarchical decomposition within the system</w:t>
+      </w:r>
+      <w:r>
+        <w:t>.</w:t>
+      </w:r>
+    </w:p>
+    <w:p/>
+    <w:p>
+      <w:r>
+        <w:t xml:space="preserve">The </w:t>
+      </w:r>
+      <w:r>
+        <w:t>third</w:t>
+      </w:r>
+      <w:r>
+        <w:t xml:space="preserve"> objective is to d</w:t>
+      </w:r>
+      <w:r>
+        <w:t>esign the</w:t>
+      </w:r>
+      <w:r>
+        <w:t xml:space="preserve"> </w:t>
+      </w:r>
+      <w:r>
+        <w:t>system architecture using a chosen Unified Modelling Language (UML) tool</w:t>
+      </w:r>
+      <w:r>
+        <w:t>.</w:t>
+      </w:r>
+    </w:p>
+    <w:p/>
+    <w:p>
+      <w:r>
+        <w:t xml:space="preserve">The </w:t>
+      </w:r>
+      <w:r>
+        <w:t>fourth</w:t>
+      </w:r>
+      <w:r>
+        <w:t xml:space="preserve"> objective is to </w:t>
+      </w:r>
+      <w:r>
+        <w:t>i</w:t>
+      </w:r>
+      <w:r>
+        <w:t>nvestigate</w:t>
+      </w:r>
+      <w:r>
+        <w:t xml:space="preserve"> the chosen architectural patterns (Redundancy, Shared Resources, and Hierarchical Decomposition) to produce architectural designs based on each pattern</w:t>
+      </w:r>
+      <w:r>
+        <w:t>.</w:t>
+      </w:r>
+    </w:p>
+    <w:p/>
+    <w:p>
+      <w:r>
+        <w:t xml:space="preserve">The </w:t>
+      </w:r>
+      <w:r>
+        <w:t>fifth</w:t>
+      </w:r>
+      <w:r>
+        <w:t xml:space="preserve"> objective is to </w:t>
+      </w:r>
+      <w:r>
+        <w:t>p</w:t>
+      </w:r>
+      <w:r>
+        <w:t>erform Compositional Verification</w:t>
       </w:r>
       <w:r>
         <w:t>,</w:t>
       </w:r>
       <w:r>
-        <w:t xml:space="preserve"> but</w:t>
+        <w:t xml:space="preserve"> where each component is verified and tested individually to ensure the whole system works correctl</w:t>
+      </w:r>
+      <w:r>
+        <w:t>y.</w:t>
+      </w:r>
+    </w:p>
+    <w:p/>
+    <w:p>
+      <w:r>
+        <w:t xml:space="preserve">The </w:t>
+      </w:r>
+      <w:r>
+        <w:t>sixth</w:t>
+      </w:r>
+      <w:r>
+        <w:t xml:space="preserve"> objective is to </w:t>
+      </w:r>
+      <w:r>
+        <w:t>t</w:t>
+      </w:r>
+      <w:r>
+        <w:t>est each design pattern through specific safety</w:t>
+      </w:r>
+      <w:r>
+        <w:t xml:space="preserve"> and security</w:t>
+      </w:r>
+      <w:r>
+        <w:t xml:space="preserve"> scenarios that </w:t>
+      </w:r>
+      <w:r>
+        <w:t>model</w:t>
+      </w:r>
+      <w:r>
+        <w:t xml:space="preserve"> relationships between </w:t>
+      </w:r>
+      <w:r>
+        <w:t xml:space="preserve">both for </w:t>
+      </w:r>
+      <w:r>
+        <w:t>certain</w:t>
+      </w:r>
+      <w:r>
+        <w:t xml:space="preserve"> elements</w:t>
+      </w:r>
+      <w:r>
+        <w:t xml:space="preserve"> across different layers</w:t>
+      </w:r>
+    </w:p>
+    <w:p/>
+    <w:p>
+      <w:pPr>
+        <w:pStyle w:val="Heading2"/>
+      </w:pPr>
+      <w:bookmarkStart w:id="3" w:name="_Toc228445621"/>
+      <w:r>
+        <w:t xml:space="preserve">1.3 </w:t>
+      </w:r>
+      <w:r>
+        <w:t>Technical Specifications</w:t>
+      </w:r>
+      <w:bookmarkEnd w:id="3"/>
+    </w:p>
+    <w:p>
+      <w:r>
+        <w:t xml:space="preserve">For the specification of this project, </w:t>
+      </w:r>
+      <w:r>
+        <w:t xml:space="preserve">it </w:t>
+      </w:r>
+      <w:r>
+        <w:t xml:space="preserve">is decided that the system architecture designs are to be produced in Eclipse Papyrus </w:t>
+      </w:r>
+      <w:r>
+        <w:t xml:space="preserve">supporting the generation </w:t>
+      </w:r>
+      <w:r>
+        <w:t>of Java cod</w:t>
+      </w:r>
+      <w:r>
+        <w:t xml:space="preserve">e, for the system architecture at </w:t>
+      </w:r>
+      <w:r>
+        <w:t>layers</w:t>
+      </w:r>
+      <w:r>
+        <w:t xml:space="preserve"> of the multi-layered system model,</w:t>
+      </w:r>
+      <w:r>
+        <w:t xml:space="preserve"> and therefore the internal relationships and constructs of these designs. </w:t>
+      </w:r>
+      <w:r>
+        <w:t xml:space="preserve">Eclipse Papyrus is an industrial-grade open-source model-based engineering tool [4]. Upon initial usage, it works as a UML (Unified Modelling Language) tool that allows the user to use code to implement different components and variables into the design interface, as well as regular drag-and-drop that every other UML tool allows for. </w:t>
+      </w:r>
+    </w:p>
+    <w:p/>
+    <w:p>
+      <w:r>
+        <w:t xml:space="preserve">Due to the nature of Formal Modelling </w:t>
+      </w:r>
+      <w:r>
+        <w:t xml:space="preserve">requiring precise and correct semantics with no ambiguity in its mathematical representations, the use of Java code can help </w:t>
+      </w:r>
+      <w:r>
+        <w:t>facilitate</w:t>
       </w:r>
       <w:r>
         <w:t xml:space="preserve"> </w:t>
       </w:r>
       <w:r>
-        <w:t>do</w:t>
-      </w:r>
-      <w:r>
-        <w:t xml:space="preserve"> the </w:t>
-      </w:r>
-      <w:r>
-        <w:t xml:space="preserve">security </w:t>
-      </w:r>
-      <w:r>
-        <w:t>propert</w:t>
-      </w:r>
-      <w:r>
-        <w:t>ies</w:t>
-      </w:r>
-      <w:r>
-        <w:t xml:space="preserve"> (</w:t>
-      </w:r>
-      <w:r>
-        <w:t xml:space="preserve">e.g. </w:t>
-      </w:r>
-      <w:r>
-        <w:t>sensor data</w:t>
-      </w:r>
-      <w:r>
-        <w:t xml:space="preserve"> authenticity</w:t>
-      </w:r>
-      <w:r>
-        <w:t xml:space="preserve">) </w:t>
-      </w:r>
-      <w:r>
-        <w:t>on</w:t>
-      </w:r>
-      <w:r>
-        <w:t xml:space="preserve"> one layer compose to guarantee the </w:t>
-      </w:r>
-      <w:r>
-        <w:t xml:space="preserve">safety </w:t>
-      </w:r>
-      <w:r>
-        <w:t>propert</w:t>
-      </w:r>
-      <w:r>
-        <w:t xml:space="preserve">ies </w:t>
-      </w:r>
-      <w:r>
-        <w:t>(</w:t>
-      </w:r>
-      <w:r>
-        <w:t>integrity of</w:t>
-      </w:r>
-      <w:r>
-        <w:t xml:space="preserve"> obstacle detection</w:t>
-      </w:r>
-      <w:r>
-        <w:t xml:space="preserve"> mechanisms</w:t>
-      </w:r>
-      <w:r>
-        <w:t xml:space="preserve">) at a different layer of </w:t>
-      </w:r>
-      <w:r>
-        <w:t xml:space="preserve">vehicle </w:t>
-      </w:r>
-      <w:r>
-        <w:t xml:space="preserve">system architecture? How do architectural constructs, such as </w:t>
-      </w:r>
-      <w:r>
-        <w:t>r</w:t>
-      </w:r>
-      <w:r>
-        <w:t xml:space="preserve">edundancy, </w:t>
-      </w:r>
-      <w:r>
-        <w:t>h</w:t>
-      </w:r>
-      <w:r>
-        <w:t xml:space="preserve">ierarchical </w:t>
-      </w:r>
-      <w:r>
-        <w:t>d</w:t>
-      </w:r>
-      <w:r>
-        <w:t xml:space="preserve">ecomposition, and </w:t>
-      </w:r>
-      <w:r>
-        <w:t>s</w:t>
-      </w:r>
-      <w:r>
-        <w:t xml:space="preserve">hared </w:t>
-      </w:r>
-      <w:r>
-        <w:t>r</w:t>
-      </w:r>
-      <w:r>
-        <w:t xml:space="preserve">esources, </w:t>
-      </w:r>
-      <w:r>
-        <w:t>upon</w:t>
-      </w:r>
-      <w:r>
-        <w:t xml:space="preserve"> which these systems may be based</w:t>
-      </w:r>
-      <w:r>
-        <w:t xml:space="preserve">, </w:t>
-      </w:r>
-      <w:r>
-        <w:t>govern whether this cross-layer composition holds?</w:t>
-      </w:r>
-    </w:p>
-    <w:p>
-      <w:r>
-        <w:t xml:space="preserve">Autonomous vehicles are marketed as the future of transportation and as a luxury, but how can they truly be successful and reliable when most of the public </w:t>
-      </w:r>
-      <w:r>
-        <w:t>is</w:t>
-      </w:r>
-      <w:r>
-        <w:t xml:space="preserve"> too hesitant to trust them with complete control over driving?</w:t>
+        <w:t>a correct-by-semantics system design.</w:t>
       </w:r>
     </w:p>
     <w:p/>
     <w:p>
-      <w:r>
-        <w:t>Given existing cases about malfunctioning autonomous vehicles, such as some Waymo self-driving vehicles failing to sense oncoming pedestrians [1], it’s understandable that the public would</w:t>
+      <w:pPr>
+        <w:pStyle w:val="Heading2"/>
+      </w:pPr>
+      <w:bookmarkStart w:id="4" w:name="_Toc228445622"/>
+      <w:r>
+        <w:t xml:space="preserve">1.4 </w:t>
+      </w:r>
+      <w:r>
+        <w:t>Methodolog</w:t>
+      </w:r>
+      <w:r>
+        <w:t>y</w:t>
+      </w:r>
+      <w:bookmarkEnd w:id="4"/>
+    </w:p>
+    <w:p>
+      <w:r>
+        <w:t xml:space="preserve">In order to carry out this project, </w:t>
+      </w:r>
+      <w:r>
+        <w:t xml:space="preserve">I am choosing to </w:t>
+      </w:r>
+      <w:r>
+        <w:t>adopt an Agile methodology and divide this workload into “sprints”.</w:t>
       </w:r>
       <w:r>
         <w:t xml:space="preserve"> </w:t>
       </w:r>
-      <w:r>
-        <w:t>n</w:t>
-      </w:r>
-      <w:r>
-        <w:t>o</w:t>
-      </w:r>
-      <w:r>
-        <w:t xml:space="preserve">t want to be completely left </w:t>
-      </w:r>
-      <w:r>
-        <w:t>in</w:t>
-      </w:r>
-      <w:r>
-        <w:t xml:space="preserve"> the hands of an autonomous vehicle</w:t>
-      </w:r>
-      <w:r>
-        <w:t>.</w:t>
-      </w:r>
     </w:p>
     <w:p/>
     <w:p>
       <w:r>
-        <w:t>It raises questions about the designs of these existing systems and how factors such as redundancy, shared resources, and hierarchical decomposition are considered in these existing designs</w:t>
-      </w:r>
-      <w:r>
-        <w:t>.</w:t>
+        <w:lastRenderedPageBreak/>
+        <w:t>Agile Methodology is a project methodology, catered towards software development, that uses an iterative and incremental approach to decide upcoming work at various points throughout the project during set meetings between “sprints”, which are the different work periods of the project. This methodology also implements concepts such as “Kanban” and “Adaptive System Development”.</w:t>
       </w:r>
     </w:p>
     <w:p/>
     <w:p>
       <w:r>
-        <w:t xml:space="preserve">If the cross-layer composition between safety and security </w:t>
-      </w:r>
-      <w:r>
-        <w:t>cannot</w:t>
-      </w:r>
-      <w:r>
-        <w:t xml:space="preserve"> be guaranteed, then it could allow external malicious sources to exploit these systems. </w:t>
-      </w:r>
-      <w:r>
-        <w:t>An example of a malicious source would be the potential risk that a malicious message could hijack a self-driving car and cause it to hit pedestrians (risking safety AND security). This can appear in the form of a physical attacker holding a clear sign that can misdirect the vehicle</w:t>
-      </w:r>
-      <w:r>
-        <w:t xml:space="preserve"> [2]</w:t>
-      </w:r>
-      <w:r>
-        <w:t xml:space="preserve"> (similar to SQL Injection Attacks on Automatic Number Plate Recognition software [</w:t>
-      </w:r>
-      <w:r>
-        <w:t>3</w:t>
-      </w:r>
-      <w:r>
-        <w:t>])</w:t>
-      </w:r>
-      <w:r>
-        <w:t>.</w:t>
-      </w:r>
-    </w:p>
-    <w:p/>
-    <w:p>
-      <w:pPr>
-        <w:pStyle w:val="Heading2"/>
-      </w:pPr>
-      <w:bookmarkStart w:id="2" w:name="_Toc228445620"/>
-      <w:r>
-        <w:t xml:space="preserve">1.2 </w:t>
-      </w:r>
-      <w:r>
-        <w:t xml:space="preserve">Project </w:t>
-      </w:r>
-      <w:r>
-        <w:t>Aim</w:t>
-      </w:r>
-      <w:r>
-        <w:t xml:space="preserve"> and Objectives</w:t>
-      </w:r>
-      <w:bookmarkEnd w:id="2"/>
-    </w:p>
-    <w:p>
-      <w:r>
-        <w:t>The aim of this project is to d</w:t>
-      </w:r>
-      <w:r>
-        <w:t>evelop a robust system architecture that remains safe and secure-by-design, regardless of different architectural constructs that would be applied to ensure an efficient autonomous driving system</w:t>
-      </w:r>
-    </w:p>
-    <w:p/>
-    <w:p>
-      <w:r>
-        <w:t xml:space="preserve">The first objective is </w:t>
-      </w:r>
-      <w:r>
-        <w:t xml:space="preserve">to </w:t>
-      </w:r>
-      <w:r>
-        <w:t>e</w:t>
-      </w:r>
-      <w:r>
-        <w:t>nsure that architectural patterns that maintain safety and security properties are present and only benefit the overall system</w:t>
-      </w:r>
-    </w:p>
-    <w:p/>
-    <w:p>
-      <w:r>
-        <w:t xml:space="preserve">The </w:t>
-      </w:r>
-      <w:r>
-        <w:t>second</w:t>
-      </w:r>
-      <w:r>
-        <w:t xml:space="preserve"> objective is to </w:t>
-      </w:r>
-      <w:r>
-        <w:t>e</w:t>
-      </w:r>
-      <w:r>
-        <w:t>xamine redundancy, shared resources, and hierarchical decomposition within the system</w:t>
-      </w:r>
-      <w:r>
-        <w:t>.</w:t>
-      </w:r>
-    </w:p>
-    <w:p/>
-    <w:p>
-      <w:r>
-        <w:t xml:space="preserve">The </w:t>
-      </w:r>
-      <w:r>
-        <w:t>third</w:t>
-      </w:r>
-      <w:r>
-        <w:t xml:space="preserve"> objective is to d</w:t>
-      </w:r>
-      <w:r>
-        <w:t>esign the</w:t>
-      </w:r>
-      <w:r>
-        <w:t xml:space="preserve"> </w:t>
-      </w:r>
-      <w:r>
-        <w:t>system architecture using a chosen Unified Modelling Language (UML) tool</w:t>
-      </w:r>
-      <w:r>
-        <w:t>.</w:t>
-      </w:r>
-    </w:p>
-    <w:p/>
-    <w:p>
-      <w:r>
-        <w:t xml:space="preserve">The </w:t>
-      </w:r>
-      <w:r>
-        <w:t>fourth</w:t>
-      </w:r>
-      <w:r>
-        <w:t xml:space="preserve"> objective is to </w:t>
-      </w:r>
-      <w:r>
-        <w:t>i</w:t>
-      </w:r>
-      <w:r>
-        <w:t>nvestigate</w:t>
-      </w:r>
-      <w:r>
-        <w:t xml:space="preserve"> the chosen architectural patterns (Redundancy, Shared Resources, and Hierarchical Decomposition) to produce architectural designs based on each pattern</w:t>
-      </w:r>
-      <w:r>
-        <w:t>.</w:t>
-      </w:r>
-    </w:p>
-    <w:p/>
-    <w:p>
-      <w:r>
-        <w:t xml:space="preserve">The </w:t>
-      </w:r>
-      <w:r>
-        <w:t>fifth</w:t>
-      </w:r>
-      <w:r>
-        <w:t xml:space="preserve"> objective is to </w:t>
-      </w:r>
-      <w:r>
-        <w:t>p</w:t>
-      </w:r>
-      <w:r>
-        <w:t>erform Compositional Verification</w:t>
-      </w:r>
-      <w:r>
-        <w:t>,</w:t>
-      </w:r>
-      <w:r>
-        <w:t xml:space="preserve"> where each component is verified and tested individually to ensure the whole system works correctl</w:t>
-      </w:r>
-      <w:r>
-        <w:t>y.</w:t>
-      </w:r>
-    </w:p>
-    <w:p/>
-    <w:p>
-      <w:r>
-        <w:t xml:space="preserve">The </w:t>
-      </w:r>
-      <w:r>
-        <w:t>sixth</w:t>
-      </w:r>
-      <w:r>
-        <w:t xml:space="preserve"> objective is to </w:t>
-      </w:r>
-      <w:r>
-        <w:t>t</w:t>
-      </w:r>
-      <w:r>
-        <w:t>est each design pattern through specific safety</w:t>
-      </w:r>
-      <w:r>
-        <w:t xml:space="preserve"> and security</w:t>
-      </w:r>
-      <w:r>
-        <w:t xml:space="preserve"> scenarios that </w:t>
-      </w:r>
-      <w:r>
-        <w:t>model</w:t>
-      </w:r>
-      <w:r>
-        <w:t xml:space="preserve"> relationships between </w:t>
-      </w:r>
-      <w:r>
-        <w:t xml:space="preserve">both for </w:t>
-      </w:r>
-      <w:r>
-        <w:t>certain</w:t>
-      </w:r>
-      <w:r>
-        <w:t xml:space="preserve"> elements</w:t>
-      </w:r>
-      <w:r>
-        <w:t xml:space="preserve"> across different layers</w:t>
-      </w:r>
-    </w:p>
-    <w:p/>
-    <w:p>
-      <w:pPr>
-        <w:pStyle w:val="Heading2"/>
-      </w:pPr>
-      <w:bookmarkStart w:id="3" w:name="_Toc228445621"/>
-      <w:r>
-        <w:t xml:space="preserve">1.3 </w:t>
-      </w:r>
-      <w:r>
-        <w:t>Technical Specifications</w:t>
-      </w:r>
-      <w:bookmarkEnd w:id="3"/>
-    </w:p>
-    <w:p>
-      <w:r>
-        <w:t xml:space="preserve">For the specification of this project, </w:t>
-      </w:r>
-      <w:r>
-        <w:t xml:space="preserve">it </w:t>
-      </w:r>
-      <w:r>
-        <w:t xml:space="preserve">is decided that the system architecture designs are to be produced in Eclipse Papyrus </w:t>
-      </w:r>
-      <w:r>
-        <w:t xml:space="preserve">supporting the generation </w:t>
-      </w:r>
-      <w:r>
-        <w:t>of Java cod</w:t>
-      </w:r>
-      <w:r>
-        <w:t xml:space="preserve">e, for the system architecture at </w:t>
-      </w:r>
-      <w:r>
-        <w:t>layers</w:t>
-      </w:r>
-      <w:r>
-        <w:t xml:space="preserve"> of the multi-layered system model,</w:t>
-      </w:r>
-      <w:r>
-        <w:t xml:space="preserve"> and therefore the internal relationships and constructs of these designs. </w:t>
-      </w:r>
-      <w:r>
-        <w:t xml:space="preserve">Eclipse Papyrus is an industrial-grade open-source model-based engineering tool [4]. Upon initial usage, it works as a UML (Unified Modelling Language) tool that allows the user to use code to implement different components and variables into the design interface, as well as regular drag-and-drop that every other UML tool allows for. </w:t>
-      </w:r>
-    </w:p>
-    <w:p/>
-    <w:p>
-      <w:r>
-        <w:t xml:space="preserve">Due to the nature of Formal Modelling </w:t>
-      </w:r>
-      <w:r>
-        <w:t xml:space="preserve">requiring precise and correct semantics with no ambiguity in its mathematical representations, the use of Java code can help </w:t>
-      </w:r>
-      <w:r>
-        <w:t>facilitate</w:t>
-      </w:r>
-      <w:r>
-        <w:t xml:space="preserve"> </w:t>
-      </w:r>
-      <w:r>
-        <w:t>a correct-by-semantics system design.</w:t>
-      </w:r>
-    </w:p>
-    <w:p/>
-    <w:p>
-      <w:pPr>
-        <w:pStyle w:val="Heading2"/>
-      </w:pPr>
-      <w:bookmarkStart w:id="4" w:name="_Toc228445622"/>
-      <w:r>
-        <w:t xml:space="preserve">1.4 </w:t>
-      </w:r>
-      <w:r>
-        <w:t>Methodolog</w:t>
-      </w:r>
-      <w:r>
-        <w:t>y</w:t>
-      </w:r>
-      <w:bookmarkEnd w:id="4"/>
-    </w:p>
-    <w:p>
-      <w:r>
-        <w:t xml:space="preserve">In order to carry out this project, </w:t>
-      </w:r>
-      <w:r>
-        <w:t xml:space="preserve">I am choosing to </w:t>
-      </w:r>
-      <w:r>
-        <w:t>adopt an Agile methodology and divide this workload into “sprints”.</w:t>
-      </w:r>
-      <w:r>
-        <w:t xml:space="preserve"> </w:t>
-      </w:r>
-    </w:p>
-    <w:p/>
-    <w:p>
-      <w:r>
-        <w:t>Agile Methodology is a project methodology, catered towards software development, that uses an iterative and incremental approach to decide upcoming work at various points throughout the project during set meetings between “sprints”, which are the different work periods of the project. This methodology also implements concepts such as “Kanban” and “Adaptive System Development”.</w:t>
-      </w:r>
-    </w:p>
-    <w:p/>
-    <w:p>
-      <w:r>
-        <w:lastRenderedPageBreak/>
         <w:t>In the first sprin</w:t>
       </w:r>
       <w:r>
@@ -2938,7 +2937,11 @@
               <w:t>A</w:t>
             </w:r>
             <w:r>
-              <w:t>ddresses timing unpredictability in safety-critical multicore avionic systems caused by shared hardware resource contention. The authors propose constraining resource usage to predefined "usage domains" where processor behaviour remains deterministic and analysable for certification.</w:t>
+              <w:t xml:space="preserve">ddresses timing unpredictability in safety-critical multicore avionic systems caused by shared hardware resource contention. The authors propose constraining resource usage to predefined "usage domains" where </w:t>
+            </w:r>
+            <w:r>
+              <w:lastRenderedPageBreak/>
+              <w:t>processor behaviour remains deterministic and analysable for certification.</w:t>
             </w:r>
           </w:p>
         </w:tc>
@@ -2951,6 +2954,7 @@
           <w:p>
             <w:proofErr w:type="spellStart"/>
             <w:r>
+              <w:lastRenderedPageBreak/>
               <w:t>Krishnamachari</w:t>
             </w:r>
             <w:proofErr w:type="spellEnd"/>
@@ -2995,7 +2999,6 @@
           </w:tcPr>
           <w:p>
             <w:r>
-              <w:lastRenderedPageBreak/>
               <w:t xml:space="preserve">Cofer, D., Gacek, A., Miller, S., Whalen, M. W., LaValley, B., Sha, L. (2012, April). </w:t>
             </w:r>
             <w:r>
@@ -3165,6 +3168,7 @@
           </w:tcPr>
           <w:p>
             <w:r>
+              <w:lastRenderedPageBreak/>
               <w:t>Chattopadhyay</w:t>
             </w:r>
             <w:r>
@@ -3241,7 +3245,6 @@
           <w:p>
             <w:proofErr w:type="spellStart"/>
             <w:r>
-              <w:lastRenderedPageBreak/>
               <w:t>Khoka</w:t>
             </w:r>
             <w:proofErr w:type="spellEnd"/>
@@ -3420,6 +3423,7 @@
     <w:p/>
     <w:p>
       <w:r>
+        <w:lastRenderedPageBreak/>
         <w:t>Although the study does mention redundancy as a viable method in strengthening the relationship between safety and security</w:t>
       </w:r>
       <w:r>
@@ -3449,7 +3453,6 @@
       </w:pPr>
       <w:bookmarkStart w:id="8" w:name="_Toc228445626"/>
       <w:r>
-        <w:lastRenderedPageBreak/>
         <w:t>Project Schedule</w:t>
       </w:r>
       <w:bookmarkEnd w:id="8"/>
@@ -4086,6 +4089,7 @@
       </w:pPr>
       <w:bookmarkStart w:id="12" w:name="_Toc228445630"/>
       <w:r>
+        <w:lastRenderedPageBreak/>
         <w:t>Sprint 4</w:t>
       </w:r>
       <w:bookmarkEnd w:id="12"/>
@@ -4133,7 +4137,6 @@
       </w:pPr>
       <w:bookmarkStart w:id="13" w:name="_Toc228445631"/>
       <w:r>
-        <w:lastRenderedPageBreak/>
         <w:t xml:space="preserve">4. </w:t>
       </w:r>
       <w:r>
@@ -6627,7 +6630,6 @@
     <w:sig w:usb0="E0002EFF" w:usb1="C0007843" w:usb2="00000009" w:usb3="00000000" w:csb0="000001FF" w:csb1="00000000"/>
   </w:font>
   <w:font w:name="Wingdings">
-    <w:altName w:val="Wingdings"/>
     <w:panose1 w:val="05000000000000000000"/>
     <w:charset w:val="02"/>
     <w:family w:val="auto"/>
@@ -6679,8 +6681,10 @@
   </w:compat>
   <w:rsids>
     <w:rsidRoot w:val="00964146"/>
+    <w:rsid w:val="00094D19"/>
     <w:rsid w:val="00104F11"/>
     <w:rsid w:val="001E1D2B"/>
+    <w:rsid w:val="00204F51"/>
     <w:rsid w:val="0025427F"/>
     <w:rsid w:val="00637722"/>
     <w:rsid w:val="00964146"/>

</xml_diff>